<commit_message>
sql till assignment 3
</commit_message>
<xml_diff>
--- a/QS SQL/SQL Class Notes.docx
+++ b/QS SQL/SQL Class Notes.docx
@@ -7221,20 +7221,761 @@
     <w:p>
       <w:pPr>
         <w:rPr>
-          <w:b/>
-          <w:bCs/>
-          <w:sz w:val="24"/>
-          <w:szCs w:val="24"/>
-        </w:rPr>
-      </w:pPr>
-    </w:p>
-    <w:p>
-      <w:pPr>
-        <w:rPr>
-          <w:sz w:val="28"/>
-          <w:szCs w:val="28"/>
-        </w:rPr>
-      </w:pPr>
+          <w:sz w:val="28"/>
+          <w:szCs w:val="28"/>
+        </w:rPr>
+      </w:pPr>
+      <w:r>
+        <w:rPr>
+          <w:b/>
+          <w:bCs/>
+          <w:sz w:val="32"/>
+          <w:szCs w:val="32"/>
+        </w:rPr>
+        <w:t xml:space="preserve">OPERATORS: </w:t>
+      </w:r>
+      <w:r>
+        <w:rPr>
+          <w:sz w:val="28"/>
+          <w:szCs w:val="28"/>
+        </w:rPr>
+        <w:t>These are the symbols which are used to perform some specific tasks.</w:t>
+      </w:r>
+      <w:r>
+        <w:rPr>
+          <w:sz w:val="28"/>
+          <w:szCs w:val="28"/>
+        </w:rPr>
+        <w:t xml:space="preserve"> There are seven types of operators in SQL.</w:t>
+      </w:r>
+    </w:p>
+    <w:p>
+      <w:pPr>
+        <w:pStyle w:val="ListParagraph"/>
+        <w:numPr>
+          <w:ilvl w:val="0"/>
+          <w:numId w:val="9"/>
+        </w:numPr>
+        <w:rPr>
+          <w:sz w:val="28"/>
+          <w:szCs w:val="28"/>
+        </w:rPr>
+      </w:pPr>
+      <w:r>
+        <w:rPr>
+          <w:b/>
+          <w:bCs/>
+          <w:sz w:val="28"/>
+          <w:szCs w:val="28"/>
+        </w:rPr>
+        <w:t>Arithmetic OP:</w:t>
+      </w:r>
+      <w:r>
+        <w:rPr>
+          <w:sz w:val="28"/>
+          <w:szCs w:val="28"/>
+        </w:rPr>
+        <w:t xml:space="preserve"> +, -, *, %, </w:t>
+      </w:r>
+      <w:proofErr w:type="gramStart"/>
+      <w:r>
+        <w:rPr>
+          <w:sz w:val="28"/>
+          <w:szCs w:val="28"/>
+        </w:rPr>
+        <w:t>/..</w:t>
+      </w:r>
+      <w:proofErr w:type="gramEnd"/>
+    </w:p>
+    <w:p>
+      <w:pPr>
+        <w:pStyle w:val="ListParagraph"/>
+        <w:numPr>
+          <w:ilvl w:val="0"/>
+          <w:numId w:val="9"/>
+        </w:numPr>
+        <w:rPr>
+          <w:sz w:val="28"/>
+          <w:szCs w:val="28"/>
+        </w:rPr>
+      </w:pPr>
+      <w:r>
+        <w:rPr>
+          <w:b/>
+          <w:bCs/>
+          <w:sz w:val="28"/>
+          <w:szCs w:val="28"/>
+        </w:rPr>
+        <w:t>Comparison OP:</w:t>
+      </w:r>
+      <w:r>
+        <w:rPr>
+          <w:sz w:val="28"/>
+          <w:szCs w:val="28"/>
+        </w:rPr>
+        <w:t xml:space="preserve"> =</w:t>
+      </w:r>
+      <w:proofErr w:type="gramStart"/>
+      <w:r>
+        <w:rPr>
+          <w:sz w:val="28"/>
+          <w:szCs w:val="28"/>
+        </w:rPr>
+        <w:t>, !</w:t>
+      </w:r>
+      <w:proofErr w:type="gramEnd"/>
+      <w:r>
+        <w:rPr>
+          <w:sz w:val="28"/>
+          <w:szCs w:val="28"/>
+        </w:rPr>
+        <w:t>=.</w:t>
+      </w:r>
+    </w:p>
+    <w:p>
+      <w:pPr>
+        <w:pStyle w:val="ListParagraph"/>
+        <w:numPr>
+          <w:ilvl w:val="0"/>
+          <w:numId w:val="9"/>
+        </w:numPr>
+        <w:rPr>
+          <w:sz w:val="28"/>
+          <w:szCs w:val="28"/>
+        </w:rPr>
+      </w:pPr>
+      <w:r>
+        <w:rPr>
+          <w:b/>
+          <w:bCs/>
+          <w:sz w:val="28"/>
+          <w:szCs w:val="28"/>
+        </w:rPr>
+        <w:t>Relational OP:</w:t>
+      </w:r>
+      <w:r>
+        <w:rPr>
+          <w:sz w:val="28"/>
+          <w:szCs w:val="28"/>
+        </w:rPr>
+        <w:t xml:space="preserve"> &lt;, &gt;, &gt;=, &lt;=.</w:t>
+      </w:r>
+    </w:p>
+    <w:p>
+      <w:pPr>
+        <w:pStyle w:val="ListParagraph"/>
+        <w:numPr>
+          <w:ilvl w:val="0"/>
+          <w:numId w:val="9"/>
+        </w:numPr>
+        <w:rPr>
+          <w:sz w:val="28"/>
+          <w:szCs w:val="28"/>
+        </w:rPr>
+      </w:pPr>
+      <w:r>
+        <w:rPr>
+          <w:b/>
+          <w:bCs/>
+          <w:sz w:val="28"/>
+          <w:szCs w:val="28"/>
+        </w:rPr>
+        <w:t>Concatenation OP:</w:t>
+      </w:r>
+      <w:r>
+        <w:rPr>
+          <w:sz w:val="28"/>
+          <w:szCs w:val="28"/>
+        </w:rPr>
+        <w:t xml:space="preserve"> ||</w:t>
+      </w:r>
+    </w:p>
+    <w:p>
+      <w:pPr>
+        <w:pStyle w:val="ListParagraph"/>
+        <w:numPr>
+          <w:ilvl w:val="0"/>
+          <w:numId w:val="9"/>
+        </w:numPr>
+        <w:rPr>
+          <w:sz w:val="28"/>
+          <w:szCs w:val="28"/>
+        </w:rPr>
+      </w:pPr>
+      <w:r>
+        <w:rPr>
+          <w:b/>
+          <w:bCs/>
+          <w:sz w:val="28"/>
+          <w:szCs w:val="28"/>
+        </w:rPr>
+        <w:t>Logical OP:</w:t>
+      </w:r>
+      <w:r>
+        <w:rPr>
+          <w:sz w:val="28"/>
+          <w:szCs w:val="28"/>
+        </w:rPr>
+        <w:t xml:space="preserve"> AND, </w:t>
+      </w:r>
+      <w:proofErr w:type="gramStart"/>
+      <w:r>
+        <w:rPr>
+          <w:sz w:val="28"/>
+          <w:szCs w:val="28"/>
+        </w:rPr>
+        <w:t>OR,</w:t>
+      </w:r>
+      <w:proofErr w:type="gramEnd"/>
+      <w:r>
+        <w:rPr>
+          <w:sz w:val="28"/>
+          <w:szCs w:val="28"/>
+        </w:rPr>
+        <w:t xml:space="preserve"> NOT.</w:t>
+      </w:r>
+    </w:p>
+    <w:p>
+      <w:pPr>
+        <w:pStyle w:val="ListParagraph"/>
+        <w:numPr>
+          <w:ilvl w:val="0"/>
+          <w:numId w:val="9"/>
+        </w:numPr>
+        <w:rPr>
+          <w:b/>
+          <w:bCs/>
+          <w:sz w:val="28"/>
+          <w:szCs w:val="28"/>
+        </w:rPr>
+      </w:pPr>
+      <w:r>
+        <w:rPr>
+          <w:b/>
+          <w:bCs/>
+          <w:sz w:val="28"/>
+          <w:szCs w:val="28"/>
+        </w:rPr>
+        <w:t>Special OP:</w:t>
+      </w:r>
+    </w:p>
+    <w:p>
+      <w:pPr>
+        <w:pStyle w:val="ListParagraph"/>
+        <w:numPr>
+          <w:ilvl w:val="0"/>
+          <w:numId w:val="12"/>
+        </w:numPr>
+        <w:rPr>
+          <w:sz w:val="28"/>
+          <w:szCs w:val="28"/>
+        </w:rPr>
+      </w:pPr>
+      <w:r>
+        <w:rPr>
+          <w:sz w:val="28"/>
+          <w:szCs w:val="28"/>
+        </w:rPr>
+        <w:t>IN</w:t>
+      </w:r>
+    </w:p>
+    <w:p>
+      <w:pPr>
+        <w:pStyle w:val="ListParagraph"/>
+        <w:numPr>
+          <w:ilvl w:val="0"/>
+          <w:numId w:val="12"/>
+        </w:numPr>
+        <w:rPr>
+          <w:sz w:val="28"/>
+          <w:szCs w:val="28"/>
+        </w:rPr>
+      </w:pPr>
+      <w:r>
+        <w:rPr>
+          <w:sz w:val="28"/>
+          <w:szCs w:val="28"/>
+        </w:rPr>
+        <w:t>NOT IN</w:t>
+      </w:r>
+    </w:p>
+    <w:p>
+      <w:pPr>
+        <w:pStyle w:val="ListParagraph"/>
+        <w:numPr>
+          <w:ilvl w:val="0"/>
+          <w:numId w:val="12"/>
+        </w:numPr>
+        <w:rPr>
+          <w:sz w:val="28"/>
+          <w:szCs w:val="28"/>
+        </w:rPr>
+      </w:pPr>
+      <w:r>
+        <w:rPr>
+          <w:sz w:val="28"/>
+          <w:szCs w:val="28"/>
+        </w:rPr>
+        <w:t>BETWEEN</w:t>
+      </w:r>
+    </w:p>
+    <w:p>
+      <w:pPr>
+        <w:pStyle w:val="ListParagraph"/>
+        <w:numPr>
+          <w:ilvl w:val="0"/>
+          <w:numId w:val="12"/>
+        </w:numPr>
+        <w:rPr>
+          <w:sz w:val="28"/>
+          <w:szCs w:val="28"/>
+        </w:rPr>
+      </w:pPr>
+      <w:r>
+        <w:rPr>
+          <w:sz w:val="28"/>
+          <w:szCs w:val="28"/>
+        </w:rPr>
+        <w:t>NOT BETWEEN</w:t>
+      </w:r>
+    </w:p>
+    <w:p>
+      <w:pPr>
+        <w:pStyle w:val="ListParagraph"/>
+        <w:numPr>
+          <w:ilvl w:val="0"/>
+          <w:numId w:val="12"/>
+        </w:numPr>
+        <w:rPr>
+          <w:sz w:val="28"/>
+          <w:szCs w:val="28"/>
+        </w:rPr>
+      </w:pPr>
+      <w:r>
+        <w:rPr>
+          <w:sz w:val="28"/>
+          <w:szCs w:val="28"/>
+        </w:rPr>
+        <w:t>IS</w:t>
+      </w:r>
+    </w:p>
+    <w:p>
+      <w:pPr>
+        <w:pStyle w:val="ListParagraph"/>
+        <w:numPr>
+          <w:ilvl w:val="0"/>
+          <w:numId w:val="12"/>
+        </w:numPr>
+        <w:rPr>
+          <w:sz w:val="28"/>
+          <w:szCs w:val="28"/>
+        </w:rPr>
+      </w:pPr>
+      <w:r>
+        <w:rPr>
+          <w:sz w:val="28"/>
+          <w:szCs w:val="28"/>
+        </w:rPr>
+        <w:t>IS NOT</w:t>
+      </w:r>
+    </w:p>
+    <w:p>
+      <w:pPr>
+        <w:pStyle w:val="ListParagraph"/>
+        <w:numPr>
+          <w:ilvl w:val="0"/>
+          <w:numId w:val="12"/>
+        </w:numPr>
+        <w:rPr>
+          <w:sz w:val="28"/>
+          <w:szCs w:val="28"/>
+        </w:rPr>
+      </w:pPr>
+      <w:r>
+        <w:rPr>
+          <w:sz w:val="28"/>
+          <w:szCs w:val="28"/>
+        </w:rPr>
+        <w:t xml:space="preserve">LIKE </w:t>
+      </w:r>
+    </w:p>
+    <w:p>
+      <w:pPr>
+        <w:pStyle w:val="ListParagraph"/>
+        <w:numPr>
+          <w:ilvl w:val="0"/>
+          <w:numId w:val="12"/>
+        </w:numPr>
+        <w:rPr>
+          <w:sz w:val="28"/>
+          <w:szCs w:val="28"/>
+        </w:rPr>
+      </w:pPr>
+      <w:r>
+        <w:rPr>
+          <w:sz w:val="28"/>
+          <w:szCs w:val="28"/>
+        </w:rPr>
+        <w:t>LIKE NOT</w:t>
+      </w:r>
+    </w:p>
+    <w:p>
+      <w:pPr>
+        <w:pStyle w:val="ListParagraph"/>
+        <w:numPr>
+          <w:ilvl w:val="0"/>
+          <w:numId w:val="9"/>
+        </w:numPr>
+        <w:rPr>
+          <w:b/>
+          <w:bCs/>
+          <w:sz w:val="28"/>
+          <w:szCs w:val="28"/>
+        </w:rPr>
+      </w:pPr>
+      <w:r>
+        <w:rPr>
+          <w:b/>
+          <w:bCs/>
+          <w:sz w:val="28"/>
+          <w:szCs w:val="28"/>
+        </w:rPr>
+        <w:t>Subquery OP:</w:t>
+      </w:r>
+    </w:p>
+    <w:p>
+      <w:pPr>
+        <w:pStyle w:val="ListParagraph"/>
+        <w:numPr>
+          <w:ilvl w:val="0"/>
+          <w:numId w:val="13"/>
+        </w:numPr>
+        <w:rPr>
+          <w:sz w:val="28"/>
+          <w:szCs w:val="28"/>
+        </w:rPr>
+      </w:pPr>
+      <w:r>
+        <w:rPr>
+          <w:sz w:val="28"/>
+          <w:szCs w:val="28"/>
+        </w:rPr>
+        <w:t>ALL</w:t>
+      </w:r>
+    </w:p>
+    <w:p>
+      <w:pPr>
+        <w:pStyle w:val="ListParagraph"/>
+        <w:numPr>
+          <w:ilvl w:val="0"/>
+          <w:numId w:val="13"/>
+        </w:numPr>
+        <w:rPr>
+          <w:sz w:val="28"/>
+          <w:szCs w:val="28"/>
+        </w:rPr>
+      </w:pPr>
+      <w:r>
+        <w:rPr>
+          <w:sz w:val="28"/>
+          <w:szCs w:val="28"/>
+        </w:rPr>
+        <w:t>ANY</w:t>
+      </w:r>
+    </w:p>
+    <w:p>
+      <w:pPr>
+        <w:pStyle w:val="ListParagraph"/>
+        <w:numPr>
+          <w:ilvl w:val="0"/>
+          <w:numId w:val="13"/>
+        </w:numPr>
+        <w:rPr>
+          <w:sz w:val="28"/>
+          <w:szCs w:val="28"/>
+        </w:rPr>
+      </w:pPr>
+      <w:r>
+        <w:rPr>
+          <w:sz w:val="28"/>
+          <w:szCs w:val="28"/>
+        </w:rPr>
+        <w:t>EXISTS</w:t>
+      </w:r>
+    </w:p>
+    <w:p>
+      <w:pPr>
+        <w:pStyle w:val="ListParagraph"/>
+        <w:numPr>
+          <w:ilvl w:val="0"/>
+          <w:numId w:val="13"/>
+        </w:numPr>
+        <w:rPr>
+          <w:sz w:val="28"/>
+          <w:szCs w:val="28"/>
+        </w:rPr>
+      </w:pPr>
+      <w:r>
+        <w:rPr>
+          <w:sz w:val="28"/>
+          <w:szCs w:val="28"/>
+        </w:rPr>
+        <w:t>NOT EXISTS.</w:t>
+      </w:r>
+    </w:p>
+    <w:p>
+      <w:pPr>
+        <w:rPr>
+          <w:sz w:val="28"/>
+          <w:szCs w:val="28"/>
+        </w:rPr>
+      </w:pPr>
+      <w:r>
+        <w:rPr>
+          <w:b/>
+          <w:bCs/>
+          <w:sz w:val="32"/>
+          <w:szCs w:val="32"/>
+        </w:rPr>
+        <w:t xml:space="preserve">Concatenation Operator: </w:t>
+      </w:r>
+      <w:r>
+        <w:rPr>
+          <w:sz w:val="28"/>
+          <w:szCs w:val="28"/>
+        </w:rPr>
+        <w:t>It’s used join the strings</w:t>
+      </w:r>
+      <w:r>
+        <w:rPr>
+          <w:sz w:val="28"/>
+          <w:szCs w:val="28"/>
+        </w:rPr>
+        <w:t>. ( ||)</w:t>
+      </w:r>
+    </w:p>
+    <w:p>
+      <w:pPr>
+        <w:rPr>
+          <w:sz w:val="28"/>
+          <w:szCs w:val="28"/>
+        </w:rPr>
+      </w:pPr>
+      <w:r>
+        <w:rPr>
+          <w:b/>
+          <w:bCs/>
+          <w:sz w:val="32"/>
+          <w:szCs w:val="32"/>
+        </w:rPr>
+        <w:t>Logical Operators:</w:t>
+      </w:r>
+      <w:r>
+        <w:rPr>
+          <w:sz w:val="32"/>
+          <w:szCs w:val="32"/>
+        </w:rPr>
+        <w:t xml:space="preserve"> </w:t>
+      </w:r>
+      <w:r>
+        <w:rPr>
+          <w:sz w:val="28"/>
+          <w:szCs w:val="28"/>
+        </w:rPr>
+        <w:t>We use logical operators to write multiple conditions.</w:t>
+      </w:r>
+    </w:p>
+    <w:p>
+      <w:pPr>
+        <w:pStyle w:val="ListParagraph"/>
+        <w:numPr>
+          <w:ilvl w:val="0"/>
+          <w:numId w:val="14"/>
+        </w:numPr>
+        <w:rPr>
+          <w:b/>
+          <w:bCs/>
+          <w:sz w:val="28"/>
+          <w:szCs w:val="28"/>
+        </w:rPr>
+      </w:pPr>
+      <w:r>
+        <w:rPr>
+          <w:b/>
+          <w:bCs/>
+          <w:sz w:val="28"/>
+          <w:szCs w:val="28"/>
+        </w:rPr>
+        <w:t xml:space="preserve">AND: </w:t>
+      </w:r>
+    </w:p>
+    <w:p>
+      <w:pPr>
+        <w:pStyle w:val="ListParagraph"/>
+        <w:numPr>
+          <w:ilvl w:val="1"/>
+          <w:numId w:val="14"/>
+        </w:numPr>
+        <w:rPr>
+          <w:sz w:val="28"/>
+          <w:szCs w:val="28"/>
+        </w:rPr>
+      </w:pPr>
+      <w:r>
+        <w:rPr>
+          <w:sz w:val="28"/>
+          <w:szCs w:val="28"/>
+        </w:rPr>
+        <w:t xml:space="preserve">It’s a binary operator. </w:t>
+      </w:r>
+    </w:p>
+    <w:p>
+      <w:pPr>
+        <w:pStyle w:val="ListParagraph"/>
+        <w:numPr>
+          <w:ilvl w:val="1"/>
+          <w:numId w:val="14"/>
+        </w:numPr>
+        <w:rPr>
+          <w:sz w:val="28"/>
+          <w:szCs w:val="28"/>
+        </w:rPr>
+      </w:pPr>
+      <w:r>
+        <w:rPr>
+          <w:sz w:val="28"/>
+          <w:szCs w:val="28"/>
+        </w:rPr>
+        <w:t>It returns True if both conditions satisfy.</w:t>
+      </w:r>
+    </w:p>
+    <w:p>
+      <w:pPr>
+        <w:pStyle w:val="ListParagraph"/>
+        <w:numPr>
+          <w:ilvl w:val="0"/>
+          <w:numId w:val="14"/>
+        </w:numPr>
+        <w:rPr>
+          <w:b/>
+          <w:bCs/>
+          <w:sz w:val="28"/>
+          <w:szCs w:val="28"/>
+        </w:rPr>
+      </w:pPr>
+      <w:r>
+        <w:rPr>
+          <w:b/>
+          <w:bCs/>
+          <w:sz w:val="28"/>
+          <w:szCs w:val="28"/>
+        </w:rPr>
+        <w:t>OR:</w:t>
+      </w:r>
+    </w:p>
+    <w:p>
+      <w:pPr>
+        <w:pStyle w:val="ListParagraph"/>
+        <w:numPr>
+          <w:ilvl w:val="1"/>
+          <w:numId w:val="14"/>
+        </w:numPr>
+        <w:rPr>
+          <w:sz w:val="28"/>
+          <w:szCs w:val="28"/>
+        </w:rPr>
+      </w:pPr>
+      <w:r>
+        <w:rPr>
+          <w:sz w:val="28"/>
+          <w:szCs w:val="28"/>
+        </w:rPr>
+        <w:t>It’s a binary operator.</w:t>
+      </w:r>
+    </w:p>
+    <w:p>
+      <w:pPr>
+        <w:pStyle w:val="ListParagraph"/>
+        <w:numPr>
+          <w:ilvl w:val="1"/>
+          <w:numId w:val="14"/>
+        </w:numPr>
+        <w:rPr>
+          <w:sz w:val="28"/>
+          <w:szCs w:val="28"/>
+        </w:rPr>
+      </w:pPr>
+      <w:r>
+        <w:rPr>
+          <w:sz w:val="28"/>
+          <w:szCs w:val="28"/>
+        </w:rPr>
+        <w:t>It returns True if any one condition satisfies.</w:t>
+      </w:r>
+    </w:p>
+    <w:p>
+      <w:pPr>
+        <w:pStyle w:val="ListParagraph"/>
+        <w:numPr>
+          <w:ilvl w:val="0"/>
+          <w:numId w:val="14"/>
+        </w:numPr>
+        <w:rPr>
+          <w:b/>
+          <w:bCs/>
+          <w:sz w:val="28"/>
+          <w:szCs w:val="28"/>
+        </w:rPr>
+      </w:pPr>
+      <w:r>
+        <w:rPr>
+          <w:b/>
+          <w:bCs/>
+          <w:sz w:val="28"/>
+          <w:szCs w:val="28"/>
+        </w:rPr>
+        <w:t>NOT:</w:t>
+      </w:r>
+    </w:p>
+    <w:p>
+      <w:pPr>
+        <w:pStyle w:val="ListParagraph"/>
+        <w:numPr>
+          <w:ilvl w:val="1"/>
+          <w:numId w:val="14"/>
+        </w:numPr>
+        <w:rPr>
+          <w:sz w:val="28"/>
+          <w:szCs w:val="28"/>
+        </w:rPr>
+      </w:pPr>
+      <w:r>
+        <w:rPr>
+          <w:sz w:val="28"/>
+          <w:szCs w:val="28"/>
+        </w:rPr>
+        <w:t>It’s a unary operator.</w:t>
+      </w:r>
+    </w:p>
+    <w:p>
+      <w:pPr>
+        <w:pStyle w:val="ListParagraph"/>
+        <w:numPr>
+          <w:ilvl w:val="1"/>
+          <w:numId w:val="14"/>
+        </w:numPr>
+        <w:rPr>
+          <w:sz w:val="28"/>
+          <w:szCs w:val="28"/>
+        </w:rPr>
+      </w:pPr>
+      <w:r>
+        <w:rPr>
+          <w:sz w:val="28"/>
+          <w:szCs w:val="28"/>
+        </w:rPr>
+        <w:t>It’s used to reverse the given input.</w:t>
+      </w:r>
     </w:p>
     <w:sectPr>
       <w:footerReference w:type="default" r:id="rId8"/>
@@ -7503,6 +8244,208 @@
     </w:lvl>
   </w:abstractNum>
   <w:abstractNum w:abstractNumId="1" w15:restartNumberingAfterBreak="0">
+    <w:nsid w:val="1D7E1684"/>
+    <w:multiLevelType w:val="hybridMultilevel"/>
+    <w:tmpl w:val="B06A6A88"/>
+    <w:lvl w:ilvl="0" w:tplc="40090013">
+      <w:start w:val="1"/>
+      <w:numFmt w:val="upperRoman"/>
+      <w:lvlText w:val="%1."/>
+      <w:lvlJc w:val="right"/>
+      <w:pPr>
+        <w:ind w:left="1080" w:hanging="360"/>
+      </w:pPr>
+      <w:rPr>
+        <w:rFonts w:hint="default"/>
+      </w:rPr>
+    </w:lvl>
+    <w:lvl w:ilvl="1" w:tplc="FFFFFFFF" w:tentative="1">
+      <w:start w:val="1"/>
+      <w:numFmt w:val="lowerLetter"/>
+      <w:lvlText w:val="%2."/>
+      <w:lvlJc w:val="left"/>
+      <w:pPr>
+        <w:ind w:left="1800" w:hanging="360"/>
+      </w:pPr>
+    </w:lvl>
+    <w:lvl w:ilvl="2" w:tplc="FFFFFFFF" w:tentative="1">
+      <w:start w:val="1"/>
+      <w:numFmt w:val="lowerRoman"/>
+      <w:lvlText w:val="%3."/>
+      <w:lvlJc w:val="right"/>
+      <w:pPr>
+        <w:ind w:left="2520" w:hanging="180"/>
+      </w:pPr>
+    </w:lvl>
+    <w:lvl w:ilvl="3" w:tplc="FFFFFFFF" w:tentative="1">
+      <w:start w:val="1"/>
+      <w:numFmt w:val="decimal"/>
+      <w:lvlText w:val="%4."/>
+      <w:lvlJc w:val="left"/>
+      <w:pPr>
+        <w:ind w:left="3240" w:hanging="360"/>
+      </w:pPr>
+    </w:lvl>
+    <w:lvl w:ilvl="4" w:tplc="FFFFFFFF" w:tentative="1">
+      <w:start w:val="1"/>
+      <w:numFmt w:val="lowerLetter"/>
+      <w:lvlText w:val="%5."/>
+      <w:lvlJc w:val="left"/>
+      <w:pPr>
+        <w:ind w:left="3960" w:hanging="360"/>
+      </w:pPr>
+    </w:lvl>
+    <w:lvl w:ilvl="5" w:tplc="FFFFFFFF" w:tentative="1">
+      <w:start w:val="1"/>
+      <w:numFmt w:val="lowerRoman"/>
+      <w:lvlText w:val="%6."/>
+      <w:lvlJc w:val="right"/>
+      <w:pPr>
+        <w:ind w:left="4680" w:hanging="180"/>
+      </w:pPr>
+    </w:lvl>
+    <w:lvl w:ilvl="6" w:tplc="FFFFFFFF" w:tentative="1">
+      <w:start w:val="1"/>
+      <w:numFmt w:val="decimal"/>
+      <w:lvlText w:val="%7."/>
+      <w:lvlJc w:val="left"/>
+      <w:pPr>
+        <w:ind w:left="5400" w:hanging="360"/>
+      </w:pPr>
+    </w:lvl>
+    <w:lvl w:ilvl="7" w:tplc="FFFFFFFF" w:tentative="1">
+      <w:start w:val="1"/>
+      <w:numFmt w:val="lowerLetter"/>
+      <w:lvlText w:val="%8."/>
+      <w:lvlJc w:val="left"/>
+      <w:pPr>
+        <w:ind w:left="6120" w:hanging="360"/>
+      </w:pPr>
+    </w:lvl>
+    <w:lvl w:ilvl="8" w:tplc="FFFFFFFF" w:tentative="1">
+      <w:start w:val="1"/>
+      <w:numFmt w:val="lowerRoman"/>
+      <w:lvlText w:val="%9."/>
+      <w:lvlJc w:val="right"/>
+      <w:pPr>
+        <w:ind w:left="6840" w:hanging="180"/>
+      </w:pPr>
+    </w:lvl>
+  </w:abstractNum>
+  <w:abstractNum w:abstractNumId="2" w15:restartNumberingAfterBreak="0">
+    <w:nsid w:val="241857D5"/>
+    <w:multiLevelType w:val="hybridMultilevel"/>
+    <w:tmpl w:val="6BD89FB4"/>
+    <w:lvl w:ilvl="0" w:tplc="6A583642">
+      <w:start w:val="1"/>
+      <w:numFmt w:val="decimal"/>
+      <w:lvlText w:val="%1."/>
+      <w:lvlJc w:val="left"/>
+      <w:pPr>
+        <w:ind w:left="720" w:hanging="360"/>
+      </w:pPr>
+      <w:rPr>
+        <w:rFonts w:asciiTheme="minorHAnsi" w:eastAsiaTheme="minorHAnsi" w:hAnsiTheme="minorHAnsi" w:cstheme="minorBidi"/>
+      </w:rPr>
+    </w:lvl>
+    <w:lvl w:ilvl="1" w:tplc="40090003">
+      <w:start w:val="1"/>
+      <w:numFmt w:val="bullet"/>
+      <w:lvlText w:val="o"/>
+      <w:lvlJc w:val="left"/>
+      <w:pPr>
+        <w:ind w:left="1440" w:hanging="360"/>
+      </w:pPr>
+      <w:rPr>
+        <w:rFonts w:ascii="Courier New" w:hAnsi="Courier New" w:cs="Courier New" w:hint="default"/>
+      </w:rPr>
+    </w:lvl>
+    <w:lvl w:ilvl="2" w:tplc="40090005" w:tentative="1">
+      <w:start w:val="1"/>
+      <w:numFmt w:val="bullet"/>
+      <w:lvlText w:val=""/>
+      <w:lvlJc w:val="left"/>
+      <w:pPr>
+        <w:ind w:left="2160" w:hanging="360"/>
+      </w:pPr>
+      <w:rPr>
+        <w:rFonts w:ascii="Wingdings" w:hAnsi="Wingdings" w:hint="default"/>
+      </w:rPr>
+    </w:lvl>
+    <w:lvl w:ilvl="3" w:tplc="40090001" w:tentative="1">
+      <w:start w:val="1"/>
+      <w:numFmt w:val="bullet"/>
+      <w:lvlText w:val=""/>
+      <w:lvlJc w:val="left"/>
+      <w:pPr>
+        <w:ind w:left="2880" w:hanging="360"/>
+      </w:pPr>
+      <w:rPr>
+        <w:rFonts w:ascii="Symbol" w:hAnsi="Symbol" w:hint="default"/>
+      </w:rPr>
+    </w:lvl>
+    <w:lvl w:ilvl="4" w:tplc="40090003" w:tentative="1">
+      <w:start w:val="1"/>
+      <w:numFmt w:val="bullet"/>
+      <w:lvlText w:val="o"/>
+      <w:lvlJc w:val="left"/>
+      <w:pPr>
+        <w:ind w:left="3600" w:hanging="360"/>
+      </w:pPr>
+      <w:rPr>
+        <w:rFonts w:ascii="Courier New" w:hAnsi="Courier New" w:cs="Courier New" w:hint="default"/>
+      </w:rPr>
+    </w:lvl>
+    <w:lvl w:ilvl="5" w:tplc="40090005" w:tentative="1">
+      <w:start w:val="1"/>
+      <w:numFmt w:val="bullet"/>
+      <w:lvlText w:val=""/>
+      <w:lvlJc w:val="left"/>
+      <w:pPr>
+        <w:ind w:left="4320" w:hanging="360"/>
+      </w:pPr>
+      <w:rPr>
+        <w:rFonts w:ascii="Wingdings" w:hAnsi="Wingdings" w:hint="default"/>
+      </w:rPr>
+    </w:lvl>
+    <w:lvl w:ilvl="6" w:tplc="40090001" w:tentative="1">
+      <w:start w:val="1"/>
+      <w:numFmt w:val="bullet"/>
+      <w:lvlText w:val=""/>
+      <w:lvlJc w:val="left"/>
+      <w:pPr>
+        <w:ind w:left="5040" w:hanging="360"/>
+      </w:pPr>
+      <w:rPr>
+        <w:rFonts w:ascii="Symbol" w:hAnsi="Symbol" w:hint="default"/>
+      </w:rPr>
+    </w:lvl>
+    <w:lvl w:ilvl="7" w:tplc="40090003" w:tentative="1">
+      <w:start w:val="1"/>
+      <w:numFmt w:val="bullet"/>
+      <w:lvlText w:val="o"/>
+      <w:lvlJc w:val="left"/>
+      <w:pPr>
+        <w:ind w:left="5760" w:hanging="360"/>
+      </w:pPr>
+      <w:rPr>
+        <w:rFonts w:ascii="Courier New" w:hAnsi="Courier New" w:cs="Courier New" w:hint="default"/>
+      </w:rPr>
+    </w:lvl>
+    <w:lvl w:ilvl="8" w:tplc="40090005" w:tentative="1">
+      <w:start w:val="1"/>
+      <w:numFmt w:val="bullet"/>
+      <w:lvlText w:val=""/>
+      <w:lvlJc w:val="left"/>
+      <w:pPr>
+        <w:ind w:left="6480" w:hanging="360"/>
+      </w:pPr>
+      <w:rPr>
+        <w:rFonts w:ascii="Wingdings" w:hAnsi="Wingdings" w:hint="default"/>
+      </w:rPr>
+    </w:lvl>
+  </w:abstractNum>
+  <w:abstractNum w:abstractNumId="3" w15:restartNumberingAfterBreak="0">
     <w:nsid w:val="25AA17B3"/>
     <w:multiLevelType w:val="multilevel"/>
     <w:tmpl w:val="D35C29E6"/>
@@ -7651,7 +8594,96 @@
       </w:rPr>
     </w:lvl>
   </w:abstractNum>
-  <w:abstractNum w:abstractNumId="2" w15:restartNumberingAfterBreak="0">
+  <w:abstractNum w:abstractNumId="4" w15:restartNumberingAfterBreak="0">
+    <w:nsid w:val="4910299B"/>
+    <w:multiLevelType w:val="hybridMultilevel"/>
+    <w:tmpl w:val="505E8358"/>
+    <w:lvl w:ilvl="0" w:tplc="40090013">
+      <w:start w:val="1"/>
+      <w:numFmt w:val="upperRoman"/>
+      <w:lvlText w:val="%1."/>
+      <w:lvlJc w:val="right"/>
+      <w:pPr>
+        <w:ind w:left="1080" w:hanging="360"/>
+      </w:pPr>
+      <w:rPr>
+        <w:rFonts w:hint="default"/>
+      </w:rPr>
+    </w:lvl>
+    <w:lvl w:ilvl="1" w:tplc="FFFFFFFF" w:tentative="1">
+      <w:start w:val="1"/>
+      <w:numFmt w:val="lowerLetter"/>
+      <w:lvlText w:val="%2."/>
+      <w:lvlJc w:val="left"/>
+      <w:pPr>
+        <w:ind w:left="1800" w:hanging="360"/>
+      </w:pPr>
+    </w:lvl>
+    <w:lvl w:ilvl="2" w:tplc="FFFFFFFF" w:tentative="1">
+      <w:start w:val="1"/>
+      <w:numFmt w:val="lowerRoman"/>
+      <w:lvlText w:val="%3."/>
+      <w:lvlJc w:val="right"/>
+      <w:pPr>
+        <w:ind w:left="2520" w:hanging="180"/>
+      </w:pPr>
+    </w:lvl>
+    <w:lvl w:ilvl="3" w:tplc="FFFFFFFF" w:tentative="1">
+      <w:start w:val="1"/>
+      <w:numFmt w:val="decimal"/>
+      <w:lvlText w:val="%4."/>
+      <w:lvlJc w:val="left"/>
+      <w:pPr>
+        <w:ind w:left="3240" w:hanging="360"/>
+      </w:pPr>
+    </w:lvl>
+    <w:lvl w:ilvl="4" w:tplc="FFFFFFFF" w:tentative="1">
+      <w:start w:val="1"/>
+      <w:numFmt w:val="lowerLetter"/>
+      <w:lvlText w:val="%5."/>
+      <w:lvlJc w:val="left"/>
+      <w:pPr>
+        <w:ind w:left="3960" w:hanging="360"/>
+      </w:pPr>
+    </w:lvl>
+    <w:lvl w:ilvl="5" w:tplc="FFFFFFFF" w:tentative="1">
+      <w:start w:val="1"/>
+      <w:numFmt w:val="lowerRoman"/>
+      <w:lvlText w:val="%6."/>
+      <w:lvlJc w:val="right"/>
+      <w:pPr>
+        <w:ind w:left="4680" w:hanging="180"/>
+      </w:pPr>
+    </w:lvl>
+    <w:lvl w:ilvl="6" w:tplc="FFFFFFFF" w:tentative="1">
+      <w:start w:val="1"/>
+      <w:numFmt w:val="decimal"/>
+      <w:lvlText w:val="%7."/>
+      <w:lvlJc w:val="left"/>
+      <w:pPr>
+        <w:ind w:left="5400" w:hanging="360"/>
+      </w:pPr>
+    </w:lvl>
+    <w:lvl w:ilvl="7" w:tplc="FFFFFFFF" w:tentative="1">
+      <w:start w:val="1"/>
+      <w:numFmt w:val="lowerLetter"/>
+      <w:lvlText w:val="%8."/>
+      <w:lvlJc w:val="left"/>
+      <w:pPr>
+        <w:ind w:left="6120" w:hanging="360"/>
+      </w:pPr>
+    </w:lvl>
+    <w:lvl w:ilvl="8" w:tplc="FFFFFFFF" w:tentative="1">
+      <w:start w:val="1"/>
+      <w:numFmt w:val="lowerRoman"/>
+      <w:lvlText w:val="%9."/>
+      <w:lvlJc w:val="right"/>
+      <w:pPr>
+        <w:ind w:left="6840" w:hanging="180"/>
+      </w:pPr>
+    </w:lvl>
+  </w:abstractNum>
+  <w:abstractNum w:abstractNumId="5" w15:restartNumberingAfterBreak="0">
     <w:nsid w:val="4C9C522C"/>
     <w:multiLevelType w:val="hybridMultilevel"/>
     <w:tmpl w:val="9CF4E540"/>
@@ -7740,7 +8772,7 @@
       </w:pPr>
     </w:lvl>
   </w:abstractNum>
-  <w:abstractNum w:abstractNumId="3" w15:restartNumberingAfterBreak="0">
+  <w:abstractNum w:abstractNumId="6" w15:restartNumberingAfterBreak="0">
     <w:nsid w:val="52F00AF7"/>
     <w:multiLevelType w:val="multilevel"/>
     <w:tmpl w:val="D30886D8"/>
@@ -7889,7 +8921,7 @@
       </w:rPr>
     </w:lvl>
   </w:abstractNum>
-  <w:abstractNum w:abstractNumId="4" w15:restartNumberingAfterBreak="0">
+  <w:abstractNum w:abstractNumId="7" w15:restartNumberingAfterBreak="0">
     <w:nsid w:val="54F573AB"/>
     <w:multiLevelType w:val="hybridMultilevel"/>
     <w:tmpl w:val="AC56D67E"/>
@@ -8001,7 +9033,7 @@
       </w:rPr>
     </w:lvl>
   </w:abstractNum>
-  <w:abstractNum w:abstractNumId="5" w15:restartNumberingAfterBreak="0">
+  <w:abstractNum w:abstractNumId="8" w15:restartNumberingAfterBreak="0">
     <w:nsid w:val="5B382BCC"/>
     <w:multiLevelType w:val="multilevel"/>
     <w:tmpl w:val="E92034E6"/>
@@ -8114,7 +9146,7 @@
       </w:pPr>
     </w:lvl>
   </w:abstractNum>
-  <w:abstractNum w:abstractNumId="6" w15:restartNumberingAfterBreak="0">
+  <w:abstractNum w:abstractNumId="9" w15:restartNumberingAfterBreak="0">
     <w:nsid w:val="62B46CBE"/>
     <w:multiLevelType w:val="hybridMultilevel"/>
     <w:tmpl w:val="E7B8FE0C"/>
@@ -8226,7 +9258,96 @@
       </w:rPr>
     </w:lvl>
   </w:abstractNum>
-  <w:abstractNum w:abstractNumId="7" w15:restartNumberingAfterBreak="0">
+  <w:abstractNum w:abstractNumId="10" w15:restartNumberingAfterBreak="0">
+    <w:nsid w:val="64E87168"/>
+    <w:multiLevelType w:val="hybridMultilevel"/>
+    <w:tmpl w:val="6E6ED9EC"/>
+    <w:lvl w:ilvl="0" w:tplc="8D4AED76">
+      <w:start w:val="1"/>
+      <w:numFmt w:val="decimal"/>
+      <w:lvlText w:val="%1."/>
+      <w:lvlJc w:val="left"/>
+      <w:pPr>
+        <w:ind w:left="1080" w:hanging="360"/>
+      </w:pPr>
+      <w:rPr>
+        <w:rFonts w:hint="default"/>
+      </w:rPr>
+    </w:lvl>
+    <w:lvl w:ilvl="1" w:tplc="40090019" w:tentative="1">
+      <w:start w:val="1"/>
+      <w:numFmt w:val="lowerLetter"/>
+      <w:lvlText w:val="%2."/>
+      <w:lvlJc w:val="left"/>
+      <w:pPr>
+        <w:ind w:left="1800" w:hanging="360"/>
+      </w:pPr>
+    </w:lvl>
+    <w:lvl w:ilvl="2" w:tplc="4009001B" w:tentative="1">
+      <w:start w:val="1"/>
+      <w:numFmt w:val="lowerRoman"/>
+      <w:lvlText w:val="%3."/>
+      <w:lvlJc w:val="right"/>
+      <w:pPr>
+        <w:ind w:left="2520" w:hanging="180"/>
+      </w:pPr>
+    </w:lvl>
+    <w:lvl w:ilvl="3" w:tplc="4009000F" w:tentative="1">
+      <w:start w:val="1"/>
+      <w:numFmt w:val="decimal"/>
+      <w:lvlText w:val="%4."/>
+      <w:lvlJc w:val="left"/>
+      <w:pPr>
+        <w:ind w:left="3240" w:hanging="360"/>
+      </w:pPr>
+    </w:lvl>
+    <w:lvl w:ilvl="4" w:tplc="40090019" w:tentative="1">
+      <w:start w:val="1"/>
+      <w:numFmt w:val="lowerLetter"/>
+      <w:lvlText w:val="%5."/>
+      <w:lvlJc w:val="left"/>
+      <w:pPr>
+        <w:ind w:left="3960" w:hanging="360"/>
+      </w:pPr>
+    </w:lvl>
+    <w:lvl w:ilvl="5" w:tplc="4009001B" w:tentative="1">
+      <w:start w:val="1"/>
+      <w:numFmt w:val="lowerRoman"/>
+      <w:lvlText w:val="%6."/>
+      <w:lvlJc w:val="right"/>
+      <w:pPr>
+        <w:ind w:left="4680" w:hanging="180"/>
+      </w:pPr>
+    </w:lvl>
+    <w:lvl w:ilvl="6" w:tplc="4009000F" w:tentative="1">
+      <w:start w:val="1"/>
+      <w:numFmt w:val="decimal"/>
+      <w:lvlText w:val="%7."/>
+      <w:lvlJc w:val="left"/>
+      <w:pPr>
+        <w:ind w:left="5400" w:hanging="360"/>
+      </w:pPr>
+    </w:lvl>
+    <w:lvl w:ilvl="7" w:tplc="40090019" w:tentative="1">
+      <w:start w:val="1"/>
+      <w:numFmt w:val="lowerLetter"/>
+      <w:lvlText w:val="%8."/>
+      <w:lvlJc w:val="left"/>
+      <w:pPr>
+        <w:ind w:left="6120" w:hanging="360"/>
+      </w:pPr>
+    </w:lvl>
+    <w:lvl w:ilvl="8" w:tplc="4009001B" w:tentative="1">
+      <w:start w:val="1"/>
+      <w:numFmt w:val="lowerRoman"/>
+      <w:lvlText w:val="%9."/>
+      <w:lvlJc w:val="right"/>
+      <w:pPr>
+        <w:ind w:left="6840" w:hanging="180"/>
+      </w:pPr>
+    </w:lvl>
+  </w:abstractNum>
+  <w:abstractNum w:abstractNumId="11" w15:restartNumberingAfterBreak="0">
     <w:nsid w:val="6DA059D8"/>
     <w:multiLevelType w:val="hybridMultilevel"/>
     <w:tmpl w:val="41361528"/>
@@ -8315,28 +9436,224 @@
       </w:pPr>
     </w:lvl>
   </w:abstractNum>
+  <w:abstractNum w:abstractNumId="12" w15:restartNumberingAfterBreak="0">
+    <w:nsid w:val="717F6C7F"/>
+    <w:multiLevelType w:val="hybridMultilevel"/>
+    <w:tmpl w:val="F8E07416"/>
+    <w:lvl w:ilvl="0" w:tplc="4009000F">
+      <w:start w:val="1"/>
+      <w:numFmt w:val="decimal"/>
+      <w:lvlText w:val="%1."/>
+      <w:lvlJc w:val="left"/>
+      <w:pPr>
+        <w:ind w:left="720" w:hanging="360"/>
+      </w:pPr>
+      <w:rPr>
+        <w:rFonts w:hint="default"/>
+      </w:rPr>
+    </w:lvl>
+    <w:lvl w:ilvl="1" w:tplc="40090019" w:tentative="1">
+      <w:start w:val="1"/>
+      <w:numFmt w:val="lowerLetter"/>
+      <w:lvlText w:val="%2."/>
+      <w:lvlJc w:val="left"/>
+      <w:pPr>
+        <w:ind w:left="1440" w:hanging="360"/>
+      </w:pPr>
+    </w:lvl>
+    <w:lvl w:ilvl="2" w:tplc="4009001B" w:tentative="1">
+      <w:start w:val="1"/>
+      <w:numFmt w:val="lowerRoman"/>
+      <w:lvlText w:val="%3."/>
+      <w:lvlJc w:val="right"/>
+      <w:pPr>
+        <w:ind w:left="2160" w:hanging="180"/>
+      </w:pPr>
+    </w:lvl>
+    <w:lvl w:ilvl="3" w:tplc="4009000F" w:tentative="1">
+      <w:start w:val="1"/>
+      <w:numFmt w:val="decimal"/>
+      <w:lvlText w:val="%4."/>
+      <w:lvlJc w:val="left"/>
+      <w:pPr>
+        <w:ind w:left="2880" w:hanging="360"/>
+      </w:pPr>
+    </w:lvl>
+    <w:lvl w:ilvl="4" w:tplc="40090019" w:tentative="1">
+      <w:start w:val="1"/>
+      <w:numFmt w:val="lowerLetter"/>
+      <w:lvlText w:val="%5."/>
+      <w:lvlJc w:val="left"/>
+      <w:pPr>
+        <w:ind w:left="3600" w:hanging="360"/>
+      </w:pPr>
+    </w:lvl>
+    <w:lvl w:ilvl="5" w:tplc="4009001B" w:tentative="1">
+      <w:start w:val="1"/>
+      <w:numFmt w:val="lowerRoman"/>
+      <w:lvlText w:val="%6."/>
+      <w:lvlJc w:val="right"/>
+      <w:pPr>
+        <w:ind w:left="4320" w:hanging="180"/>
+      </w:pPr>
+    </w:lvl>
+    <w:lvl w:ilvl="6" w:tplc="4009000F" w:tentative="1">
+      <w:start w:val="1"/>
+      <w:numFmt w:val="decimal"/>
+      <w:lvlText w:val="%7."/>
+      <w:lvlJc w:val="left"/>
+      <w:pPr>
+        <w:ind w:left="5040" w:hanging="360"/>
+      </w:pPr>
+    </w:lvl>
+    <w:lvl w:ilvl="7" w:tplc="40090019" w:tentative="1">
+      <w:start w:val="1"/>
+      <w:numFmt w:val="lowerLetter"/>
+      <w:lvlText w:val="%8."/>
+      <w:lvlJc w:val="left"/>
+      <w:pPr>
+        <w:ind w:left="5760" w:hanging="360"/>
+      </w:pPr>
+    </w:lvl>
+    <w:lvl w:ilvl="8" w:tplc="4009001B" w:tentative="1">
+      <w:start w:val="1"/>
+      <w:numFmt w:val="lowerRoman"/>
+      <w:lvlText w:val="%9."/>
+      <w:lvlJc w:val="right"/>
+      <w:pPr>
+        <w:ind w:left="6480" w:hanging="180"/>
+      </w:pPr>
+    </w:lvl>
+  </w:abstractNum>
+  <w:abstractNum w:abstractNumId="13" w15:restartNumberingAfterBreak="0">
+    <w:nsid w:val="76637F62"/>
+    <w:multiLevelType w:val="hybridMultilevel"/>
+    <w:tmpl w:val="9A9837A2"/>
+    <w:lvl w:ilvl="0" w:tplc="90FEFE62">
+      <w:start w:val="1"/>
+      <w:numFmt w:val="decimal"/>
+      <w:lvlText w:val="%1."/>
+      <w:lvlJc w:val="left"/>
+      <w:pPr>
+        <w:ind w:left="1080" w:hanging="360"/>
+      </w:pPr>
+      <w:rPr>
+        <w:rFonts w:hint="default"/>
+      </w:rPr>
+    </w:lvl>
+    <w:lvl w:ilvl="1" w:tplc="40090019" w:tentative="1">
+      <w:start w:val="1"/>
+      <w:numFmt w:val="lowerLetter"/>
+      <w:lvlText w:val="%2."/>
+      <w:lvlJc w:val="left"/>
+      <w:pPr>
+        <w:ind w:left="1800" w:hanging="360"/>
+      </w:pPr>
+    </w:lvl>
+    <w:lvl w:ilvl="2" w:tplc="4009001B" w:tentative="1">
+      <w:start w:val="1"/>
+      <w:numFmt w:val="lowerRoman"/>
+      <w:lvlText w:val="%3."/>
+      <w:lvlJc w:val="right"/>
+      <w:pPr>
+        <w:ind w:left="2520" w:hanging="180"/>
+      </w:pPr>
+    </w:lvl>
+    <w:lvl w:ilvl="3" w:tplc="4009000F" w:tentative="1">
+      <w:start w:val="1"/>
+      <w:numFmt w:val="decimal"/>
+      <w:lvlText w:val="%4."/>
+      <w:lvlJc w:val="left"/>
+      <w:pPr>
+        <w:ind w:left="3240" w:hanging="360"/>
+      </w:pPr>
+    </w:lvl>
+    <w:lvl w:ilvl="4" w:tplc="40090019" w:tentative="1">
+      <w:start w:val="1"/>
+      <w:numFmt w:val="lowerLetter"/>
+      <w:lvlText w:val="%5."/>
+      <w:lvlJc w:val="left"/>
+      <w:pPr>
+        <w:ind w:left="3960" w:hanging="360"/>
+      </w:pPr>
+    </w:lvl>
+    <w:lvl w:ilvl="5" w:tplc="4009001B" w:tentative="1">
+      <w:start w:val="1"/>
+      <w:numFmt w:val="lowerRoman"/>
+      <w:lvlText w:val="%6."/>
+      <w:lvlJc w:val="right"/>
+      <w:pPr>
+        <w:ind w:left="4680" w:hanging="180"/>
+      </w:pPr>
+    </w:lvl>
+    <w:lvl w:ilvl="6" w:tplc="4009000F" w:tentative="1">
+      <w:start w:val="1"/>
+      <w:numFmt w:val="decimal"/>
+      <w:lvlText w:val="%7."/>
+      <w:lvlJc w:val="left"/>
+      <w:pPr>
+        <w:ind w:left="5400" w:hanging="360"/>
+      </w:pPr>
+    </w:lvl>
+    <w:lvl w:ilvl="7" w:tplc="40090019" w:tentative="1">
+      <w:start w:val="1"/>
+      <w:numFmt w:val="lowerLetter"/>
+      <w:lvlText w:val="%8."/>
+      <w:lvlJc w:val="left"/>
+      <w:pPr>
+        <w:ind w:left="6120" w:hanging="360"/>
+      </w:pPr>
+    </w:lvl>
+    <w:lvl w:ilvl="8" w:tplc="4009001B" w:tentative="1">
+      <w:start w:val="1"/>
+      <w:numFmt w:val="lowerRoman"/>
+      <w:lvlText w:val="%9."/>
+      <w:lvlJc w:val="right"/>
+      <w:pPr>
+        <w:ind w:left="6840" w:hanging="180"/>
+      </w:pPr>
+    </w:lvl>
+  </w:abstractNum>
   <w:num w:numId="1" w16cid:durableId="1490903148">
-    <w:abstractNumId w:val="1"/>
+    <w:abstractNumId w:val="3"/>
   </w:num>
   <w:num w:numId="2" w16cid:durableId="999424346">
-    <w:abstractNumId w:val="3"/>
+    <w:abstractNumId w:val="6"/>
   </w:num>
   <w:num w:numId="3" w16cid:durableId="1325819858">
-    <w:abstractNumId w:val="5"/>
+    <w:abstractNumId w:val="8"/>
   </w:num>
   <w:num w:numId="4" w16cid:durableId="133182302">
     <w:abstractNumId w:val="0"/>
   </w:num>
   <w:num w:numId="5" w16cid:durableId="1477799212">
-    <w:abstractNumId w:val="6"/>
+    <w:abstractNumId w:val="9"/>
   </w:num>
   <w:num w:numId="6" w16cid:durableId="1507357191">
+    <w:abstractNumId w:val="7"/>
+  </w:num>
+  <w:num w:numId="7" w16cid:durableId="1234849977">
+    <w:abstractNumId w:val="11"/>
+  </w:num>
+  <w:num w:numId="8" w16cid:durableId="2095319065">
+    <w:abstractNumId w:val="5"/>
+  </w:num>
+  <w:num w:numId="9" w16cid:durableId="1276062488">
+    <w:abstractNumId w:val="12"/>
+  </w:num>
+  <w:num w:numId="10" w16cid:durableId="301732449">
+    <w:abstractNumId w:val="13"/>
+  </w:num>
+  <w:num w:numId="11" w16cid:durableId="565268006">
+    <w:abstractNumId w:val="10"/>
+  </w:num>
+  <w:num w:numId="12" w16cid:durableId="1765566125">
+    <w:abstractNumId w:val="1"/>
+  </w:num>
+  <w:num w:numId="13" w16cid:durableId="1685395611">
     <w:abstractNumId w:val="4"/>
   </w:num>
-  <w:num w:numId="7" w16cid:durableId="1234849977">
-    <w:abstractNumId w:val="7"/>
-  </w:num>
-  <w:num w:numId="8" w16cid:durableId="2095319065">
+  <w:num w:numId="14" w16cid:durableId="371853232">
     <w:abstractNumId w:val="2"/>
   </w:num>
 </w:numbering>

</xml_diff>

<commit_message>
SQL till 7 spet
</commit_message>
<xml_diff>
--- a/QS SQL/SQL Class Notes.docx
+++ b/QS SQL/SQL Class Notes.docx
@@ -1656,6 +1656,51 @@
         <w:jc w:val="center"/>
         <w:rPr>
           <w:rFonts w:cstheme="minorHAnsi"/>
+          <w:b/>
+          <w:bCs/>
+          <w:sz w:val="28"/>
+          <w:szCs w:val="28"/>
+        </w:rPr>
+      </w:pPr>
+    </w:p>
+    <w:p>
+      <w:pPr>
+        <w:tabs>
+          <w:tab w:val="left" w:pos="8515"/>
+        </w:tabs>
+        <w:jc w:val="center"/>
+        <w:rPr>
+          <w:rFonts w:cstheme="minorHAnsi"/>
+          <w:b/>
+          <w:bCs/>
+          <w:sz w:val="28"/>
+          <w:szCs w:val="28"/>
+        </w:rPr>
+      </w:pPr>
+    </w:p>
+    <w:p>
+      <w:pPr>
+        <w:tabs>
+          <w:tab w:val="left" w:pos="8515"/>
+        </w:tabs>
+        <w:jc w:val="center"/>
+        <w:rPr>
+          <w:rFonts w:cstheme="minorHAnsi"/>
+          <w:b/>
+          <w:bCs/>
+          <w:sz w:val="28"/>
+          <w:szCs w:val="28"/>
+        </w:rPr>
+      </w:pPr>
+    </w:p>
+    <w:p>
+      <w:pPr>
+        <w:tabs>
+          <w:tab w:val="left" w:pos="8515"/>
+        </w:tabs>
+        <w:jc w:val="center"/>
+        <w:rPr>
+          <w:rFonts w:cstheme="minorHAnsi"/>
           <w:sz w:val="28"/>
           <w:szCs w:val="28"/>
           <w:vertAlign w:val="superscript"/>
@@ -1965,7 +2010,7 @@
           </mc:Choice>
           <mc:Fallback>
             <w:pict>
-              <v:shapetype w14:anchorId="1E7EA638" id="_x0000_t113" coordsize="21600,21600" o:spt="113" path="m,l,21600r21600,l21600,xem4236,nfl4236,21600em,4236nfl21600,4236e">
+              <v:shapetype w14:anchorId="0E4B45E5" id="_x0000_t113" coordsize="21600,21600" o:spt="113" path="m,l,21600r21600,l21600,xem4236,nfl4236,21600em,4236nfl21600,4236e">
                 <v:stroke joinstyle="miter"/>
                 <v:path o:extrusionok="f" gradientshapeok="t" o:connecttype="rect" textboxrect="4236,4236,21600,21600"/>
               </v:shapetype>
@@ -1980,6 +2025,16 @@
     </w:p>
     <w:p>
       <w:pPr>
+        <w:pStyle w:val="NormalWeb"/>
+      </w:pPr>
+    </w:p>
+    <w:p>
+      <w:pPr>
+        <w:pStyle w:val="NormalWeb"/>
+      </w:pPr>
+    </w:p>
+    <w:p>
+      <w:pPr>
         <w:tabs>
           <w:tab w:val="left" w:pos="7751"/>
         </w:tabs>
@@ -1994,6 +2049,7 @@
           <w:rFonts w:cstheme="minorHAnsi"/>
           <w:noProof/>
         </w:rPr>
+        <w:lastRenderedPageBreak/>
         <mc:AlternateContent>
           <mc:Choice Requires="wps">
             <w:drawing>
@@ -2266,7 +2322,7 @@
           </mc:Choice>
           <mc:Fallback>
             <w:pict>
-              <v:shapetype w14:anchorId="4E085629" id="_x0000_t32" coordsize="21600,21600" o:spt="32" o:oned="t" path="m,l21600,21600e" filled="f">
+              <v:shapetype w14:anchorId="21F30054" id="_x0000_t32" coordsize="21600,21600" o:spt="32" o:oned="t" path="m,l21600,21600e" filled="f">
                 <v:path arrowok="t" fillok="f" o:connecttype="none"/>
                 <o:lock v:ext="edit" shapetype="t"/>
               </v:shapetype>
@@ -2480,10 +2536,33 @@
           <w:sz w:val="28"/>
           <w:szCs w:val="28"/>
         </w:rPr>
-        <w:lastRenderedPageBreak/>
         <w:tab/>
         <w:t>TABLE FORMAT</w:t>
       </w:r>
+    </w:p>
+    <w:p>
+      <w:pPr>
+        <w:tabs>
+          <w:tab w:val="left" w:pos="8515"/>
+        </w:tabs>
+        <w:rPr>
+          <w:rFonts w:cstheme="minorHAnsi"/>
+          <w:sz w:val="28"/>
+          <w:szCs w:val="28"/>
+        </w:rPr>
+      </w:pPr>
+    </w:p>
+    <w:p>
+      <w:pPr>
+        <w:tabs>
+          <w:tab w:val="left" w:pos="8515"/>
+        </w:tabs>
+        <w:rPr>
+          <w:rFonts w:cstheme="minorHAnsi"/>
+          <w:sz w:val="28"/>
+          <w:szCs w:val="28"/>
+        </w:rPr>
+      </w:pPr>
     </w:p>
     <w:p>
       <w:pPr>
@@ -3386,6 +3465,7 @@
           <w:szCs w:val="28"/>
           <w:u w:val="single"/>
         </w:rPr>
+        <w:lastRenderedPageBreak/>
         <w:t>DATA TYPES</w:t>
       </w:r>
     </w:p>
@@ -4575,7 +4655,6 @@
           <w:sz w:val="28"/>
           <w:szCs w:val="28"/>
         </w:rPr>
-        <w:lastRenderedPageBreak/>
         <w:t xml:space="preserve">Its range </w:t>
       </w:r>
       <w:r>
@@ -7758,6 +7837,7 @@
           <w:iCs/>
           <w:sz w:val="28"/>
           <w:szCs w:val="28"/>
+          <w:u w:val="single"/>
         </w:rPr>
       </w:pPr>
       <w:r>
@@ -7777,6 +7857,7 @@
           <w:iCs/>
           <w:sz w:val="28"/>
           <w:szCs w:val="28"/>
+          <w:u w:val="single"/>
         </w:rPr>
         <w:lastRenderedPageBreak/>
         <w:t>26-Aug-Notes</w:t>
@@ -7785,39 +7866,72 @@
     <w:p>
       <w:pPr>
         <w:pStyle w:val="Heading1"/>
-      </w:pPr>
-      <w:r>
+        <w:jc w:val="center"/>
+        <w:rPr>
+          <w:b/>
+          <w:bCs/>
+        </w:rPr>
+      </w:pPr>
+      <w:r>
+        <w:rPr>
+          <w:b/>
+          <w:bCs/>
+        </w:rPr>
         <w:t>OPERATORS</w:t>
       </w:r>
     </w:p>
     <w:p>
       <w:pPr>
         <w:pStyle w:val="NormalWeb"/>
+        <w:rPr>
+          <w:sz w:val="28"/>
+          <w:szCs w:val="28"/>
+        </w:rPr>
       </w:pPr>
       <w:r>
         <w:rPr>
           <w:rStyle w:val="Strong"/>
+          <w:sz w:val="28"/>
+          <w:szCs w:val="28"/>
         </w:rPr>
         <w:t>Operators</w:t>
       </w:r>
       <w:r>
+        <w:rPr>
+          <w:sz w:val="28"/>
+          <w:szCs w:val="28"/>
+        </w:rPr>
         <w:t xml:space="preserve"> are symbols or keywords used to perform specific operations on data or conditions.</w:t>
       </w:r>
     </w:p>
     <w:p>
       <w:pPr>
         <w:pStyle w:val="NormalWeb"/>
-      </w:pPr>
-      <w:r>
+        <w:rPr>
+          <w:sz w:val="28"/>
+          <w:szCs w:val="28"/>
+        </w:rPr>
+      </w:pPr>
+      <w:r>
+        <w:rPr>
+          <w:sz w:val="28"/>
+          <w:szCs w:val="28"/>
+        </w:rPr>
         <w:t xml:space="preserve">There are </w:t>
       </w:r>
       <w:r>
         <w:rPr>
           <w:rStyle w:val="Strong"/>
+          <w:sz w:val="28"/>
+          <w:szCs w:val="28"/>
         </w:rPr>
         <w:t>7 types of operators in SQL</w:t>
       </w:r>
       <w:r>
+        <w:rPr>
+          <w:sz w:val="28"/>
+          <w:szCs w:val="28"/>
+        </w:rPr>
         <w:t>:</w:t>
       </w:r>
     </w:p>
@@ -7828,55 +7942,91 @@
           <w:ilvl w:val="0"/>
           <w:numId w:val="23"/>
         </w:numPr>
+        <w:rPr>
+          <w:sz w:val="28"/>
+          <w:szCs w:val="28"/>
+        </w:rPr>
       </w:pPr>
       <w:r>
         <w:rPr>
           <w:rStyle w:val="Strong"/>
+          <w:sz w:val="28"/>
+          <w:szCs w:val="28"/>
         </w:rPr>
         <w:t>Arithmetic Operators:</w:t>
       </w:r>
       <w:r>
+        <w:rPr>
+          <w:sz w:val="28"/>
+          <w:szCs w:val="28"/>
+        </w:rPr>
         <w:t xml:space="preserve"> </w:t>
       </w:r>
       <w:r>
         <w:rPr>
           <w:rStyle w:val="HTMLCode"/>
+          <w:sz w:val="28"/>
+          <w:szCs w:val="28"/>
         </w:rPr>
         <w:t>+</w:t>
       </w:r>
       <w:r>
+        <w:rPr>
+          <w:sz w:val="28"/>
+          <w:szCs w:val="28"/>
+        </w:rPr>
         <w:t xml:space="preserve">, </w:t>
       </w:r>
       <w:r>
         <w:rPr>
           <w:rStyle w:val="HTMLCode"/>
+          <w:sz w:val="28"/>
+          <w:szCs w:val="28"/>
         </w:rPr>
         <w:t>-</w:t>
       </w:r>
       <w:r>
+        <w:rPr>
+          <w:sz w:val="28"/>
+          <w:szCs w:val="28"/>
+        </w:rPr>
         <w:t xml:space="preserve">, </w:t>
       </w:r>
       <w:r>
         <w:rPr>
           <w:rStyle w:val="HTMLCode"/>
+          <w:sz w:val="28"/>
+          <w:szCs w:val="28"/>
         </w:rPr>
         <w:t>*</w:t>
       </w:r>
       <w:r>
+        <w:rPr>
+          <w:sz w:val="28"/>
+          <w:szCs w:val="28"/>
+        </w:rPr>
         <w:t xml:space="preserve">, </w:t>
       </w:r>
       <w:r>
         <w:rPr>
           <w:rStyle w:val="HTMLCode"/>
+          <w:sz w:val="28"/>
+          <w:szCs w:val="28"/>
         </w:rPr>
         <w:t>/</w:t>
       </w:r>
       <w:r>
+        <w:rPr>
+          <w:sz w:val="28"/>
+          <w:szCs w:val="28"/>
+        </w:rPr>
         <w:t xml:space="preserve">, </w:t>
       </w:r>
       <w:r>
         <w:rPr>
           <w:rStyle w:val="HTMLCode"/>
+          <w:sz w:val="28"/>
+          <w:szCs w:val="28"/>
         </w:rPr>
         <w:t>%</w:t>
       </w:r>
@@ -7888,29 +8038,47 @@
           <w:ilvl w:val="0"/>
           <w:numId w:val="23"/>
         </w:numPr>
+        <w:rPr>
+          <w:sz w:val="28"/>
+          <w:szCs w:val="28"/>
+        </w:rPr>
       </w:pPr>
       <w:r>
         <w:rPr>
           <w:rStyle w:val="Strong"/>
+          <w:sz w:val="28"/>
+          <w:szCs w:val="28"/>
         </w:rPr>
         <w:t>Comparison Operators:</w:t>
       </w:r>
       <w:r>
+        <w:rPr>
+          <w:sz w:val="28"/>
+          <w:szCs w:val="28"/>
+        </w:rPr>
         <w:t xml:space="preserve"> </w:t>
       </w:r>
       <w:r>
         <w:rPr>
           <w:rStyle w:val="HTMLCode"/>
+          <w:sz w:val="28"/>
+          <w:szCs w:val="28"/>
         </w:rPr>
         <w:t>=</w:t>
       </w:r>
       <w:proofErr w:type="gramStart"/>
       <w:r>
+        <w:rPr>
+          <w:sz w:val="28"/>
+          <w:szCs w:val="28"/>
+        </w:rPr>
         <w:t xml:space="preserve">, </w:t>
       </w:r>
       <w:r>
         <w:rPr>
           <w:rStyle w:val="HTMLCode"/>
+          <w:sz w:val="28"/>
+          <w:szCs w:val="28"/>
         </w:rPr>
         <w:t>!</w:t>
       </w:r>
@@ -7918,15 +8086,23 @@
       <w:r>
         <w:rPr>
           <w:rStyle w:val="HTMLCode"/>
+          <w:sz w:val="28"/>
+          <w:szCs w:val="28"/>
         </w:rPr>
         <w:t>=</w:t>
       </w:r>
       <w:r>
+        <w:rPr>
+          <w:sz w:val="28"/>
+          <w:szCs w:val="28"/>
+        </w:rPr>
         <w:t xml:space="preserve">, </w:t>
       </w:r>
       <w:r>
         <w:rPr>
           <w:rStyle w:val="HTMLCode"/>
+          <w:sz w:val="28"/>
+          <w:szCs w:val="28"/>
         </w:rPr>
         <w:t>&lt;&gt;</w:t>
       </w:r>
@@ -7938,46 +8114,76 @@
           <w:ilvl w:val="0"/>
           <w:numId w:val="23"/>
         </w:numPr>
+        <w:rPr>
+          <w:sz w:val="28"/>
+          <w:szCs w:val="28"/>
+        </w:rPr>
       </w:pPr>
       <w:r>
         <w:rPr>
           <w:rStyle w:val="Strong"/>
+          <w:sz w:val="28"/>
+          <w:szCs w:val="28"/>
         </w:rPr>
         <w:t>Relational Operators:</w:t>
       </w:r>
       <w:r>
+        <w:rPr>
+          <w:sz w:val="28"/>
+          <w:szCs w:val="28"/>
+        </w:rPr>
         <w:t xml:space="preserve"> </w:t>
       </w:r>
       <w:r>
         <w:rPr>
           <w:rStyle w:val="HTMLCode"/>
+          <w:sz w:val="28"/>
+          <w:szCs w:val="28"/>
         </w:rPr>
         <w:t>&lt;</w:t>
       </w:r>
       <w:r>
+        <w:rPr>
+          <w:sz w:val="28"/>
+          <w:szCs w:val="28"/>
+        </w:rPr>
         <w:t xml:space="preserve">, </w:t>
       </w:r>
       <w:r>
         <w:rPr>
           <w:rStyle w:val="HTMLCode"/>
+          <w:sz w:val="28"/>
+          <w:szCs w:val="28"/>
         </w:rPr>
         <w:t>&gt;</w:t>
       </w:r>
       <w:r>
+        <w:rPr>
+          <w:sz w:val="28"/>
+          <w:szCs w:val="28"/>
+        </w:rPr>
         <w:t xml:space="preserve">, </w:t>
       </w:r>
       <w:r>
         <w:rPr>
           <w:rStyle w:val="HTMLCode"/>
+          <w:sz w:val="28"/>
+          <w:szCs w:val="28"/>
         </w:rPr>
         <w:t>&lt;=</w:t>
       </w:r>
       <w:r>
+        <w:rPr>
+          <w:sz w:val="28"/>
+          <w:szCs w:val="28"/>
+        </w:rPr>
         <w:t xml:space="preserve">, </w:t>
       </w:r>
       <w:r>
         <w:rPr>
           <w:rStyle w:val="HTMLCode"/>
+          <w:sz w:val="28"/>
+          <w:szCs w:val="28"/>
         </w:rPr>
         <w:t>&gt;=</w:t>
       </w:r>
@@ -7989,19 +8195,31 @@
           <w:ilvl w:val="0"/>
           <w:numId w:val="23"/>
         </w:numPr>
+        <w:rPr>
+          <w:sz w:val="28"/>
+          <w:szCs w:val="28"/>
+        </w:rPr>
       </w:pPr>
       <w:r>
         <w:rPr>
           <w:rStyle w:val="Strong"/>
+          <w:sz w:val="28"/>
+          <w:szCs w:val="28"/>
         </w:rPr>
         <w:t>Concatenation Operator:</w:t>
       </w:r>
       <w:r>
+        <w:rPr>
+          <w:sz w:val="28"/>
+          <w:szCs w:val="28"/>
+        </w:rPr>
         <w:t xml:space="preserve"> </w:t>
       </w:r>
       <w:r>
         <w:rPr>
           <w:rStyle w:val="HTMLCode"/>
+          <w:sz w:val="28"/>
+          <w:szCs w:val="28"/>
         </w:rPr>
         <w:t>||</w:t>
       </w:r>
@@ -8013,37 +8231,61 @@
           <w:ilvl w:val="0"/>
           <w:numId w:val="23"/>
         </w:numPr>
+        <w:rPr>
+          <w:sz w:val="28"/>
+          <w:szCs w:val="28"/>
+        </w:rPr>
       </w:pPr>
       <w:r>
         <w:rPr>
           <w:rStyle w:val="Strong"/>
+          <w:sz w:val="28"/>
+          <w:szCs w:val="28"/>
         </w:rPr>
         <w:t>Logical Operators:</w:t>
       </w:r>
       <w:r>
+        <w:rPr>
+          <w:sz w:val="28"/>
+          <w:szCs w:val="28"/>
+        </w:rPr>
         <w:t xml:space="preserve"> </w:t>
       </w:r>
       <w:r>
         <w:rPr>
           <w:rStyle w:val="HTMLCode"/>
+          <w:sz w:val="28"/>
+          <w:szCs w:val="28"/>
         </w:rPr>
         <w:t>AND</w:t>
       </w:r>
       <w:r>
+        <w:rPr>
+          <w:sz w:val="28"/>
+          <w:szCs w:val="28"/>
+        </w:rPr>
         <w:t xml:space="preserve">, </w:t>
       </w:r>
       <w:r>
         <w:rPr>
           <w:rStyle w:val="HTMLCode"/>
+          <w:sz w:val="28"/>
+          <w:szCs w:val="28"/>
         </w:rPr>
         <w:t>OR</w:t>
       </w:r>
       <w:r>
+        <w:rPr>
+          <w:sz w:val="28"/>
+          <w:szCs w:val="28"/>
+        </w:rPr>
         <w:t xml:space="preserve">, </w:t>
       </w:r>
       <w:r>
         <w:rPr>
           <w:rStyle w:val="HTMLCode"/>
+          <w:sz w:val="28"/>
+          <w:szCs w:val="28"/>
         </w:rPr>
         <w:t>NOT</w:t>
       </w:r>
@@ -8055,82 +8297,136 @@
           <w:ilvl w:val="0"/>
           <w:numId w:val="23"/>
         </w:numPr>
+        <w:rPr>
+          <w:sz w:val="28"/>
+          <w:szCs w:val="28"/>
+        </w:rPr>
       </w:pPr>
       <w:r>
         <w:rPr>
           <w:rStyle w:val="Strong"/>
+          <w:sz w:val="28"/>
+          <w:szCs w:val="28"/>
         </w:rPr>
         <w:t>Special Operators:</w:t>
       </w:r>
       <w:r>
+        <w:rPr>
+          <w:sz w:val="28"/>
+          <w:szCs w:val="28"/>
+        </w:rPr>
         <w:t xml:space="preserve"> </w:t>
       </w:r>
       <w:r>
         <w:rPr>
           <w:rStyle w:val="HTMLCode"/>
+          <w:sz w:val="28"/>
+          <w:szCs w:val="28"/>
         </w:rPr>
         <w:t>IN</w:t>
       </w:r>
       <w:r>
+        <w:rPr>
+          <w:sz w:val="28"/>
+          <w:szCs w:val="28"/>
+        </w:rPr>
         <w:t xml:space="preserve">, </w:t>
       </w:r>
       <w:r>
         <w:rPr>
           <w:rStyle w:val="HTMLCode"/>
+          <w:sz w:val="28"/>
+          <w:szCs w:val="28"/>
         </w:rPr>
         <w:t>NOT IN</w:t>
       </w:r>
       <w:r>
+        <w:rPr>
+          <w:sz w:val="28"/>
+          <w:szCs w:val="28"/>
+        </w:rPr>
         <w:t xml:space="preserve">, </w:t>
       </w:r>
       <w:r>
         <w:rPr>
           <w:rStyle w:val="HTMLCode"/>
+          <w:sz w:val="28"/>
+          <w:szCs w:val="28"/>
         </w:rPr>
         <w:t>BETWEEN</w:t>
       </w:r>
       <w:r>
+        <w:rPr>
+          <w:sz w:val="28"/>
+          <w:szCs w:val="28"/>
+        </w:rPr>
         <w:t xml:space="preserve">, </w:t>
       </w:r>
       <w:r>
         <w:rPr>
           <w:rStyle w:val="HTMLCode"/>
+          <w:sz w:val="28"/>
+          <w:szCs w:val="28"/>
         </w:rPr>
         <w:t>NOT BETWEEN</w:t>
       </w:r>
       <w:r>
+        <w:rPr>
+          <w:sz w:val="28"/>
+          <w:szCs w:val="28"/>
+        </w:rPr>
         <w:t xml:space="preserve">, </w:t>
       </w:r>
       <w:r>
         <w:rPr>
           <w:rStyle w:val="HTMLCode"/>
+          <w:sz w:val="28"/>
+          <w:szCs w:val="28"/>
         </w:rPr>
         <w:t>IS</w:t>
       </w:r>
       <w:r>
+        <w:rPr>
+          <w:sz w:val="28"/>
+          <w:szCs w:val="28"/>
+        </w:rPr>
         <w:t xml:space="preserve">, </w:t>
       </w:r>
       <w:r>
         <w:rPr>
           <w:rStyle w:val="HTMLCode"/>
+          <w:sz w:val="28"/>
+          <w:szCs w:val="28"/>
         </w:rPr>
         <w:t>IS NOT</w:t>
       </w:r>
       <w:r>
+        <w:rPr>
+          <w:sz w:val="28"/>
+          <w:szCs w:val="28"/>
+        </w:rPr>
         <w:t xml:space="preserve">, </w:t>
       </w:r>
       <w:r>
         <w:rPr>
           <w:rStyle w:val="HTMLCode"/>
+          <w:sz w:val="28"/>
+          <w:szCs w:val="28"/>
         </w:rPr>
         <w:t>LIKE</w:t>
       </w:r>
       <w:r>
+        <w:rPr>
+          <w:sz w:val="28"/>
+          <w:szCs w:val="28"/>
+        </w:rPr>
         <w:t xml:space="preserve">, </w:t>
       </w:r>
       <w:r>
         <w:rPr>
           <w:rStyle w:val="HTMLCode"/>
+          <w:sz w:val="28"/>
+          <w:szCs w:val="28"/>
         </w:rPr>
         <w:t>NOT LIKE</w:t>
       </w:r>
@@ -8142,62 +8438,94 @@
           <w:ilvl w:val="0"/>
           <w:numId w:val="23"/>
         </w:numPr>
+        <w:rPr>
+          <w:sz w:val="28"/>
+          <w:szCs w:val="28"/>
+        </w:rPr>
       </w:pPr>
       <w:r>
         <w:rPr>
           <w:rStyle w:val="Strong"/>
+          <w:sz w:val="28"/>
+          <w:szCs w:val="28"/>
         </w:rPr>
         <w:t>Subquery Operators:</w:t>
       </w:r>
       <w:r>
+        <w:rPr>
+          <w:sz w:val="28"/>
+          <w:szCs w:val="28"/>
+        </w:rPr>
         <w:t xml:space="preserve"> </w:t>
       </w:r>
       <w:r>
         <w:rPr>
           <w:rStyle w:val="HTMLCode"/>
+          <w:sz w:val="28"/>
+          <w:szCs w:val="28"/>
         </w:rPr>
         <w:t>ALL</w:t>
       </w:r>
       <w:r>
+        <w:rPr>
+          <w:sz w:val="28"/>
+          <w:szCs w:val="28"/>
+        </w:rPr>
         <w:t xml:space="preserve">, </w:t>
       </w:r>
       <w:r>
         <w:rPr>
           <w:rStyle w:val="HTMLCode"/>
+          <w:sz w:val="28"/>
+          <w:szCs w:val="28"/>
         </w:rPr>
         <w:t>ANY</w:t>
       </w:r>
       <w:r>
+        <w:rPr>
+          <w:sz w:val="28"/>
+          <w:szCs w:val="28"/>
+        </w:rPr>
         <w:t xml:space="preserve">, </w:t>
       </w:r>
       <w:r>
         <w:rPr>
           <w:rStyle w:val="HTMLCode"/>
+          <w:sz w:val="28"/>
+          <w:szCs w:val="28"/>
         </w:rPr>
         <w:t>EXISTS</w:t>
       </w:r>
       <w:r>
+        <w:rPr>
+          <w:sz w:val="28"/>
+          <w:szCs w:val="28"/>
+        </w:rPr>
         <w:t xml:space="preserve">, </w:t>
       </w:r>
       <w:r>
         <w:rPr>
           <w:rStyle w:val="HTMLCode"/>
+          <w:sz w:val="28"/>
+          <w:szCs w:val="28"/>
         </w:rPr>
         <w:t>NOT EXISTS</w:t>
       </w:r>
     </w:p>
-    <w:p>
-      <w:r>
-        <w:pict w14:anchorId="09E72764">
-          <v:rect id="_x0000_i1071" style="width:0;height:1.5pt" o:hralign="center" o:hrstd="t" o:hr="t" fillcolor="#a0a0a0" stroked="f"/>
-        </w:pict>
-      </w:r>
-    </w:p>
+    <w:p/>
     <w:p>
       <w:pPr>
         <w:pStyle w:val="Heading2"/>
-      </w:pPr>
-      <w:r>
+        <w:rPr>
+          <w:b/>
+          <w:bCs/>
+        </w:rPr>
+      </w:pPr>
+      <w:r>
+        <w:rPr>
+          <w:b/>
+          <w:bCs/>
+        </w:rPr>
         <w:t>Concatenation Operator</w:t>
       </w:r>
     </w:p>
@@ -8295,13 +8623,7 @@
       </w:r>
       <w:proofErr w:type="gramEnd"/>
     </w:p>
-    <w:p>
-      <w:r>
-        <w:pict w14:anchorId="03DEDCD5">
-          <v:rect id="_x0000_i1072" style="width:0;height:1.5pt" o:hralign="center" o:hrstd="t" o:hr="t" fillcolor="#a0a0a0" stroked="f"/>
-        </w:pict>
-      </w:r>
-    </w:p>
+    <w:p/>
     <w:p>
       <w:pPr>
         <w:pStyle w:val="Heading1"/>
@@ -8527,6 +8849,7 @@
         </w:numPr>
       </w:pPr>
       <w:r>
+        <w:lastRenderedPageBreak/>
         <w:t xml:space="preserve">Used to </w:t>
       </w:r>
       <w:r>
@@ -8561,13 +8884,7 @@
       </w:r>
       <w:proofErr w:type="gramEnd"/>
     </w:p>
-    <w:p>
-      <w:r>
-        <w:pict w14:anchorId="17CA7F05">
-          <v:rect id="_x0000_i1073" style="width:0;height:1.5pt" o:hralign="center" o:hrstd="t" o:hr="t" fillcolor="#a0a0a0" stroked="f"/>
-        </w:pict>
-      </w:r>
-    </w:p>
+    <w:p/>
     <w:p>
       <w:pPr>
         <w:pStyle w:val="Heading1"/>
@@ -8582,7 +8899,6 @@
           <w:b/>
           <w:bCs/>
         </w:rPr>
-        <w:lastRenderedPageBreak/>
         <w:t>Special Operators</w:t>
       </w:r>
     </w:p>
@@ -8706,13 +9022,7 @@
       </w:r>
       <w:proofErr w:type="gramEnd"/>
     </w:p>
-    <w:p>
-      <w:r>
-        <w:pict w14:anchorId="4E7799AA">
-          <v:rect id="_x0000_i1074" style="width:0;height:1.5pt" o:hralign="center" o:hrstd="t" o:hr="t" fillcolor="#a0a0a0" stroked="f"/>
-        </w:pict>
-      </w:r>
-    </w:p>
+    <w:p/>
     <w:p>
       <w:pPr>
         <w:pStyle w:val="Heading2"/>
@@ -8804,13 +9114,7 @@
       </w:r>
       <w:proofErr w:type="gramEnd"/>
     </w:p>
-    <w:p>
-      <w:r>
-        <w:pict w14:anchorId="5D4EE719">
-          <v:rect id="_x0000_i1075" style="width:0;height:1.5pt" o:hralign="center" o:hrstd="t" o:hr="t" fillcolor="#a0a0a0" stroked="f"/>
-        </w:pict>
-      </w:r>
-    </w:p>
+    <w:p/>
     <w:p>
       <w:pPr>
         <w:pStyle w:val="Heading2"/>
@@ -9041,13 +9345,6 @@
       </w:r>
     </w:p>
     <w:p>
-      <w:r>
-        <w:pict w14:anchorId="370489D7">
-          <v:rect id="_x0000_i1076" style="width:0;height:1.5pt" o:hralign="center" o:hrstd="t" o:hr="t" fillcolor="#a0a0a0" stroked="f"/>
-        </w:pict>
-      </w:r>
-    </w:p>
-    <w:p>
       <w:pPr>
         <w:pStyle w:val="Heading2"/>
       </w:pPr>
@@ -9280,13 +9577,7 @@
       </w:r>
       <w:proofErr w:type="gramEnd"/>
     </w:p>
-    <w:p>
-      <w:r>
-        <w:pict w14:anchorId="6E940A88">
-          <v:rect id="_x0000_i1077" style="width:0;height:1.5pt" o:hralign="center" o:hrstd="t" o:hr="t" fillcolor="#a0a0a0" stroked="f"/>
-        </w:pict>
-      </w:r>
-    </w:p>
+    <w:p/>
     <w:p>
       <w:pPr>
         <w:pStyle w:val="Heading2"/>
@@ -9358,11 +9649,9 @@
       <w:proofErr w:type="gramEnd"/>
     </w:p>
     <w:p>
-      <w:r>
-        <w:pict w14:anchorId="4064EF3A">
-          <v:rect id="_x0000_i1078" style="width:0;height:1.5pt" o:hralign="center" o:hrstd="t" o:hr="t" fillcolor="#a0a0a0" stroked="f"/>
-        </w:pict>
-      </w:r>
+      <w:pPr>
+        <w:pStyle w:val="HTMLPreformatted"/>
+      </w:pPr>
     </w:p>
     <w:p>
       <w:pPr>
@@ -9672,83 +9961,2346 @@
         <w:rPr>
           <w:rStyle w:val="HTMLCode"/>
         </w:rPr>
+        <w:t>Col_Name</w:t>
+      </w:r>
+      <w:proofErr w:type="spellEnd"/>
+      <w:r>
+        <w:rPr>
+          <w:rStyle w:val="HTMLCode"/>
+        </w:rPr>
+        <w:t xml:space="preserve"> NOT LIKE 'pattern</w:t>
+      </w:r>
+      <w:proofErr w:type="gramStart"/>
+      <w:r>
+        <w:rPr>
+          <w:rStyle w:val="HTMLCode"/>
+        </w:rPr>
+        <w:t>';</w:t>
+      </w:r>
+      <w:proofErr w:type="gramEnd"/>
+    </w:p>
+    <w:p>
+      <w:pPr>
+        <w:rPr>
+          <w:b/>
+          <w:bCs/>
+          <w:sz w:val="28"/>
+          <w:szCs w:val="28"/>
+        </w:rPr>
+      </w:pPr>
+    </w:p>
+    <w:p>
+      <w:pPr>
+        <w:jc w:val="center"/>
+        <w:rPr>
+          <w:b/>
+          <w:bCs/>
+          <w:sz w:val="28"/>
+          <w:szCs w:val="28"/>
+          <w:u w:val="single"/>
+        </w:rPr>
+      </w:pPr>
+      <w:r>
+        <w:rPr>
+          <w:b/>
+          <w:bCs/>
+          <w:sz w:val="28"/>
+          <w:szCs w:val="28"/>
+          <w:u w:val="single"/>
+        </w:rPr>
+        <w:t>2</w:t>
+      </w:r>
+      <w:r>
+        <w:rPr>
+          <w:b/>
+          <w:bCs/>
+          <w:sz w:val="28"/>
+          <w:szCs w:val="28"/>
+          <w:u w:val="single"/>
+          <w:vertAlign w:val="superscript"/>
+        </w:rPr>
+        <w:t>nd</w:t>
+      </w:r>
+      <w:r>
+        <w:rPr>
+          <w:b/>
+          <w:bCs/>
+          <w:sz w:val="28"/>
+          <w:szCs w:val="28"/>
+          <w:u w:val="single"/>
+        </w:rPr>
+        <w:t xml:space="preserve"> September Notes</w:t>
+      </w:r>
+    </w:p>
+    <w:p>
+      <w:pPr>
+        <w:ind w:firstLine="720"/>
+        <w:rPr>
+          <w:sz w:val="28"/>
+          <w:szCs w:val="28"/>
+        </w:rPr>
+      </w:pPr>
+      <w:r>
+        <w:rPr>
+          <w:b/>
+          <w:bCs/>
+          <w:sz w:val="28"/>
+          <w:szCs w:val="28"/>
+        </w:rPr>
+        <w:t xml:space="preserve">FUNCTION: </w:t>
+      </w:r>
+      <w:r>
+        <w:rPr>
+          <w:sz w:val="28"/>
+          <w:szCs w:val="28"/>
+        </w:rPr>
+        <w:t>Functions</w:t>
+      </w:r>
+      <w:r>
+        <w:rPr>
+          <w:sz w:val="28"/>
+          <w:szCs w:val="28"/>
+        </w:rPr>
+        <w:t xml:space="preserve"> </w:t>
+      </w:r>
+      <w:r>
+        <w:rPr>
+          <w:sz w:val="28"/>
+          <w:szCs w:val="28"/>
+        </w:rPr>
+        <w:t>are a block of code or set of instructions which are used to perform specific task.</w:t>
+      </w:r>
+    </w:p>
+    <w:p>
+      <w:pPr>
+        <w:rPr>
+          <w:sz w:val="28"/>
+          <w:szCs w:val="28"/>
+        </w:rPr>
+      </w:pPr>
+      <w:r>
+        <w:rPr>
+          <w:sz w:val="28"/>
+          <w:szCs w:val="28"/>
+        </w:rPr>
+        <w:t>There are two types of functions:</w:t>
+      </w:r>
+    </w:p>
+    <w:p>
+      <w:pPr>
+        <w:pStyle w:val="ListParagraph"/>
+        <w:numPr>
+          <w:ilvl w:val="0"/>
+          <w:numId w:val="39"/>
+        </w:numPr>
+        <w:rPr>
+          <w:sz w:val="28"/>
+          <w:szCs w:val="28"/>
+        </w:rPr>
+      </w:pPr>
+      <w:r>
+        <w:rPr>
+          <w:sz w:val="28"/>
+          <w:szCs w:val="28"/>
+        </w:rPr>
+        <w:t>User Defined Functions.</w:t>
+      </w:r>
+    </w:p>
+    <w:p>
+      <w:pPr>
+        <w:pStyle w:val="ListParagraph"/>
+        <w:numPr>
+          <w:ilvl w:val="0"/>
+          <w:numId w:val="39"/>
+        </w:numPr>
+        <w:rPr>
+          <w:sz w:val="28"/>
+          <w:szCs w:val="28"/>
+        </w:rPr>
+      </w:pPr>
+      <w:r>
+        <w:rPr>
+          <w:sz w:val="28"/>
+          <w:szCs w:val="28"/>
+        </w:rPr>
+        <w:t>Pre-defined/Built-In Functions.</w:t>
+      </w:r>
+    </w:p>
+    <w:p>
+      <w:pPr>
+        <w:pStyle w:val="ListParagraph"/>
+        <w:numPr>
+          <w:ilvl w:val="1"/>
+          <w:numId w:val="39"/>
+        </w:numPr>
+        <w:rPr>
+          <w:sz w:val="28"/>
+          <w:szCs w:val="28"/>
+        </w:rPr>
+      </w:pPr>
+      <w:r>
+        <w:rPr>
+          <w:sz w:val="28"/>
+          <w:szCs w:val="28"/>
+        </w:rPr>
+        <w:t>SRF</w:t>
+      </w:r>
+      <w:r>
+        <w:rPr>
+          <w:sz w:val="28"/>
+          <w:szCs w:val="28"/>
+        </w:rPr>
+        <w:t>: Single Row Functions.</w:t>
+      </w:r>
+    </w:p>
+    <w:p>
+      <w:pPr>
+        <w:pStyle w:val="ListParagraph"/>
+        <w:numPr>
+          <w:ilvl w:val="1"/>
+          <w:numId w:val="39"/>
+        </w:numPr>
+        <w:rPr>
+          <w:sz w:val="28"/>
+          <w:szCs w:val="28"/>
+        </w:rPr>
+      </w:pPr>
+      <w:r>
+        <w:rPr>
+          <w:sz w:val="28"/>
+          <w:szCs w:val="28"/>
+        </w:rPr>
+        <w:t>MRF</w:t>
+      </w:r>
+      <w:r>
+        <w:rPr>
+          <w:sz w:val="28"/>
+          <w:szCs w:val="28"/>
+        </w:rPr>
+        <w:t>: Multiple Row Functions.</w:t>
+      </w:r>
+    </w:p>
+    <w:p>
+      <w:pPr>
+        <w:rPr>
+          <w:b/>
+          <w:bCs/>
+          <w:sz w:val="28"/>
+          <w:szCs w:val="28"/>
+        </w:rPr>
+      </w:pPr>
+      <w:r>
+        <w:rPr>
+          <w:b/>
+          <w:bCs/>
+          <w:sz w:val="28"/>
+          <w:szCs w:val="28"/>
+        </w:rPr>
+        <w:t>Types of Functions in SQL:</w:t>
+      </w:r>
+    </w:p>
+    <w:p>
+      <w:pPr>
+        <w:pStyle w:val="ListParagraph"/>
+        <w:numPr>
+          <w:ilvl w:val="0"/>
+          <w:numId w:val="40"/>
+        </w:numPr>
+        <w:rPr>
+          <w:sz w:val="28"/>
+          <w:szCs w:val="28"/>
+          <w:u w:val="single"/>
+        </w:rPr>
+      </w:pPr>
+      <w:r>
+        <w:rPr>
+          <w:sz w:val="28"/>
+          <w:szCs w:val="28"/>
+          <w:u w:val="single"/>
+        </w:rPr>
+        <w:t>Single Row Functions (SRF):</w:t>
+      </w:r>
+      <w:r>
+        <w:rPr>
+          <w:sz w:val="28"/>
+          <w:szCs w:val="28"/>
+          <w:u w:val="single"/>
+        </w:rPr>
+        <w:t xml:space="preserve"> </w:t>
+      </w:r>
+    </w:p>
+    <w:p>
+      <w:pPr>
+        <w:pStyle w:val="ListParagraph"/>
+        <w:numPr>
+          <w:ilvl w:val="0"/>
+          <w:numId w:val="40"/>
+        </w:numPr>
+        <w:rPr>
+          <w:sz w:val="28"/>
+          <w:szCs w:val="28"/>
+          <w:u w:val="single"/>
+        </w:rPr>
+      </w:pPr>
+      <w:r>
+        <w:rPr>
+          <w:sz w:val="28"/>
+          <w:szCs w:val="28"/>
+          <w:u w:val="single"/>
+        </w:rPr>
+        <w:t>Multi Row Function (MRF):</w:t>
+      </w:r>
+      <w:r>
+        <w:rPr>
+          <w:sz w:val="28"/>
+          <w:szCs w:val="28"/>
+        </w:rPr>
+        <w:t xml:space="preserve"> </w:t>
+      </w:r>
+    </w:p>
+    <w:p>
+      <w:pPr>
+        <w:pStyle w:val="ListParagraph"/>
+        <w:numPr>
+          <w:ilvl w:val="1"/>
+          <w:numId w:val="40"/>
+        </w:numPr>
+        <w:rPr>
+          <w:sz w:val="28"/>
+          <w:szCs w:val="28"/>
+          <w:u w:val="single"/>
+        </w:rPr>
+      </w:pPr>
+      <w:r>
+        <w:rPr>
+          <w:sz w:val="28"/>
+          <w:szCs w:val="28"/>
+        </w:rPr>
+        <w:t xml:space="preserve">It takes all the input at one shot and then executes and provides a single output. </w:t>
+      </w:r>
+    </w:p>
+    <w:p>
+      <w:pPr>
+        <w:pStyle w:val="ListParagraph"/>
+        <w:numPr>
+          <w:ilvl w:val="1"/>
+          <w:numId w:val="40"/>
+        </w:numPr>
+        <w:rPr>
+          <w:sz w:val="28"/>
+          <w:szCs w:val="28"/>
+          <w:u w:val="single"/>
+        </w:rPr>
+      </w:pPr>
+      <w:r>
+        <w:rPr>
+          <w:sz w:val="28"/>
+          <w:szCs w:val="28"/>
+        </w:rPr>
+        <w:t>If we pass ‘n’ number of inputs to a MRF it returns one output.</w:t>
+      </w:r>
+    </w:p>
+    <w:p>
+      <w:pPr>
+        <w:pStyle w:val="ListParagraph"/>
+        <w:numPr>
+          <w:ilvl w:val="1"/>
+          <w:numId w:val="40"/>
+        </w:numPr>
+        <w:rPr>
+          <w:sz w:val="28"/>
+          <w:szCs w:val="28"/>
+          <w:u w:val="single"/>
+        </w:rPr>
+      </w:pPr>
+      <w:r>
+        <w:rPr>
+          <w:sz w:val="28"/>
+          <w:szCs w:val="28"/>
+        </w:rPr>
+        <w:t>It’s aka group function or aggregate function.</w:t>
+      </w:r>
+    </w:p>
+    <w:p>
+      <w:pPr>
+        <w:rPr>
+          <w:b/>
+          <w:bCs/>
+          <w:sz w:val="28"/>
+          <w:szCs w:val="28"/>
+          <w:u w:val="single"/>
+        </w:rPr>
+      </w:pPr>
+      <w:r>
+        <w:rPr>
+          <w:b/>
+          <w:bCs/>
+          <w:sz w:val="28"/>
+          <w:szCs w:val="28"/>
+          <w:u w:val="single"/>
+        </w:rPr>
+        <w:t>List of Multi Row Functions:</w:t>
+      </w:r>
+      <w:r>
+        <w:rPr>
+          <w:b/>
+          <w:bCs/>
+          <w:sz w:val="28"/>
+          <w:szCs w:val="28"/>
+          <w:u w:val="single"/>
+        </w:rPr>
+        <w:t xml:space="preserve"> </w:t>
+      </w:r>
+    </w:p>
+    <w:p>
+      <w:pPr>
+        <w:pStyle w:val="ListParagraph"/>
+        <w:numPr>
+          <w:ilvl w:val="0"/>
+          <w:numId w:val="41"/>
+        </w:numPr>
+        <w:rPr>
+          <w:b/>
+          <w:bCs/>
+          <w:sz w:val="28"/>
+          <w:szCs w:val="28"/>
+          <w:u w:val="single"/>
+        </w:rPr>
+      </w:pPr>
+      <w:proofErr w:type="gramStart"/>
+      <w:r>
+        <w:rPr>
+          <w:b/>
+          <w:bCs/>
+          <w:sz w:val="28"/>
+          <w:szCs w:val="28"/>
+          <w:u w:val="single"/>
+        </w:rPr>
+        <w:t>MAX</w:t>
+      </w:r>
+      <w:r>
+        <w:rPr>
+          <w:b/>
+          <w:bCs/>
+          <w:sz w:val="28"/>
+          <w:szCs w:val="28"/>
+        </w:rPr>
+        <w:t>(</w:t>
+      </w:r>
+      <w:proofErr w:type="gramEnd"/>
+      <w:r>
+        <w:rPr>
+          <w:b/>
+          <w:bCs/>
+          <w:sz w:val="28"/>
+          <w:szCs w:val="28"/>
+        </w:rPr>
+        <w:t>)</w:t>
+      </w:r>
+      <w:r>
+        <w:rPr>
+          <w:b/>
+          <w:bCs/>
+          <w:sz w:val="28"/>
+          <w:szCs w:val="28"/>
+        </w:rPr>
+        <w:t xml:space="preserve">: </w:t>
+      </w:r>
+      <w:r>
+        <w:rPr>
+          <w:sz w:val="28"/>
+          <w:szCs w:val="28"/>
+        </w:rPr>
+        <w:t>It is used to obtain the maximum value present in a column.</w:t>
+      </w:r>
+    </w:p>
+    <w:p>
+      <w:pPr>
+        <w:pStyle w:val="ListParagraph"/>
+        <w:numPr>
+          <w:ilvl w:val="0"/>
+          <w:numId w:val="41"/>
+        </w:numPr>
+        <w:rPr>
+          <w:b/>
+          <w:bCs/>
+          <w:sz w:val="28"/>
+          <w:szCs w:val="28"/>
+          <w:u w:val="single"/>
+        </w:rPr>
+      </w:pPr>
+      <w:proofErr w:type="gramStart"/>
+      <w:r>
+        <w:rPr>
+          <w:b/>
+          <w:bCs/>
+          <w:sz w:val="28"/>
+          <w:szCs w:val="28"/>
+          <w:u w:val="single"/>
+        </w:rPr>
+        <w:t>MIN</w:t>
+      </w:r>
+      <w:r>
+        <w:rPr>
+          <w:sz w:val="28"/>
+          <w:szCs w:val="28"/>
+        </w:rPr>
+        <w:t>(</w:t>
+      </w:r>
+      <w:proofErr w:type="gramEnd"/>
+      <w:r>
+        <w:rPr>
+          <w:sz w:val="28"/>
+          <w:szCs w:val="28"/>
+        </w:rPr>
+        <w:t>): It is used to obtain the minimum value present in a column.</w:t>
+      </w:r>
+    </w:p>
+    <w:p>
+      <w:pPr>
+        <w:pStyle w:val="ListParagraph"/>
+        <w:numPr>
+          <w:ilvl w:val="0"/>
+          <w:numId w:val="41"/>
+        </w:numPr>
+        <w:rPr>
+          <w:b/>
+          <w:bCs/>
+          <w:sz w:val="28"/>
+          <w:szCs w:val="28"/>
+          <w:u w:val="single"/>
+        </w:rPr>
+      </w:pPr>
+      <w:proofErr w:type="gramStart"/>
+      <w:r>
+        <w:rPr>
+          <w:b/>
+          <w:bCs/>
+          <w:sz w:val="28"/>
+          <w:szCs w:val="28"/>
+          <w:u w:val="single"/>
+        </w:rPr>
+        <w:t>SUM</w:t>
+      </w:r>
+      <w:r>
+        <w:rPr>
+          <w:b/>
+          <w:bCs/>
+          <w:sz w:val="28"/>
+          <w:szCs w:val="28"/>
+        </w:rPr>
+        <w:t>(</w:t>
+      </w:r>
+      <w:proofErr w:type="gramEnd"/>
+      <w:r>
+        <w:rPr>
+          <w:b/>
+          <w:bCs/>
+          <w:sz w:val="28"/>
+          <w:szCs w:val="28"/>
+        </w:rPr>
+        <w:t xml:space="preserve">): </w:t>
+      </w:r>
+      <w:r>
+        <w:rPr>
+          <w:sz w:val="28"/>
+          <w:szCs w:val="28"/>
+        </w:rPr>
+        <w:t>It is used to obtain the summation of values present in a column.</w:t>
+      </w:r>
+    </w:p>
+    <w:p>
+      <w:pPr>
+        <w:pStyle w:val="ListParagraph"/>
+        <w:numPr>
+          <w:ilvl w:val="0"/>
+          <w:numId w:val="41"/>
+        </w:numPr>
+        <w:rPr>
+          <w:b/>
+          <w:bCs/>
+          <w:sz w:val="28"/>
+          <w:szCs w:val="28"/>
+        </w:rPr>
+      </w:pPr>
+      <w:proofErr w:type="gramStart"/>
+      <w:r>
+        <w:rPr>
+          <w:b/>
+          <w:bCs/>
+          <w:sz w:val="28"/>
+          <w:szCs w:val="28"/>
+          <w:u w:val="single"/>
+        </w:rPr>
+        <w:t>AVG</w:t>
+      </w:r>
+      <w:r>
+        <w:rPr>
+          <w:sz w:val="28"/>
+          <w:szCs w:val="28"/>
+        </w:rPr>
+        <w:t>(</w:t>
+      </w:r>
+      <w:proofErr w:type="gramEnd"/>
+      <w:r>
+        <w:rPr>
+          <w:sz w:val="28"/>
+          <w:szCs w:val="28"/>
+        </w:rPr>
+        <w:t>): It is used to obtain the average of values present in a column.</w:t>
+      </w:r>
+    </w:p>
+    <w:p>
+      <w:pPr>
+        <w:pStyle w:val="ListParagraph"/>
+        <w:numPr>
+          <w:ilvl w:val="0"/>
+          <w:numId w:val="41"/>
+        </w:numPr>
+        <w:rPr>
+          <w:b/>
+          <w:bCs/>
+          <w:sz w:val="28"/>
+          <w:szCs w:val="28"/>
+          <w:u w:val="single"/>
+        </w:rPr>
+      </w:pPr>
+      <w:proofErr w:type="gramStart"/>
+      <w:r>
+        <w:rPr>
+          <w:b/>
+          <w:bCs/>
+          <w:sz w:val="28"/>
+          <w:szCs w:val="28"/>
+        </w:rPr>
+        <w:t>COUNT</w:t>
+      </w:r>
+      <w:r>
+        <w:rPr>
+          <w:sz w:val="28"/>
+          <w:szCs w:val="28"/>
+        </w:rPr>
+        <w:t>(</w:t>
+      </w:r>
+      <w:proofErr w:type="gramEnd"/>
+      <w:r>
+        <w:rPr>
+          <w:sz w:val="28"/>
+          <w:szCs w:val="28"/>
+        </w:rPr>
+        <w:t>): It is used to obtain the number of values present in a column.</w:t>
+      </w:r>
+    </w:p>
+    <w:p>
+      <w:pPr>
+        <w:rPr>
+          <w:sz w:val="28"/>
+          <w:szCs w:val="28"/>
+        </w:rPr>
+      </w:pPr>
+      <w:r>
+        <w:rPr>
+          <w:b/>
+          <w:bCs/>
+          <w:sz w:val="28"/>
+          <w:szCs w:val="28"/>
+          <w:u w:val="single"/>
+        </w:rPr>
+        <w:t xml:space="preserve">NOTE: </w:t>
+      </w:r>
+    </w:p>
+    <w:p>
+      <w:pPr>
+        <w:pStyle w:val="ListParagraph"/>
+        <w:numPr>
+          <w:ilvl w:val="0"/>
+          <w:numId w:val="42"/>
+        </w:numPr>
+        <w:rPr>
+          <w:sz w:val="28"/>
+          <w:szCs w:val="28"/>
+        </w:rPr>
+      </w:pPr>
+      <w:r>
+        <w:rPr>
+          <w:b/>
+          <w:bCs/>
+          <w:sz w:val="28"/>
+          <w:szCs w:val="28"/>
+        </w:rPr>
+        <w:t xml:space="preserve">MRF </w:t>
+      </w:r>
+      <w:r>
+        <w:rPr>
+          <w:sz w:val="28"/>
+          <w:szCs w:val="28"/>
+        </w:rPr>
+        <w:t xml:space="preserve">can accept only one argument. </w:t>
+      </w:r>
+      <w:proofErr w:type="gramStart"/>
+      <w:r>
+        <w:rPr>
+          <w:sz w:val="28"/>
+          <w:szCs w:val="28"/>
+        </w:rPr>
+        <w:t>i.e.</w:t>
+      </w:r>
+      <w:proofErr w:type="gramEnd"/>
+      <w:r>
+        <w:rPr>
+          <w:sz w:val="28"/>
+          <w:szCs w:val="28"/>
+        </w:rPr>
+        <w:t xml:space="preserve"> MRF(</w:t>
+      </w:r>
+      <w:proofErr w:type="spellStart"/>
+      <w:r>
+        <w:rPr>
+          <w:sz w:val="28"/>
+          <w:szCs w:val="28"/>
+        </w:rPr>
+        <w:t>Col_Name</w:t>
+      </w:r>
+      <w:proofErr w:type="spellEnd"/>
+      <w:r>
+        <w:rPr>
+          <w:sz w:val="28"/>
+          <w:szCs w:val="28"/>
+        </w:rPr>
+        <w:t>/Expression)</w:t>
+      </w:r>
+      <w:r>
+        <w:rPr>
+          <w:sz w:val="28"/>
+          <w:szCs w:val="28"/>
+        </w:rPr>
+        <w:t xml:space="preserve">. </w:t>
+      </w:r>
+    </w:p>
+    <w:p>
+      <w:pPr>
+        <w:pStyle w:val="ListParagraph"/>
+        <w:numPr>
+          <w:ilvl w:val="0"/>
+          <w:numId w:val="42"/>
+        </w:numPr>
+        <w:rPr>
+          <w:sz w:val="28"/>
+          <w:szCs w:val="28"/>
+        </w:rPr>
+      </w:pPr>
+      <w:r>
+        <w:rPr>
+          <w:sz w:val="28"/>
+          <w:szCs w:val="28"/>
+        </w:rPr>
+        <w:t>Along with a MRF</w:t>
+      </w:r>
+      <w:r>
+        <w:rPr>
+          <w:sz w:val="28"/>
+          <w:szCs w:val="28"/>
+        </w:rPr>
+        <w:t xml:space="preserve"> </w:t>
+      </w:r>
+      <w:r>
+        <w:rPr>
+          <w:sz w:val="28"/>
+          <w:szCs w:val="28"/>
+        </w:rPr>
+        <w:t>we are not supposed to use any other column</w:t>
+      </w:r>
+      <w:r>
+        <w:rPr>
+          <w:sz w:val="28"/>
+          <w:szCs w:val="28"/>
+        </w:rPr>
+        <w:t>’</w:t>
+      </w:r>
+      <w:r>
+        <w:rPr>
+          <w:sz w:val="28"/>
+          <w:szCs w:val="28"/>
+        </w:rPr>
+        <w:t xml:space="preserve">s name in the SELECT clause. </w:t>
+      </w:r>
+    </w:p>
+    <w:p>
+      <w:pPr>
+        <w:pStyle w:val="ListParagraph"/>
+        <w:numPr>
+          <w:ilvl w:val="0"/>
+          <w:numId w:val="42"/>
+        </w:numPr>
+        <w:rPr>
+          <w:sz w:val="28"/>
+          <w:szCs w:val="28"/>
+        </w:rPr>
+      </w:pPr>
+      <w:r>
+        <w:rPr>
+          <w:sz w:val="28"/>
+          <w:szCs w:val="28"/>
+        </w:rPr>
+        <w:t>MRF ignores the NULL.</w:t>
+      </w:r>
+    </w:p>
+    <w:p>
+      <w:pPr>
+        <w:pStyle w:val="ListParagraph"/>
+        <w:numPr>
+          <w:ilvl w:val="0"/>
+          <w:numId w:val="42"/>
+        </w:numPr>
+        <w:rPr>
+          <w:sz w:val="28"/>
+          <w:szCs w:val="28"/>
+        </w:rPr>
+      </w:pPr>
+      <w:r>
+        <w:rPr>
+          <w:sz w:val="28"/>
+          <w:szCs w:val="28"/>
+        </w:rPr>
+        <w:t xml:space="preserve">We can’t use a MRF in </w:t>
+      </w:r>
+      <w:r>
+        <w:rPr>
+          <w:b/>
+          <w:bCs/>
+          <w:sz w:val="28"/>
+          <w:szCs w:val="28"/>
+        </w:rPr>
+        <w:t>WHERE</w:t>
+      </w:r>
+      <w:r>
+        <w:rPr>
+          <w:sz w:val="28"/>
+          <w:szCs w:val="28"/>
+        </w:rPr>
+        <w:t xml:space="preserve"> clause.</w:t>
+      </w:r>
+    </w:p>
+    <w:p>
+      <w:pPr>
+        <w:pStyle w:val="ListParagraph"/>
+        <w:numPr>
+          <w:ilvl w:val="0"/>
+          <w:numId w:val="42"/>
+        </w:numPr>
+        <w:rPr>
+          <w:sz w:val="28"/>
+          <w:szCs w:val="28"/>
+        </w:rPr>
+      </w:pPr>
+      <w:proofErr w:type="gramStart"/>
+      <w:r>
+        <w:rPr>
+          <w:b/>
+          <w:bCs/>
+          <w:sz w:val="28"/>
+          <w:szCs w:val="28"/>
+        </w:rPr>
+        <w:t>COUNT(</w:t>
+      </w:r>
+      <w:proofErr w:type="gramEnd"/>
+      <w:r>
+        <w:rPr>
+          <w:b/>
+          <w:bCs/>
+          <w:sz w:val="28"/>
+          <w:szCs w:val="28"/>
+        </w:rPr>
+        <w:t>)</w:t>
+      </w:r>
+      <w:r>
+        <w:rPr>
+          <w:sz w:val="28"/>
+          <w:szCs w:val="28"/>
+        </w:rPr>
+        <w:t xml:space="preserve"> is the only MRF which can accept * as an argument.</w:t>
+      </w:r>
+    </w:p>
+    <w:p>
+      <w:pPr>
+        <w:rPr>
+          <w:sz w:val="28"/>
+          <w:szCs w:val="28"/>
+        </w:rPr>
+      </w:pPr>
+      <w:r>
+        <w:rPr>
+          <w:sz w:val="28"/>
+          <w:szCs w:val="28"/>
+        </w:rPr>
+        <w:br w:type="page"/>
+      </w:r>
+    </w:p>
+    <w:p>
+      <w:pPr>
+        <w:jc w:val="center"/>
+        <w:rPr>
+          <w:b/>
+          <w:bCs/>
+          <w:sz w:val="28"/>
+          <w:szCs w:val="28"/>
+          <w:u w:val="single"/>
+        </w:rPr>
+      </w:pPr>
+      <w:r>
+        <w:rPr>
+          <w:b/>
+          <w:bCs/>
+          <w:sz w:val="28"/>
+          <w:szCs w:val="28"/>
+          <w:u w:val="single"/>
+        </w:rPr>
         <w:lastRenderedPageBreak/>
-        <w:t>Col_Name</w:t>
+        <w:t>3</w:t>
+      </w:r>
+      <w:r>
+        <w:rPr>
+          <w:b/>
+          <w:bCs/>
+          <w:sz w:val="28"/>
+          <w:szCs w:val="28"/>
+          <w:u w:val="single"/>
+          <w:vertAlign w:val="superscript"/>
+        </w:rPr>
+        <w:t>rd</w:t>
+      </w:r>
+      <w:r>
+        <w:rPr>
+          <w:b/>
+          <w:bCs/>
+          <w:sz w:val="28"/>
+          <w:szCs w:val="28"/>
+          <w:u w:val="single"/>
+        </w:rPr>
+        <w:t xml:space="preserve"> September Notes</w:t>
+      </w:r>
+    </w:p>
+    <w:p>
+      <w:pPr>
+        <w:rPr>
+          <w:sz w:val="28"/>
+          <w:szCs w:val="28"/>
+        </w:rPr>
+      </w:pPr>
+      <w:r>
+        <w:rPr>
+          <w:b/>
+          <w:bCs/>
+          <w:sz w:val="28"/>
+          <w:szCs w:val="28"/>
+          <w:u w:val="single"/>
+        </w:rPr>
+        <w:t>GROUP</w:t>
+      </w:r>
+      <w:r>
+        <w:rPr>
+          <w:b/>
+          <w:bCs/>
+          <w:sz w:val="28"/>
+          <w:szCs w:val="28"/>
+          <w:u w:val="single"/>
+        </w:rPr>
+        <w:t xml:space="preserve"> </w:t>
+      </w:r>
+      <w:r>
+        <w:rPr>
+          <w:b/>
+          <w:bCs/>
+          <w:sz w:val="28"/>
+          <w:szCs w:val="28"/>
+          <w:u w:val="single"/>
+        </w:rPr>
+        <w:t>BY CLAUSE:</w:t>
+      </w:r>
+      <w:r>
+        <w:rPr>
+          <w:b/>
+          <w:bCs/>
+          <w:sz w:val="28"/>
+          <w:szCs w:val="28"/>
+        </w:rPr>
+        <w:t xml:space="preserve"> </w:t>
+      </w:r>
+      <w:r>
+        <w:rPr>
+          <w:sz w:val="28"/>
+          <w:szCs w:val="28"/>
+        </w:rPr>
+        <w:t>Group</w:t>
+      </w:r>
+      <w:r>
+        <w:rPr>
+          <w:sz w:val="28"/>
+          <w:szCs w:val="28"/>
+        </w:rPr>
+        <w:t xml:space="preserve"> </w:t>
+      </w:r>
+      <w:r>
+        <w:rPr>
+          <w:sz w:val="28"/>
+          <w:szCs w:val="28"/>
+        </w:rPr>
+        <w:t>By is used to group the records.</w:t>
+      </w:r>
+      <w:r>
+        <w:rPr>
+          <w:sz w:val="28"/>
+          <w:szCs w:val="28"/>
+        </w:rPr>
+        <w:t xml:space="preserve"> </w:t>
+      </w:r>
+    </w:p>
+    <w:p>
+      <w:pPr>
+        <w:spacing w:line="240" w:lineRule="auto"/>
+        <w:rPr>
+          <w:rFonts w:ascii="Consolas" w:hAnsi="Consolas"/>
+          <w:sz w:val="28"/>
+          <w:szCs w:val="28"/>
+        </w:rPr>
+      </w:pPr>
+      <w:r>
+        <w:rPr>
+          <w:sz w:val="28"/>
+          <w:szCs w:val="28"/>
+        </w:rPr>
+        <w:tab/>
+      </w:r>
+      <w:r>
+        <w:rPr>
+          <w:rFonts w:ascii="Consolas" w:hAnsi="Consolas"/>
+          <w:sz w:val="28"/>
+          <w:szCs w:val="28"/>
+        </w:rPr>
+        <w:t>Syntax: SELECT GROUP BY Expression/Group Function</w:t>
+      </w:r>
+    </w:p>
+    <w:p>
+      <w:pPr>
+        <w:spacing w:line="240" w:lineRule="auto"/>
+        <w:rPr>
+          <w:rFonts w:ascii="Consolas" w:hAnsi="Consolas"/>
+          <w:sz w:val="28"/>
+          <w:szCs w:val="28"/>
+        </w:rPr>
+      </w:pPr>
+      <w:r>
+        <w:rPr>
+          <w:rFonts w:ascii="Consolas" w:hAnsi="Consolas"/>
+          <w:sz w:val="28"/>
+          <w:szCs w:val="28"/>
+        </w:rPr>
+        <w:tab/>
+        <w:t>FROM TABLE</w:t>
+      </w:r>
+    </w:p>
+    <w:p>
+      <w:pPr>
+        <w:spacing w:line="240" w:lineRule="auto"/>
+        <w:rPr>
+          <w:rFonts w:ascii="Consolas" w:hAnsi="Consolas"/>
+          <w:sz w:val="28"/>
+          <w:szCs w:val="28"/>
+        </w:rPr>
+      </w:pPr>
+      <w:r>
+        <w:rPr>
+          <w:rFonts w:ascii="Consolas" w:hAnsi="Consolas"/>
+          <w:sz w:val="28"/>
+          <w:szCs w:val="28"/>
+        </w:rPr>
+        <w:tab/>
+        <w:t>[WHERE &lt;FILTER RECORD/CONDITION&gt;]</w:t>
+      </w:r>
+    </w:p>
+    <w:p>
+      <w:pPr>
+        <w:spacing w:line="240" w:lineRule="auto"/>
+        <w:ind w:firstLine="720"/>
+        <w:rPr>
+          <w:rFonts w:ascii="Consolas" w:hAnsi="Consolas"/>
+          <w:sz w:val="28"/>
+          <w:szCs w:val="28"/>
+        </w:rPr>
+      </w:pPr>
+      <w:r>
+        <w:rPr>
+          <w:rFonts w:ascii="Consolas" w:hAnsi="Consolas"/>
+          <w:sz w:val="28"/>
+          <w:szCs w:val="28"/>
+        </w:rPr>
+        <w:t xml:space="preserve">GROUP BY </w:t>
+      </w:r>
+      <w:proofErr w:type="spellStart"/>
+      <w:r>
+        <w:rPr>
+          <w:rFonts w:ascii="Consolas" w:hAnsi="Consolas"/>
+          <w:sz w:val="28"/>
+          <w:szCs w:val="28"/>
+        </w:rPr>
+        <w:t>ColName</w:t>
       </w:r>
       <w:proofErr w:type="spellEnd"/>
       <w:r>
         <w:rPr>
-          <w:rStyle w:val="HTMLCode"/>
-        </w:rPr>
-        <w:t xml:space="preserve"> NOT LIKE 'pattern</w:t>
+          <w:rFonts w:ascii="Consolas" w:hAnsi="Consolas"/>
+          <w:sz w:val="28"/>
+          <w:szCs w:val="28"/>
+        </w:rPr>
+        <w:t>/</w:t>
+      </w:r>
+      <w:r>
+        <w:rPr>
+          <w:rFonts w:ascii="Consolas" w:hAnsi="Consolas"/>
+          <w:sz w:val="28"/>
+          <w:szCs w:val="28"/>
+        </w:rPr>
+        <w:t>Expression.</w:t>
+      </w:r>
+    </w:p>
+    <w:p>
+      <w:pPr>
+        <w:spacing w:line="240" w:lineRule="auto"/>
+        <w:rPr>
+          <w:rFonts w:ascii="Consolas" w:hAnsi="Consolas"/>
+          <w:sz w:val="28"/>
+          <w:szCs w:val="28"/>
+        </w:rPr>
+      </w:pPr>
+    </w:p>
+    <w:p>
+      <w:pPr>
+        <w:spacing w:line="240" w:lineRule="auto"/>
+        <w:rPr>
+          <w:rFonts w:ascii="Consolas" w:hAnsi="Consolas"/>
+          <w:b/>
+          <w:bCs/>
+          <w:sz w:val="28"/>
+          <w:szCs w:val="28"/>
+          <w:u w:val="single"/>
+        </w:rPr>
+      </w:pPr>
+      <w:r>
+        <w:rPr>
+          <w:rFonts w:ascii="Consolas" w:hAnsi="Consolas"/>
+          <w:b/>
+          <w:bCs/>
+          <w:sz w:val="28"/>
+          <w:szCs w:val="28"/>
+          <w:u w:val="single"/>
+        </w:rPr>
+        <w:t>Order Of Execution:</w:t>
+      </w:r>
+    </w:p>
+    <w:p>
+      <w:pPr>
+        <w:pStyle w:val="ListParagraph"/>
+        <w:numPr>
+          <w:ilvl w:val="1"/>
+          <w:numId w:val="36"/>
+        </w:numPr>
+        <w:spacing w:line="240" w:lineRule="auto"/>
+        <w:rPr>
+          <w:rFonts w:ascii="Consolas" w:hAnsi="Consolas"/>
+          <w:sz w:val="28"/>
+          <w:szCs w:val="28"/>
+        </w:rPr>
+      </w:pPr>
+      <w:r>
+        <w:rPr>
+          <w:rFonts w:ascii="Consolas" w:hAnsi="Consolas"/>
+          <w:sz w:val="28"/>
+          <w:szCs w:val="28"/>
+        </w:rPr>
+        <w:t>FROM</w:t>
+      </w:r>
+    </w:p>
+    <w:p>
+      <w:pPr>
+        <w:pStyle w:val="ListParagraph"/>
+        <w:numPr>
+          <w:ilvl w:val="1"/>
+          <w:numId w:val="36"/>
+        </w:numPr>
+        <w:spacing w:line="240" w:lineRule="auto"/>
+        <w:rPr>
+          <w:rFonts w:ascii="Consolas" w:hAnsi="Consolas"/>
+          <w:sz w:val="28"/>
+          <w:szCs w:val="28"/>
+        </w:rPr>
+      </w:pPr>
+      <w:r>
+        <w:rPr>
+          <w:rFonts w:ascii="Consolas" w:hAnsi="Consolas"/>
+          <w:sz w:val="28"/>
+          <w:szCs w:val="28"/>
+        </w:rPr>
+        <w:t>WHERE (if used) -&gt; row by row.</w:t>
+      </w:r>
+    </w:p>
+    <w:p>
+      <w:pPr>
+        <w:pStyle w:val="ListParagraph"/>
+        <w:numPr>
+          <w:ilvl w:val="1"/>
+          <w:numId w:val="36"/>
+        </w:numPr>
+        <w:spacing w:line="240" w:lineRule="auto"/>
+        <w:rPr>
+          <w:rFonts w:ascii="Consolas" w:hAnsi="Consolas"/>
+          <w:sz w:val="28"/>
+          <w:szCs w:val="28"/>
+        </w:rPr>
+      </w:pPr>
+      <w:r>
+        <w:rPr>
+          <w:rFonts w:ascii="Consolas" w:hAnsi="Consolas"/>
+          <w:sz w:val="28"/>
+          <w:szCs w:val="28"/>
+        </w:rPr>
+        <w:t>GROUP BY -&gt; row by row</w:t>
+      </w:r>
+    </w:p>
+    <w:p>
+      <w:pPr>
+        <w:pStyle w:val="ListParagraph"/>
+        <w:numPr>
+          <w:ilvl w:val="1"/>
+          <w:numId w:val="36"/>
+        </w:numPr>
+        <w:spacing w:line="240" w:lineRule="auto"/>
+        <w:rPr>
+          <w:rFonts w:ascii="Consolas" w:hAnsi="Consolas"/>
+          <w:sz w:val="28"/>
+          <w:szCs w:val="28"/>
+        </w:rPr>
+      </w:pPr>
+      <w:r>
+        <w:rPr>
+          <w:rFonts w:ascii="Consolas" w:hAnsi="Consolas"/>
+          <w:sz w:val="28"/>
+          <w:szCs w:val="28"/>
+        </w:rPr>
+        <w:t>SELECT -&gt; group by group.</w:t>
+      </w:r>
+    </w:p>
+    <w:p>
+      <w:pPr>
+        <w:spacing w:line="240" w:lineRule="auto"/>
+        <w:rPr>
+          <w:rFonts w:ascii="Consolas" w:hAnsi="Consolas"/>
+          <w:sz w:val="28"/>
+          <w:szCs w:val="28"/>
+        </w:rPr>
+      </w:pPr>
+    </w:p>
+    <w:p>
+      <w:pPr>
+        <w:spacing w:line="240" w:lineRule="auto"/>
+        <w:rPr>
+          <w:rFonts w:ascii="Consolas" w:hAnsi="Consolas"/>
+          <w:sz w:val="28"/>
+          <w:szCs w:val="28"/>
+          <w:u w:val="single"/>
+        </w:rPr>
+      </w:pPr>
+      <w:r>
+        <w:rPr>
+          <w:rFonts w:ascii="Consolas" w:hAnsi="Consolas"/>
+          <w:sz w:val="28"/>
+          <w:szCs w:val="28"/>
+          <w:u w:val="single"/>
+        </w:rPr>
+        <w:t>Note:</w:t>
+      </w:r>
+    </w:p>
+    <w:p>
+      <w:pPr>
+        <w:pStyle w:val="ListParagraph"/>
+        <w:numPr>
+          <w:ilvl w:val="0"/>
+          <w:numId w:val="43"/>
+        </w:numPr>
+        <w:spacing w:line="240" w:lineRule="auto"/>
+        <w:rPr>
+          <w:rFonts w:ascii="Consolas" w:hAnsi="Consolas"/>
+          <w:sz w:val="28"/>
+          <w:szCs w:val="28"/>
+        </w:rPr>
+      </w:pPr>
+      <w:r>
+        <w:rPr>
+          <w:rFonts w:ascii="Consolas" w:hAnsi="Consolas"/>
+          <w:b/>
+          <w:bCs/>
+          <w:sz w:val="28"/>
+          <w:szCs w:val="28"/>
+        </w:rPr>
+        <w:t>Group by</w:t>
+      </w:r>
+      <w:r>
+        <w:rPr>
+          <w:rFonts w:ascii="Consolas" w:hAnsi="Consolas"/>
+          <w:sz w:val="28"/>
+          <w:szCs w:val="28"/>
+        </w:rPr>
+        <w:t xml:space="preserve"> clause is used to group the records.</w:t>
+      </w:r>
+    </w:p>
+    <w:p>
+      <w:pPr>
+        <w:pStyle w:val="ListParagraph"/>
+        <w:numPr>
+          <w:ilvl w:val="0"/>
+          <w:numId w:val="43"/>
+        </w:numPr>
+        <w:spacing w:line="240" w:lineRule="auto"/>
+        <w:rPr>
+          <w:rFonts w:ascii="Consolas" w:hAnsi="Consolas"/>
+          <w:sz w:val="28"/>
+          <w:szCs w:val="28"/>
+        </w:rPr>
+      </w:pPr>
+      <w:r>
+        <w:rPr>
+          <w:rFonts w:ascii="Consolas" w:hAnsi="Consolas"/>
+          <w:sz w:val="28"/>
+          <w:szCs w:val="28"/>
+        </w:rPr>
+        <w:t>It executes row by row.</w:t>
+      </w:r>
+    </w:p>
+    <w:p>
+      <w:pPr>
+        <w:pStyle w:val="ListParagraph"/>
+        <w:numPr>
+          <w:ilvl w:val="0"/>
+          <w:numId w:val="43"/>
+        </w:numPr>
+        <w:spacing w:line="240" w:lineRule="auto"/>
+        <w:rPr>
+          <w:rFonts w:ascii="Consolas" w:hAnsi="Consolas"/>
+          <w:sz w:val="28"/>
+          <w:szCs w:val="28"/>
+        </w:rPr>
+      </w:pPr>
+      <w:r>
+        <w:rPr>
+          <w:rFonts w:ascii="Consolas" w:hAnsi="Consolas"/>
+          <w:sz w:val="28"/>
+          <w:szCs w:val="28"/>
+        </w:rPr>
+        <w:t xml:space="preserve">After the execution of </w:t>
+      </w:r>
+      <w:r>
+        <w:rPr>
+          <w:rFonts w:ascii="Consolas" w:hAnsi="Consolas"/>
+          <w:b/>
+          <w:bCs/>
+          <w:sz w:val="28"/>
+          <w:szCs w:val="28"/>
+        </w:rPr>
+        <w:t>GROUP BY</w:t>
+      </w:r>
+      <w:r>
+        <w:rPr>
+          <w:rFonts w:ascii="Consolas" w:hAnsi="Consolas"/>
+          <w:sz w:val="28"/>
+          <w:szCs w:val="28"/>
+        </w:rPr>
+        <w:t xml:space="preserve"> clause, we get groups.</w:t>
+      </w:r>
+    </w:p>
+    <w:p>
+      <w:pPr>
+        <w:pStyle w:val="ListParagraph"/>
+        <w:numPr>
+          <w:ilvl w:val="0"/>
+          <w:numId w:val="43"/>
+        </w:numPr>
+        <w:spacing w:line="240" w:lineRule="auto"/>
+        <w:rPr>
+          <w:rFonts w:ascii="Consolas" w:hAnsi="Consolas"/>
+          <w:sz w:val="28"/>
+          <w:szCs w:val="28"/>
+        </w:rPr>
+      </w:pPr>
+      <w:r>
+        <w:rPr>
+          <w:rFonts w:ascii="Consolas" w:hAnsi="Consolas"/>
+          <w:sz w:val="28"/>
+          <w:szCs w:val="28"/>
+        </w:rPr>
+        <w:t xml:space="preserve">Therefore, any clause that executes after </w:t>
+      </w:r>
+      <w:r>
+        <w:rPr>
+          <w:rFonts w:ascii="Consolas" w:hAnsi="Consolas"/>
+          <w:b/>
+          <w:bCs/>
+          <w:sz w:val="28"/>
+          <w:szCs w:val="28"/>
+        </w:rPr>
+        <w:t>group by</w:t>
+      </w:r>
+      <w:r>
+        <w:rPr>
+          <w:rFonts w:ascii="Consolas" w:hAnsi="Consolas"/>
+          <w:sz w:val="28"/>
+          <w:szCs w:val="28"/>
+        </w:rPr>
+        <w:t xml:space="preserve"> must execute group by group.</w:t>
+      </w:r>
+    </w:p>
+    <w:p>
+      <w:pPr>
+        <w:pStyle w:val="ListParagraph"/>
+        <w:numPr>
+          <w:ilvl w:val="0"/>
+          <w:numId w:val="43"/>
+        </w:numPr>
+        <w:spacing w:line="240" w:lineRule="auto"/>
+        <w:rPr>
+          <w:rFonts w:ascii="Consolas" w:hAnsi="Consolas"/>
+          <w:sz w:val="28"/>
+          <w:szCs w:val="28"/>
+        </w:rPr>
+      </w:pPr>
+      <w:r>
+        <w:rPr>
+          <w:rFonts w:ascii="Consolas" w:hAnsi="Consolas"/>
+          <w:sz w:val="28"/>
+          <w:szCs w:val="28"/>
+        </w:rPr>
+        <w:t xml:space="preserve">The column name or expression used for grouping can be used in </w:t>
+      </w:r>
+      <w:r>
+        <w:rPr>
+          <w:rFonts w:ascii="Consolas" w:hAnsi="Consolas"/>
+          <w:b/>
+          <w:bCs/>
+          <w:sz w:val="28"/>
+          <w:szCs w:val="28"/>
+        </w:rPr>
+        <w:t>SELECT</w:t>
+      </w:r>
+      <w:r>
+        <w:rPr>
+          <w:rFonts w:ascii="Consolas" w:hAnsi="Consolas"/>
+          <w:sz w:val="28"/>
+          <w:szCs w:val="28"/>
+        </w:rPr>
+        <w:t xml:space="preserve"> clause.</w:t>
+      </w:r>
+    </w:p>
+    <w:p>
+      <w:pPr>
+        <w:pStyle w:val="ListParagraph"/>
+        <w:numPr>
+          <w:ilvl w:val="0"/>
+          <w:numId w:val="43"/>
+        </w:numPr>
+        <w:spacing w:line="240" w:lineRule="auto"/>
+        <w:rPr>
+          <w:rFonts w:ascii="Consolas" w:hAnsi="Consolas"/>
+          <w:sz w:val="28"/>
+          <w:szCs w:val="28"/>
+        </w:rPr>
+      </w:pPr>
+      <w:r>
+        <w:rPr>
+          <w:rFonts w:ascii="Consolas" w:hAnsi="Consolas"/>
+          <w:b/>
+          <w:bCs/>
+          <w:sz w:val="28"/>
+          <w:szCs w:val="28"/>
+        </w:rPr>
+        <w:t>Group by</w:t>
+      </w:r>
+      <w:r>
+        <w:rPr>
+          <w:rFonts w:ascii="Consolas" w:hAnsi="Consolas"/>
+          <w:sz w:val="28"/>
+          <w:szCs w:val="28"/>
+        </w:rPr>
+        <w:t xml:space="preserve"> clause can be used without using </w:t>
+      </w:r>
+      <w:r>
+        <w:rPr>
+          <w:rFonts w:ascii="Consolas" w:hAnsi="Consolas"/>
+          <w:b/>
+          <w:bCs/>
+          <w:sz w:val="28"/>
+          <w:szCs w:val="28"/>
+        </w:rPr>
+        <w:t>WHERE</w:t>
+      </w:r>
+      <w:r>
+        <w:rPr>
+          <w:rFonts w:ascii="Consolas" w:hAnsi="Consolas"/>
+          <w:sz w:val="28"/>
+          <w:szCs w:val="28"/>
+        </w:rPr>
+        <w:t xml:space="preserve"> clause.</w:t>
+      </w:r>
+    </w:p>
+    <w:p>
+      <w:pPr>
+        <w:spacing w:line="240" w:lineRule="auto"/>
+        <w:rPr>
+          <w:rFonts w:ascii="Consolas" w:hAnsi="Consolas"/>
+          <w:sz w:val="28"/>
+          <w:szCs w:val="28"/>
+        </w:rPr>
+      </w:pPr>
+    </w:p>
+    <w:p>
+      <w:pPr>
+        <w:spacing w:line="240" w:lineRule="auto"/>
+        <w:jc w:val="center"/>
+        <w:rPr>
+          <w:rFonts w:ascii="Consolas" w:hAnsi="Consolas"/>
+          <w:b/>
+          <w:bCs/>
+          <w:sz w:val="28"/>
+          <w:szCs w:val="28"/>
+        </w:rPr>
+      </w:pPr>
+      <w:r>
+        <w:rPr>
+          <w:rFonts w:ascii="Consolas" w:hAnsi="Consolas"/>
+          <w:b/>
+          <w:bCs/>
+          <w:sz w:val="28"/>
+          <w:szCs w:val="28"/>
+        </w:rPr>
+        <w:t>FRIDAY 04/08/2026</w:t>
+      </w:r>
+    </w:p>
+    <w:p>
+      <w:pPr>
+        <w:rPr>
+          <w:b/>
+          <w:bCs/>
+          <w:sz w:val="28"/>
+          <w:szCs w:val="28"/>
+        </w:rPr>
+      </w:pPr>
+      <w:r>
+        <w:rPr>
+          <w:b/>
+          <w:bCs/>
+          <w:sz w:val="28"/>
+          <w:szCs w:val="28"/>
+        </w:rPr>
+        <w:t>HAVING:</w:t>
+      </w:r>
+    </w:p>
+    <w:p>
+      <w:pPr>
+        <w:pStyle w:val="ListParagraph"/>
+        <w:numPr>
+          <w:ilvl w:val="0"/>
+          <w:numId w:val="44"/>
+        </w:numPr>
+        <w:spacing w:line="256" w:lineRule="auto"/>
+        <w:rPr>
+          <w:b/>
+          <w:bCs/>
+          <w:sz w:val="28"/>
+          <w:szCs w:val="28"/>
+        </w:rPr>
+      </w:pPr>
+      <w:r>
+        <w:rPr>
+          <w:sz w:val="28"/>
+          <w:szCs w:val="28"/>
+        </w:rPr>
+        <w:t xml:space="preserve">It is </w:t>
       </w:r>
       <w:proofErr w:type="gramStart"/>
       <w:r>
         <w:rPr>
-          <w:rStyle w:val="HTMLCode"/>
-        </w:rPr>
-        <w:t>';</w:t>
+          <w:sz w:val="28"/>
+          <w:szCs w:val="28"/>
+        </w:rPr>
+        <w:t>use</w:t>
       </w:r>
       <w:proofErr w:type="gramEnd"/>
-    </w:p>
-    <w:p>
-      <w:pPr>
-        <w:rPr>
-          <w:b/>
-          <w:bCs/>
-          <w:sz w:val="28"/>
-          <w:szCs w:val="28"/>
-        </w:rPr>
-      </w:pPr>
-    </w:p>
-    <w:p>
-      <w:pPr>
+      <w:r>
+        <w:rPr>
+          <w:sz w:val="28"/>
+          <w:szCs w:val="28"/>
+        </w:rPr>
+        <w:t xml:space="preserve"> to filter the group (not row).</w:t>
+      </w:r>
+    </w:p>
+    <w:p>
+      <w:pPr>
+        <w:pStyle w:val="ListParagraph"/>
+        <w:numPr>
+          <w:ilvl w:val="0"/>
+          <w:numId w:val="44"/>
+        </w:numPr>
+        <w:spacing w:line="256" w:lineRule="auto"/>
+        <w:rPr>
+          <w:b/>
+          <w:bCs/>
+          <w:sz w:val="28"/>
+          <w:szCs w:val="28"/>
+        </w:rPr>
+      </w:pPr>
+      <w:r>
+        <w:rPr>
+          <w:sz w:val="28"/>
+          <w:szCs w:val="28"/>
+        </w:rPr>
+        <w:t xml:space="preserve">Syntax: </w:t>
+      </w:r>
+    </w:p>
+    <w:p>
+      <w:pPr>
+        <w:pStyle w:val="ListParagraph"/>
+        <w:numPr>
+          <w:ilvl w:val="1"/>
+          <w:numId w:val="44"/>
+        </w:numPr>
+        <w:spacing w:line="256" w:lineRule="auto"/>
+        <w:rPr>
+          <w:b/>
+          <w:bCs/>
+          <w:sz w:val="28"/>
+          <w:szCs w:val="28"/>
+        </w:rPr>
+      </w:pPr>
+      <w:r>
+        <w:rPr>
+          <w:sz w:val="28"/>
+          <w:szCs w:val="28"/>
+        </w:rPr>
+        <w:t>SELECT GROUP BY EXPRESSION / GROUP FUNCTION</w:t>
+      </w:r>
+    </w:p>
+    <w:p>
+      <w:pPr>
+        <w:pStyle w:val="ListParagraph"/>
+        <w:numPr>
+          <w:ilvl w:val="1"/>
+          <w:numId w:val="44"/>
+        </w:numPr>
+        <w:spacing w:line="256" w:lineRule="auto"/>
+        <w:rPr>
+          <w:b/>
+          <w:bCs/>
+          <w:sz w:val="28"/>
+          <w:szCs w:val="28"/>
+        </w:rPr>
+      </w:pPr>
+      <w:r>
+        <w:rPr>
+          <w:sz w:val="28"/>
+          <w:szCs w:val="28"/>
+        </w:rPr>
+        <w:t>FROM TABLE_NAME</w:t>
+      </w:r>
+    </w:p>
+    <w:p>
+      <w:pPr>
+        <w:pStyle w:val="ListParagraph"/>
+        <w:numPr>
+          <w:ilvl w:val="1"/>
+          <w:numId w:val="44"/>
+        </w:numPr>
+        <w:spacing w:line="256" w:lineRule="auto"/>
+        <w:rPr>
+          <w:b/>
+          <w:bCs/>
+          <w:sz w:val="28"/>
+          <w:szCs w:val="28"/>
+        </w:rPr>
+      </w:pPr>
+      <w:r>
+        <w:rPr>
+          <w:sz w:val="28"/>
+          <w:szCs w:val="28"/>
+        </w:rPr>
+        <w:t>[WHERE &lt; FILTER RECORD&gt;]</w:t>
+      </w:r>
+    </w:p>
+    <w:p>
+      <w:pPr>
+        <w:pStyle w:val="ListParagraph"/>
+        <w:numPr>
+          <w:ilvl w:val="1"/>
+          <w:numId w:val="44"/>
+        </w:numPr>
+        <w:spacing w:line="256" w:lineRule="auto"/>
+        <w:rPr>
+          <w:b/>
+          <w:bCs/>
+          <w:sz w:val="28"/>
+          <w:szCs w:val="28"/>
+        </w:rPr>
+      </w:pPr>
+      <w:r>
+        <w:rPr>
+          <w:sz w:val="28"/>
+          <w:szCs w:val="28"/>
+        </w:rPr>
+        <w:t>GROUP BY COL_NAME/EXPRESSION.</w:t>
+      </w:r>
+    </w:p>
+    <w:p>
+      <w:pPr>
+        <w:pStyle w:val="ListParagraph"/>
+        <w:numPr>
+          <w:ilvl w:val="1"/>
+          <w:numId w:val="44"/>
+        </w:numPr>
+        <w:spacing w:line="256" w:lineRule="auto"/>
+        <w:rPr>
+          <w:sz w:val="28"/>
+          <w:szCs w:val="28"/>
+        </w:rPr>
+      </w:pPr>
+      <w:r>
+        <w:rPr>
+          <w:sz w:val="28"/>
+          <w:szCs w:val="28"/>
+        </w:rPr>
+        <w:t>HAVING &lt;FILTER GROUP CONDITION&gt;</w:t>
+      </w:r>
+    </w:p>
+    <w:p>
+      <w:pPr>
+        <w:pStyle w:val="ListParagraph"/>
+        <w:numPr>
+          <w:ilvl w:val="0"/>
+          <w:numId w:val="44"/>
+        </w:numPr>
+        <w:spacing w:line="256" w:lineRule="auto"/>
+        <w:rPr>
+          <w:b/>
+          <w:bCs/>
+          <w:sz w:val="28"/>
+          <w:szCs w:val="28"/>
+        </w:rPr>
+      </w:pPr>
+      <w:r>
+        <w:rPr>
+          <w:sz w:val="28"/>
+          <w:szCs w:val="28"/>
+        </w:rPr>
+        <w:t xml:space="preserve">1. </w:t>
+      </w:r>
+      <w:r>
+        <w:rPr>
+          <w:sz w:val="28"/>
+          <w:szCs w:val="28"/>
+        </w:rPr>
+        <w:t xml:space="preserve">OFF </w:t>
+      </w:r>
+      <w:r>
+        <w:rPr>
+          <w:sz w:val="28"/>
+          <w:szCs w:val="28"/>
+        </w:rPr>
+        <w:t xml:space="preserve"> 2.</w:t>
+      </w:r>
+      <w:r>
+        <w:rPr>
+          <w:sz w:val="28"/>
+          <w:szCs w:val="28"/>
+        </w:rPr>
+        <w:t xml:space="preserve"> FROM</w:t>
+      </w:r>
+    </w:p>
+    <w:p>
+      <w:pPr>
+        <w:pStyle w:val="ListParagraph"/>
+        <w:numPr>
+          <w:ilvl w:val="0"/>
+          <w:numId w:val="44"/>
+        </w:numPr>
+        <w:spacing w:line="256" w:lineRule="auto"/>
+        <w:rPr>
+          <w:b/>
+          <w:bCs/>
+          <w:sz w:val="28"/>
+          <w:szCs w:val="28"/>
+        </w:rPr>
+      </w:pPr>
+      <w:r>
+        <w:rPr>
+          <w:sz w:val="28"/>
+          <w:szCs w:val="28"/>
+        </w:rPr>
+        <w:t xml:space="preserve"> </w:t>
+      </w:r>
+      <w:r>
+        <w:rPr>
+          <w:sz w:val="28"/>
+          <w:szCs w:val="28"/>
+        </w:rPr>
+        <w:t xml:space="preserve">3. </w:t>
+      </w:r>
+      <w:r>
+        <w:rPr>
+          <w:sz w:val="28"/>
+          <w:szCs w:val="28"/>
+        </w:rPr>
+        <w:t xml:space="preserve">WHERE </w:t>
+      </w:r>
+      <w:r>
+        <w:rPr>
+          <w:sz w:val="28"/>
+          <w:szCs w:val="28"/>
+        </w:rPr>
+        <w:t xml:space="preserve">4. </w:t>
+      </w:r>
+      <w:r>
+        <w:rPr>
+          <w:sz w:val="28"/>
+          <w:szCs w:val="28"/>
+        </w:rPr>
+        <w:t xml:space="preserve">GROUP BY </w:t>
+      </w:r>
+    </w:p>
+    <w:p>
+      <w:pPr>
+        <w:pStyle w:val="ListParagraph"/>
+        <w:numPr>
+          <w:ilvl w:val="0"/>
+          <w:numId w:val="44"/>
+        </w:numPr>
+        <w:spacing w:line="256" w:lineRule="auto"/>
+        <w:rPr>
+          <w:b/>
+          <w:bCs/>
+          <w:sz w:val="28"/>
+          <w:szCs w:val="28"/>
+        </w:rPr>
+      </w:pPr>
+      <w:r>
+        <w:rPr>
+          <w:sz w:val="28"/>
+          <w:szCs w:val="28"/>
+        </w:rPr>
+        <w:t xml:space="preserve">5. </w:t>
+      </w:r>
+      <w:r>
+        <w:rPr>
+          <w:sz w:val="28"/>
+          <w:szCs w:val="28"/>
+        </w:rPr>
+        <w:t xml:space="preserve">HAVING </w:t>
+      </w:r>
+      <w:r>
+        <w:rPr>
+          <w:sz w:val="28"/>
+          <w:szCs w:val="28"/>
+        </w:rPr>
+        <w:t xml:space="preserve">6. </w:t>
+      </w:r>
+      <w:r>
+        <w:rPr>
+          <w:sz w:val="28"/>
+          <w:szCs w:val="28"/>
+        </w:rPr>
+        <w:t>SELECT.</w:t>
+      </w:r>
+    </w:p>
+    <w:p>
+      <w:pPr>
+        <w:spacing w:line="240" w:lineRule="auto"/>
+        <w:rPr>
+          <w:rFonts w:ascii="Consolas" w:hAnsi="Consolas"/>
+          <w:sz w:val="28"/>
+          <w:szCs w:val="28"/>
+        </w:rPr>
+      </w:pPr>
+    </w:p>
+    <w:p>
+      <w:pPr>
+        <w:rPr>
+          <w:rFonts w:ascii="Consolas" w:hAnsi="Consolas"/>
+          <w:sz w:val="28"/>
+          <w:szCs w:val="28"/>
+        </w:rPr>
+      </w:pPr>
+      <w:r>
+        <w:rPr>
+          <w:rFonts w:ascii="Consolas" w:hAnsi="Consolas"/>
+          <w:sz w:val="28"/>
+          <w:szCs w:val="28"/>
+        </w:rPr>
+        <w:br w:type="page"/>
+      </w:r>
+    </w:p>
+    <w:p>
+      <w:pPr>
+        <w:spacing w:line="240" w:lineRule="auto"/>
         <w:jc w:val="center"/>
         <w:rPr>
-          <w:b/>
-          <w:bCs/>
-          <w:sz w:val="28"/>
-          <w:szCs w:val="28"/>
-        </w:rPr>
-      </w:pPr>
-      <w:r>
-        <w:rPr>
-          <w:b/>
-          <w:bCs/>
-          <w:sz w:val="28"/>
-          <w:szCs w:val="28"/>
-        </w:rPr>
-        <w:t>2</w:t>
-      </w:r>
-      <w:r>
-        <w:rPr>
-          <w:b/>
-          <w:bCs/>
-          <w:sz w:val="28"/>
-          <w:szCs w:val="28"/>
+          <w:rFonts w:ascii="Consolas" w:hAnsi="Consolas"/>
+          <w:b/>
+          <w:bCs/>
+          <w:sz w:val="28"/>
+          <w:szCs w:val="28"/>
+          <w:u w:val="single"/>
+        </w:rPr>
+      </w:pPr>
+      <w:r>
+        <w:rPr>
+          <w:rFonts w:ascii="Consolas" w:hAnsi="Consolas"/>
+          <w:b/>
+          <w:bCs/>
+          <w:sz w:val="28"/>
+          <w:szCs w:val="28"/>
+          <w:u w:val="single"/>
+        </w:rPr>
+        <w:lastRenderedPageBreak/>
+        <w:t>7</w:t>
+      </w:r>
+      <w:r>
+        <w:rPr>
+          <w:rFonts w:ascii="Consolas" w:hAnsi="Consolas"/>
+          <w:b/>
+          <w:bCs/>
+          <w:sz w:val="28"/>
+          <w:szCs w:val="28"/>
+          <w:u w:val="single"/>
           <w:vertAlign w:val="superscript"/>
         </w:rPr>
-        <w:t>nd</w:t>
-      </w:r>
-      <w:r>
-        <w:rPr>
-          <w:b/>
-          <w:bCs/>
-          <w:sz w:val="28"/>
-          <w:szCs w:val="28"/>
+        <w:t>th</w:t>
+      </w:r>
+      <w:r>
+        <w:rPr>
+          <w:rFonts w:ascii="Consolas" w:hAnsi="Consolas"/>
+          <w:b/>
+          <w:bCs/>
+          <w:sz w:val="28"/>
+          <w:szCs w:val="28"/>
+          <w:u w:val="single"/>
         </w:rPr>
         <w:t xml:space="preserve"> September Notes</w:t>
       </w:r>
     </w:p>
     <w:p>
       <w:pPr>
-        <w:rPr>
-          <w:b/>
-          <w:bCs/>
-          <w:sz w:val="28"/>
-          <w:szCs w:val="28"/>
-        </w:rPr>
-      </w:pPr>
+        <w:spacing w:line="240" w:lineRule="auto"/>
+        <w:jc w:val="center"/>
+        <w:rPr>
+          <w:rFonts w:ascii="Consolas" w:hAnsi="Consolas"/>
+          <w:b/>
+          <w:bCs/>
+          <w:sz w:val="32"/>
+          <w:szCs w:val="32"/>
+          <w:u w:val="single"/>
+        </w:rPr>
+      </w:pPr>
+      <w:r>
+        <w:rPr>
+          <w:rFonts w:ascii="Consolas" w:hAnsi="Consolas"/>
+          <w:b/>
+          <w:bCs/>
+          <w:sz w:val="28"/>
+          <w:szCs w:val="28"/>
+          <w:u w:val="single"/>
+        </w:rPr>
+        <w:t>IMPORTANT LECTURE</w:t>
+      </w:r>
+    </w:p>
+    <w:p>
+      <w:pPr>
+        <w:spacing w:line="240" w:lineRule="auto"/>
+        <w:rPr>
+          <w:rFonts w:ascii="Consolas" w:hAnsi="Consolas"/>
+          <w:sz w:val="28"/>
+          <w:szCs w:val="28"/>
+        </w:rPr>
+      </w:pPr>
+      <w:r>
+        <w:rPr>
+          <w:rFonts w:ascii="Consolas" w:hAnsi="Consolas"/>
+          <w:b/>
+          <w:bCs/>
+          <w:sz w:val="32"/>
+          <w:szCs w:val="32"/>
+          <w:u w:val="single"/>
+        </w:rPr>
+        <w:t>SUB QUERY:</w:t>
+      </w:r>
+      <w:r>
+        <w:rPr>
+          <w:rFonts w:ascii="Consolas" w:hAnsi="Consolas"/>
+          <w:sz w:val="32"/>
+          <w:szCs w:val="32"/>
+        </w:rPr>
+        <w:t xml:space="preserve"> </w:t>
+      </w:r>
+      <w:r>
+        <w:rPr>
+          <w:rFonts w:ascii="Consolas" w:hAnsi="Consolas"/>
+          <w:sz w:val="28"/>
+          <w:szCs w:val="28"/>
+        </w:rPr>
+        <w:t xml:space="preserve">A query written inside another query is known as sub query. </w:t>
+      </w:r>
+    </w:p>
+    <w:p>
+      <w:pPr>
+        <w:spacing w:line="240" w:lineRule="auto"/>
+        <w:rPr>
+          <w:rFonts w:ascii="Consolas" w:hAnsi="Consolas"/>
+          <w:b/>
+          <w:bCs/>
+          <w:sz w:val="28"/>
+          <w:szCs w:val="28"/>
+          <w:u w:val="single"/>
+        </w:rPr>
+      </w:pPr>
+      <w:r>
+        <w:rPr>
+          <w:rFonts w:ascii="Consolas" w:hAnsi="Consolas"/>
+          <w:b/>
+          <w:bCs/>
+          <w:sz w:val="28"/>
+          <w:szCs w:val="28"/>
+          <w:u w:val="single"/>
+        </w:rPr>
+        <w:t>Working Principle:</w:t>
+      </w:r>
+    </w:p>
+    <w:p>
+      <w:pPr>
+        <w:spacing w:line="240" w:lineRule="auto"/>
+        <w:rPr>
+          <w:rFonts w:ascii="Consolas" w:hAnsi="Consolas"/>
+          <w:sz w:val="28"/>
+          <w:szCs w:val="28"/>
+        </w:rPr>
+      </w:pPr>
+      <w:r>
+        <w:rPr>
+          <w:rFonts w:ascii="Consolas" w:hAnsi="Consolas"/>
+          <w:sz w:val="28"/>
+          <w:szCs w:val="28"/>
+        </w:rPr>
+        <w:t xml:space="preserve"> </w:t>
+      </w:r>
+      <w:proofErr w:type="spellStart"/>
+      <w:r>
+        <w:rPr>
+          <w:rFonts w:ascii="Consolas" w:hAnsi="Consolas"/>
+          <w:sz w:val="28"/>
+          <w:szCs w:val="28"/>
+        </w:rPr>
+        <w:t>Img</w:t>
+      </w:r>
+      <w:proofErr w:type="spellEnd"/>
+      <w:r>
+        <w:rPr>
+          <w:rFonts w:ascii="Consolas" w:hAnsi="Consolas"/>
+          <w:sz w:val="28"/>
+          <w:szCs w:val="28"/>
+        </w:rPr>
+        <w:t xml:space="preserve"> here </w:t>
+      </w:r>
+    </w:p>
+    <w:p>
+      <w:pPr>
+        <w:pStyle w:val="ListParagraph"/>
+        <w:numPr>
+          <w:ilvl w:val="0"/>
+          <w:numId w:val="44"/>
+        </w:numPr>
+        <w:spacing w:line="240" w:lineRule="auto"/>
+        <w:rPr>
+          <w:rFonts w:ascii="Consolas" w:hAnsi="Consolas"/>
+          <w:sz w:val="28"/>
+          <w:szCs w:val="28"/>
+        </w:rPr>
+      </w:pPr>
+      <w:r>
+        <w:rPr>
+          <w:rFonts w:ascii="Consolas" w:hAnsi="Consolas"/>
+          <w:sz w:val="28"/>
+          <w:szCs w:val="28"/>
+        </w:rPr>
+        <w:t>Let’s consider two queries inner query and outer query,</w:t>
+      </w:r>
+    </w:p>
+    <w:p>
+      <w:pPr>
+        <w:pStyle w:val="ListParagraph"/>
+        <w:numPr>
+          <w:ilvl w:val="0"/>
+          <w:numId w:val="44"/>
+        </w:numPr>
+        <w:spacing w:line="240" w:lineRule="auto"/>
+        <w:rPr>
+          <w:rFonts w:ascii="Consolas" w:hAnsi="Consolas"/>
+          <w:sz w:val="28"/>
+          <w:szCs w:val="28"/>
+        </w:rPr>
+      </w:pPr>
+      <w:r>
+        <w:rPr>
+          <w:rFonts w:ascii="Consolas" w:hAnsi="Consolas"/>
+          <w:sz w:val="28"/>
+          <w:szCs w:val="28"/>
+        </w:rPr>
+        <w:t>first the inner query will execute and will give us o/p</w:t>
+      </w:r>
+      <w:r>
+        <w:rPr>
+          <w:rFonts w:ascii="Consolas" w:hAnsi="Consolas"/>
+          <w:sz w:val="28"/>
+          <w:szCs w:val="28"/>
+        </w:rPr>
+        <w:t>.</w:t>
+      </w:r>
+    </w:p>
+    <w:p>
+      <w:pPr>
+        <w:pStyle w:val="ListParagraph"/>
+        <w:numPr>
+          <w:ilvl w:val="0"/>
+          <w:numId w:val="44"/>
+        </w:numPr>
+        <w:spacing w:line="240" w:lineRule="auto"/>
+        <w:rPr>
+          <w:rFonts w:ascii="Consolas" w:hAnsi="Consolas"/>
+          <w:sz w:val="28"/>
+          <w:szCs w:val="28"/>
+        </w:rPr>
+      </w:pPr>
+      <w:r>
+        <w:rPr>
+          <w:rFonts w:ascii="Consolas" w:hAnsi="Consolas"/>
+          <w:sz w:val="28"/>
+          <w:szCs w:val="28"/>
+        </w:rPr>
+        <w:t xml:space="preserve">this o/p </w:t>
+      </w:r>
+      <w:r>
+        <w:rPr>
+          <w:rFonts w:ascii="Consolas" w:hAnsi="Consolas"/>
+          <w:sz w:val="28"/>
+          <w:szCs w:val="28"/>
+        </w:rPr>
+        <w:t>is given</w:t>
+      </w:r>
+      <w:r>
+        <w:rPr>
+          <w:rFonts w:ascii="Consolas" w:hAnsi="Consolas"/>
+          <w:sz w:val="28"/>
+          <w:szCs w:val="28"/>
+        </w:rPr>
+        <w:t xml:space="preserve"> as </w:t>
+      </w:r>
+      <w:proofErr w:type="spellStart"/>
+      <w:r>
+        <w:rPr>
+          <w:rFonts w:ascii="Consolas" w:hAnsi="Consolas"/>
+          <w:sz w:val="28"/>
+          <w:szCs w:val="28"/>
+        </w:rPr>
+        <w:t>i</w:t>
+      </w:r>
+      <w:proofErr w:type="spellEnd"/>
+      <w:r>
+        <w:rPr>
+          <w:rFonts w:ascii="Consolas" w:hAnsi="Consolas"/>
+          <w:sz w:val="28"/>
+          <w:szCs w:val="28"/>
+        </w:rPr>
+        <w:t>/p to outer</w:t>
+      </w:r>
+      <w:r>
+        <w:rPr>
+          <w:rFonts w:ascii="Consolas" w:hAnsi="Consolas"/>
+          <w:sz w:val="28"/>
+          <w:szCs w:val="28"/>
+        </w:rPr>
+        <w:t xml:space="preserve"> query.</w:t>
+      </w:r>
+    </w:p>
+    <w:p>
+      <w:pPr>
+        <w:pStyle w:val="ListParagraph"/>
+        <w:numPr>
+          <w:ilvl w:val="0"/>
+          <w:numId w:val="44"/>
+        </w:numPr>
+        <w:spacing w:line="240" w:lineRule="auto"/>
+        <w:rPr>
+          <w:rFonts w:ascii="Consolas" w:hAnsi="Consolas"/>
+          <w:sz w:val="28"/>
+          <w:szCs w:val="28"/>
+        </w:rPr>
+      </w:pPr>
+      <w:r>
+        <w:rPr>
+          <w:rFonts w:ascii="Consolas" w:hAnsi="Consolas"/>
+          <w:sz w:val="28"/>
+          <w:szCs w:val="28"/>
+        </w:rPr>
+        <w:t xml:space="preserve">The outer query </w:t>
+      </w:r>
+      <w:r>
+        <w:rPr>
+          <w:rFonts w:ascii="Consolas" w:hAnsi="Consolas"/>
+          <w:sz w:val="28"/>
+          <w:szCs w:val="28"/>
+        </w:rPr>
+        <w:t>will provide final output.</w:t>
+      </w:r>
+    </w:p>
+    <w:p>
+      <w:pPr>
+        <w:pStyle w:val="ListParagraph"/>
+        <w:numPr>
+          <w:ilvl w:val="0"/>
+          <w:numId w:val="44"/>
+        </w:numPr>
+        <w:spacing w:line="240" w:lineRule="auto"/>
+        <w:rPr>
+          <w:rFonts w:ascii="Consolas" w:hAnsi="Consolas"/>
+          <w:sz w:val="28"/>
+          <w:szCs w:val="28"/>
+        </w:rPr>
+      </w:pPr>
+      <w:r>
+        <w:rPr>
+          <w:rFonts w:ascii="Consolas" w:hAnsi="Consolas"/>
+          <w:sz w:val="28"/>
+          <w:szCs w:val="28"/>
+        </w:rPr>
+        <w:t>Therefore, we can say that the outer query is dependent on inner query.</w:t>
+      </w:r>
+    </w:p>
+    <w:p>
+      <w:pPr>
+        <w:pStyle w:val="ListParagraph"/>
+        <w:numPr>
+          <w:ilvl w:val="0"/>
+          <w:numId w:val="44"/>
+        </w:numPr>
+        <w:spacing w:line="240" w:lineRule="auto"/>
+        <w:rPr>
+          <w:rFonts w:ascii="Consolas" w:hAnsi="Consolas"/>
+          <w:sz w:val="28"/>
+          <w:szCs w:val="28"/>
+        </w:rPr>
+      </w:pPr>
+      <w:r>
+        <w:rPr>
+          <w:rFonts w:ascii="Consolas" w:hAnsi="Consolas"/>
+          <w:sz w:val="28"/>
+          <w:szCs w:val="28"/>
+        </w:rPr>
+        <w:t>And this is the execution principle of sub query.</w:t>
+      </w:r>
+    </w:p>
+    <w:p>
+      <w:pPr>
+        <w:spacing w:line="240" w:lineRule="auto"/>
+        <w:ind w:left="360"/>
+        <w:rPr>
+          <w:rFonts w:ascii="Consolas" w:hAnsi="Consolas"/>
+          <w:sz w:val="28"/>
+          <w:szCs w:val="28"/>
+        </w:rPr>
+      </w:pPr>
+    </w:p>
+    <w:p>
+      <w:pPr>
+        <w:spacing w:line="240" w:lineRule="auto"/>
+        <w:ind w:left="360"/>
+        <w:rPr>
+          <w:rFonts w:ascii="Consolas" w:hAnsi="Consolas"/>
+          <w:b/>
+          <w:bCs/>
+          <w:sz w:val="32"/>
+          <w:szCs w:val="32"/>
+          <w:u w:val="single"/>
+        </w:rPr>
+      </w:pPr>
+      <w:r>
+        <w:rPr>
+          <w:rFonts w:ascii="Consolas" w:hAnsi="Consolas"/>
+          <w:b/>
+          <w:bCs/>
+          <w:sz w:val="32"/>
+          <w:szCs w:val="32"/>
+          <w:u w:val="single"/>
+        </w:rPr>
+        <w:t>Why? When?</w:t>
+      </w:r>
+    </w:p>
+    <w:p>
+      <w:pPr>
+        <w:spacing w:line="240" w:lineRule="auto"/>
+        <w:ind w:left="360"/>
+        <w:rPr>
+          <w:rFonts w:ascii="Consolas" w:hAnsi="Consolas"/>
+          <w:sz w:val="28"/>
+          <w:szCs w:val="28"/>
+        </w:rPr>
+      </w:pPr>
+      <w:r>
+        <w:rPr>
+          <w:rFonts w:ascii="Consolas" w:hAnsi="Consolas"/>
+          <w:b/>
+          <w:bCs/>
+          <w:sz w:val="28"/>
+          <w:szCs w:val="28"/>
+        </w:rPr>
+        <w:t>CASE 1:</w:t>
+      </w:r>
+      <w:r>
+        <w:rPr>
+          <w:rFonts w:ascii="Consolas" w:hAnsi="Consolas"/>
+          <w:b/>
+          <w:bCs/>
+          <w:sz w:val="28"/>
+          <w:szCs w:val="28"/>
+        </w:rPr>
+        <w:t xml:space="preserve"> </w:t>
+      </w:r>
+      <w:r>
+        <w:rPr>
+          <w:rFonts w:ascii="Consolas" w:hAnsi="Consolas"/>
+          <w:sz w:val="28"/>
+          <w:szCs w:val="28"/>
+        </w:rPr>
+        <w:t xml:space="preserve">Whenever we have unknown present in the </w:t>
+      </w:r>
+      <w:proofErr w:type="gramStart"/>
+      <w:r>
+        <w:rPr>
+          <w:rFonts w:ascii="Consolas" w:hAnsi="Consolas"/>
+          <w:sz w:val="28"/>
+          <w:szCs w:val="28"/>
+        </w:rPr>
+        <w:t>question</w:t>
+      </w:r>
+      <w:proofErr w:type="gramEnd"/>
+      <w:r>
+        <w:rPr>
+          <w:rFonts w:ascii="Consolas" w:hAnsi="Consolas"/>
+          <w:sz w:val="28"/>
+          <w:szCs w:val="28"/>
+        </w:rPr>
+        <w:t xml:space="preserve"> we use sub query to find the unknown.</w:t>
+      </w:r>
     </w:p>
     <w:sectPr>
       <w:footerReference w:type="default" r:id="rId8"/>
@@ -10432,6 +12984,95 @@
     </w:lvl>
   </w:abstractNum>
   <w:abstractNum w:abstractNumId="4" w15:restartNumberingAfterBreak="0">
+    <w:nsid w:val="11CB4D84"/>
+    <w:multiLevelType w:val="hybridMultilevel"/>
+    <w:tmpl w:val="C6589DBE"/>
+    <w:lvl w:ilvl="0" w:tplc="4009000F">
+      <w:start w:val="1"/>
+      <w:numFmt w:val="decimal"/>
+      <w:lvlText w:val="%1."/>
+      <w:lvlJc w:val="left"/>
+      <w:pPr>
+        <w:ind w:left="720" w:hanging="360"/>
+      </w:pPr>
+      <w:rPr>
+        <w:rFonts w:hint="default"/>
+      </w:rPr>
+    </w:lvl>
+    <w:lvl w:ilvl="1" w:tplc="40090019">
+      <w:start w:val="1"/>
+      <w:numFmt w:val="lowerLetter"/>
+      <w:lvlText w:val="%2."/>
+      <w:lvlJc w:val="left"/>
+      <w:pPr>
+        <w:ind w:left="1440" w:hanging="360"/>
+      </w:pPr>
+    </w:lvl>
+    <w:lvl w:ilvl="2" w:tplc="4009001B" w:tentative="1">
+      <w:start w:val="1"/>
+      <w:numFmt w:val="lowerRoman"/>
+      <w:lvlText w:val="%3."/>
+      <w:lvlJc w:val="right"/>
+      <w:pPr>
+        <w:ind w:left="2160" w:hanging="180"/>
+      </w:pPr>
+    </w:lvl>
+    <w:lvl w:ilvl="3" w:tplc="4009000F" w:tentative="1">
+      <w:start w:val="1"/>
+      <w:numFmt w:val="decimal"/>
+      <w:lvlText w:val="%4."/>
+      <w:lvlJc w:val="left"/>
+      <w:pPr>
+        <w:ind w:left="2880" w:hanging="360"/>
+      </w:pPr>
+    </w:lvl>
+    <w:lvl w:ilvl="4" w:tplc="40090019" w:tentative="1">
+      <w:start w:val="1"/>
+      <w:numFmt w:val="lowerLetter"/>
+      <w:lvlText w:val="%5."/>
+      <w:lvlJc w:val="left"/>
+      <w:pPr>
+        <w:ind w:left="3600" w:hanging="360"/>
+      </w:pPr>
+    </w:lvl>
+    <w:lvl w:ilvl="5" w:tplc="4009001B" w:tentative="1">
+      <w:start w:val="1"/>
+      <w:numFmt w:val="lowerRoman"/>
+      <w:lvlText w:val="%6."/>
+      <w:lvlJc w:val="right"/>
+      <w:pPr>
+        <w:ind w:left="4320" w:hanging="180"/>
+      </w:pPr>
+    </w:lvl>
+    <w:lvl w:ilvl="6" w:tplc="4009000F" w:tentative="1">
+      <w:start w:val="1"/>
+      <w:numFmt w:val="decimal"/>
+      <w:lvlText w:val="%7."/>
+      <w:lvlJc w:val="left"/>
+      <w:pPr>
+        <w:ind w:left="5040" w:hanging="360"/>
+      </w:pPr>
+    </w:lvl>
+    <w:lvl w:ilvl="7" w:tplc="40090019" w:tentative="1">
+      <w:start w:val="1"/>
+      <w:numFmt w:val="lowerLetter"/>
+      <w:lvlText w:val="%8."/>
+      <w:lvlJc w:val="left"/>
+      <w:pPr>
+        <w:ind w:left="5760" w:hanging="360"/>
+      </w:pPr>
+    </w:lvl>
+    <w:lvl w:ilvl="8" w:tplc="4009001B" w:tentative="1">
+      <w:start w:val="1"/>
+      <w:numFmt w:val="lowerRoman"/>
+      <w:lvlText w:val="%9."/>
+      <w:lvlJc w:val="right"/>
+      <w:pPr>
+        <w:ind w:left="6480" w:hanging="180"/>
+      </w:pPr>
+    </w:lvl>
+  </w:abstractNum>
+  <w:abstractNum w:abstractNumId="5" w15:restartNumberingAfterBreak="0">
     <w:nsid w:val="19A90EB5"/>
     <w:multiLevelType w:val="multilevel"/>
     <w:tmpl w:val="F46A3F74"/>
@@ -10580,7 +13221,7 @@
       </w:rPr>
     </w:lvl>
   </w:abstractNum>
-  <w:abstractNum w:abstractNumId="5" w15:restartNumberingAfterBreak="0">
+  <w:abstractNum w:abstractNumId="6" w15:restartNumberingAfterBreak="0">
     <w:nsid w:val="1CA77728"/>
     <w:multiLevelType w:val="multilevel"/>
     <w:tmpl w:val="19F29FB2"/>
@@ -10729,7 +13370,7 @@
       </w:rPr>
     </w:lvl>
   </w:abstractNum>
-  <w:abstractNum w:abstractNumId="6" w15:restartNumberingAfterBreak="0">
+  <w:abstractNum w:abstractNumId="7" w15:restartNumberingAfterBreak="0">
     <w:nsid w:val="1D7E1684"/>
     <w:multiLevelType w:val="hybridMultilevel"/>
     <w:tmpl w:val="B06A6A88"/>
@@ -10818,7 +13459,96 @@
       </w:pPr>
     </w:lvl>
   </w:abstractNum>
-  <w:abstractNum w:abstractNumId="7" w15:restartNumberingAfterBreak="0">
+  <w:abstractNum w:abstractNumId="8" w15:restartNumberingAfterBreak="0">
+    <w:nsid w:val="1F874818"/>
+    <w:multiLevelType w:val="hybridMultilevel"/>
+    <w:tmpl w:val="0A7C8E32"/>
+    <w:lvl w:ilvl="0" w:tplc="4009000F">
+      <w:start w:val="1"/>
+      <w:numFmt w:val="decimal"/>
+      <w:lvlText w:val="%1."/>
+      <w:lvlJc w:val="left"/>
+      <w:pPr>
+        <w:ind w:left="720" w:hanging="360"/>
+      </w:pPr>
+      <w:rPr>
+        <w:rFonts w:hint="default"/>
+      </w:rPr>
+    </w:lvl>
+    <w:lvl w:ilvl="1" w:tplc="40090019" w:tentative="1">
+      <w:start w:val="1"/>
+      <w:numFmt w:val="lowerLetter"/>
+      <w:lvlText w:val="%2."/>
+      <w:lvlJc w:val="left"/>
+      <w:pPr>
+        <w:ind w:left="1440" w:hanging="360"/>
+      </w:pPr>
+    </w:lvl>
+    <w:lvl w:ilvl="2" w:tplc="4009001B" w:tentative="1">
+      <w:start w:val="1"/>
+      <w:numFmt w:val="lowerRoman"/>
+      <w:lvlText w:val="%3."/>
+      <w:lvlJc w:val="right"/>
+      <w:pPr>
+        <w:ind w:left="2160" w:hanging="180"/>
+      </w:pPr>
+    </w:lvl>
+    <w:lvl w:ilvl="3" w:tplc="4009000F" w:tentative="1">
+      <w:start w:val="1"/>
+      <w:numFmt w:val="decimal"/>
+      <w:lvlText w:val="%4."/>
+      <w:lvlJc w:val="left"/>
+      <w:pPr>
+        <w:ind w:left="2880" w:hanging="360"/>
+      </w:pPr>
+    </w:lvl>
+    <w:lvl w:ilvl="4" w:tplc="40090019" w:tentative="1">
+      <w:start w:val="1"/>
+      <w:numFmt w:val="lowerLetter"/>
+      <w:lvlText w:val="%5."/>
+      <w:lvlJc w:val="left"/>
+      <w:pPr>
+        <w:ind w:left="3600" w:hanging="360"/>
+      </w:pPr>
+    </w:lvl>
+    <w:lvl w:ilvl="5" w:tplc="4009001B" w:tentative="1">
+      <w:start w:val="1"/>
+      <w:numFmt w:val="lowerRoman"/>
+      <w:lvlText w:val="%6."/>
+      <w:lvlJc w:val="right"/>
+      <w:pPr>
+        <w:ind w:left="4320" w:hanging="180"/>
+      </w:pPr>
+    </w:lvl>
+    <w:lvl w:ilvl="6" w:tplc="4009000F" w:tentative="1">
+      <w:start w:val="1"/>
+      <w:numFmt w:val="decimal"/>
+      <w:lvlText w:val="%7."/>
+      <w:lvlJc w:val="left"/>
+      <w:pPr>
+        <w:ind w:left="5040" w:hanging="360"/>
+      </w:pPr>
+    </w:lvl>
+    <w:lvl w:ilvl="7" w:tplc="40090019" w:tentative="1">
+      <w:start w:val="1"/>
+      <w:numFmt w:val="lowerLetter"/>
+      <w:lvlText w:val="%8."/>
+      <w:lvlJc w:val="left"/>
+      <w:pPr>
+        <w:ind w:left="5760" w:hanging="360"/>
+      </w:pPr>
+    </w:lvl>
+    <w:lvl w:ilvl="8" w:tplc="4009001B" w:tentative="1">
+      <w:start w:val="1"/>
+      <w:numFmt w:val="lowerRoman"/>
+      <w:lvlText w:val="%9."/>
+      <w:lvlJc w:val="right"/>
+      <w:pPr>
+        <w:ind w:left="6480" w:hanging="180"/>
+      </w:pPr>
+    </w:lvl>
+  </w:abstractNum>
+  <w:abstractNum w:abstractNumId="9" w15:restartNumberingAfterBreak="0">
     <w:nsid w:val="241857D5"/>
     <w:multiLevelType w:val="hybridMultilevel"/>
     <w:tmpl w:val="6BD89FB4"/>
@@ -10931,7 +13661,7 @@
       </w:rPr>
     </w:lvl>
   </w:abstractNum>
-  <w:abstractNum w:abstractNumId="8" w15:restartNumberingAfterBreak="0">
+  <w:abstractNum w:abstractNumId="10" w15:restartNumberingAfterBreak="0">
     <w:nsid w:val="25AA17B3"/>
     <w:multiLevelType w:val="multilevel"/>
     <w:tmpl w:val="D35C29E6"/>
@@ -11080,7 +13810,7 @@
       </w:rPr>
     </w:lvl>
   </w:abstractNum>
-  <w:abstractNum w:abstractNumId="9" w15:restartNumberingAfterBreak="0">
+  <w:abstractNum w:abstractNumId="11" w15:restartNumberingAfterBreak="0">
     <w:nsid w:val="2C963BCC"/>
     <w:multiLevelType w:val="multilevel"/>
     <w:tmpl w:val="79BA34E0"/>
@@ -11229,7 +13959,7 @@
       </w:rPr>
     </w:lvl>
   </w:abstractNum>
-  <w:abstractNum w:abstractNumId="10" w15:restartNumberingAfterBreak="0">
+  <w:abstractNum w:abstractNumId="12" w15:restartNumberingAfterBreak="0">
     <w:nsid w:val="2D8806CC"/>
     <w:multiLevelType w:val="multilevel"/>
     <w:tmpl w:val="FAD2D89C"/>
@@ -11378,7 +14108,7 @@
       </w:rPr>
     </w:lvl>
   </w:abstractNum>
-  <w:abstractNum w:abstractNumId="11" w15:restartNumberingAfterBreak="0">
+  <w:abstractNum w:abstractNumId="13" w15:restartNumberingAfterBreak="0">
     <w:nsid w:val="30B019CB"/>
     <w:multiLevelType w:val="multilevel"/>
     <w:tmpl w:val="5D8C3420"/>
@@ -11527,7 +14257,7 @@
       </w:rPr>
     </w:lvl>
   </w:abstractNum>
-  <w:abstractNum w:abstractNumId="12" w15:restartNumberingAfterBreak="0">
+  <w:abstractNum w:abstractNumId="14" w15:restartNumberingAfterBreak="0">
     <w:nsid w:val="31E438A1"/>
     <w:multiLevelType w:val="multilevel"/>
     <w:tmpl w:val="837499F4"/>
@@ -11676,10 +14406,96 @@
       </w:rPr>
     </w:lvl>
   </w:abstractNum>
-  <w:abstractNum w:abstractNumId="13" w15:restartNumberingAfterBreak="0">
+  <w:abstractNum w:abstractNumId="15" w15:restartNumberingAfterBreak="0">
+    <w:nsid w:val="348B76C1"/>
+    <w:multiLevelType w:val="hybridMultilevel"/>
+    <w:tmpl w:val="12464518"/>
+    <w:lvl w:ilvl="0" w:tplc="40090013">
+      <w:start w:val="1"/>
+      <w:numFmt w:val="upperRoman"/>
+      <w:lvlText w:val="%1."/>
+      <w:lvlJc w:val="right"/>
+      <w:pPr>
+        <w:ind w:left="1080" w:hanging="360"/>
+      </w:pPr>
+    </w:lvl>
+    <w:lvl w:ilvl="1" w:tplc="40090019" w:tentative="1">
+      <w:start w:val="1"/>
+      <w:numFmt w:val="lowerLetter"/>
+      <w:lvlText w:val="%2."/>
+      <w:lvlJc w:val="left"/>
+      <w:pPr>
+        <w:ind w:left="1800" w:hanging="360"/>
+      </w:pPr>
+    </w:lvl>
+    <w:lvl w:ilvl="2" w:tplc="4009001B" w:tentative="1">
+      <w:start w:val="1"/>
+      <w:numFmt w:val="lowerRoman"/>
+      <w:lvlText w:val="%3."/>
+      <w:lvlJc w:val="right"/>
+      <w:pPr>
+        <w:ind w:left="2520" w:hanging="180"/>
+      </w:pPr>
+    </w:lvl>
+    <w:lvl w:ilvl="3" w:tplc="4009000F" w:tentative="1">
+      <w:start w:val="1"/>
+      <w:numFmt w:val="decimal"/>
+      <w:lvlText w:val="%4."/>
+      <w:lvlJc w:val="left"/>
+      <w:pPr>
+        <w:ind w:left="3240" w:hanging="360"/>
+      </w:pPr>
+    </w:lvl>
+    <w:lvl w:ilvl="4" w:tplc="40090019" w:tentative="1">
+      <w:start w:val="1"/>
+      <w:numFmt w:val="lowerLetter"/>
+      <w:lvlText w:val="%5."/>
+      <w:lvlJc w:val="left"/>
+      <w:pPr>
+        <w:ind w:left="3960" w:hanging="360"/>
+      </w:pPr>
+    </w:lvl>
+    <w:lvl w:ilvl="5" w:tplc="4009001B" w:tentative="1">
+      <w:start w:val="1"/>
+      <w:numFmt w:val="lowerRoman"/>
+      <w:lvlText w:val="%6."/>
+      <w:lvlJc w:val="right"/>
+      <w:pPr>
+        <w:ind w:left="4680" w:hanging="180"/>
+      </w:pPr>
+    </w:lvl>
+    <w:lvl w:ilvl="6" w:tplc="4009000F" w:tentative="1">
+      <w:start w:val="1"/>
+      <w:numFmt w:val="decimal"/>
+      <w:lvlText w:val="%7."/>
+      <w:lvlJc w:val="left"/>
+      <w:pPr>
+        <w:ind w:left="5400" w:hanging="360"/>
+      </w:pPr>
+    </w:lvl>
+    <w:lvl w:ilvl="7" w:tplc="40090019" w:tentative="1">
+      <w:start w:val="1"/>
+      <w:numFmt w:val="lowerLetter"/>
+      <w:lvlText w:val="%8."/>
+      <w:lvlJc w:val="left"/>
+      <w:pPr>
+        <w:ind w:left="6120" w:hanging="360"/>
+      </w:pPr>
+    </w:lvl>
+    <w:lvl w:ilvl="8" w:tplc="4009001B" w:tentative="1">
+      <w:start w:val="1"/>
+      <w:numFmt w:val="lowerRoman"/>
+      <w:lvlText w:val="%9."/>
+      <w:lvlJc w:val="right"/>
+      <w:pPr>
+        <w:ind w:left="6840" w:hanging="180"/>
+      </w:pPr>
+    </w:lvl>
+  </w:abstractNum>
+  <w:abstractNum w:abstractNumId="16" w15:restartNumberingAfterBreak="0">
     <w:nsid w:val="3B0500EB"/>
     <w:multiLevelType w:val="multilevel"/>
-    <w:tmpl w:val="BE9E2940"/>
+    <w:tmpl w:val="433CE478"/>
     <w:lvl w:ilvl="0">
       <w:start w:val="1"/>
       <w:numFmt w:val="bullet"/>
@@ -11696,20 +14512,16 @@
         <w:sz w:val="20"/>
       </w:rPr>
     </w:lvl>
-    <w:lvl w:ilvl="1" w:tentative="1">
-      <w:start w:val="1"/>
-      <w:numFmt w:val="bullet"/>
-      <w:lvlText w:val="o"/>
-      <w:lvlJc w:val="left"/>
-      <w:pPr>
-        <w:tabs>
-          <w:tab w:val="num" w:pos="1440"/>
-        </w:tabs>
+    <w:lvl w:ilvl="1">
+      <w:start w:val="1"/>
+      <w:numFmt w:val="decimal"/>
+      <w:lvlText w:val="%2."/>
+      <w:lvlJc w:val="left"/>
+      <w:pPr>
         <w:ind w:left="1440" w:hanging="360"/>
       </w:pPr>
       <w:rPr>
-        <w:rFonts w:ascii="Courier New" w:hAnsi="Courier New" w:hint="default"/>
-        <w:sz w:val="20"/>
+        <w:rFonts w:hint="default"/>
       </w:rPr>
     </w:lvl>
     <w:lvl w:ilvl="2" w:tentative="1">
@@ -11825,7 +14637,7 @@
       </w:rPr>
     </w:lvl>
   </w:abstractNum>
-  <w:abstractNum w:abstractNumId="14" w15:restartNumberingAfterBreak="0">
+  <w:abstractNum w:abstractNumId="17" w15:restartNumberingAfterBreak="0">
     <w:nsid w:val="3B29525C"/>
     <w:multiLevelType w:val="multilevel"/>
     <w:tmpl w:val="BD342C52"/>
@@ -11974,7 +14786,7 @@
       </w:rPr>
     </w:lvl>
   </w:abstractNum>
-  <w:abstractNum w:abstractNumId="15" w15:restartNumberingAfterBreak="0">
+  <w:abstractNum w:abstractNumId="18" w15:restartNumberingAfterBreak="0">
     <w:nsid w:val="3FA14EDD"/>
     <w:multiLevelType w:val="hybridMultilevel"/>
     <w:tmpl w:val="91D29AA0"/>
@@ -12060,7 +14872,7 @@
       </w:pPr>
     </w:lvl>
   </w:abstractNum>
-  <w:abstractNum w:abstractNumId="16" w15:restartNumberingAfterBreak="0">
+  <w:abstractNum w:abstractNumId="19" w15:restartNumberingAfterBreak="0">
     <w:nsid w:val="4910299B"/>
     <w:multiLevelType w:val="hybridMultilevel"/>
     <w:tmpl w:val="505E8358"/>
@@ -12149,7 +14961,7 @@
       </w:pPr>
     </w:lvl>
   </w:abstractNum>
-  <w:abstractNum w:abstractNumId="17" w15:restartNumberingAfterBreak="0">
+  <w:abstractNum w:abstractNumId="20" w15:restartNumberingAfterBreak="0">
     <w:nsid w:val="4C9C522C"/>
     <w:multiLevelType w:val="hybridMultilevel"/>
     <w:tmpl w:val="9CF4E540"/>
@@ -12238,7 +15050,7 @@
       </w:pPr>
     </w:lvl>
   </w:abstractNum>
-  <w:abstractNum w:abstractNumId="18" w15:restartNumberingAfterBreak="0">
+  <w:abstractNum w:abstractNumId="21" w15:restartNumberingAfterBreak="0">
     <w:nsid w:val="4D9C1836"/>
     <w:multiLevelType w:val="multilevel"/>
     <w:tmpl w:val="FF88B6DE"/>
@@ -12387,7 +15199,7 @@
       </w:rPr>
     </w:lvl>
   </w:abstractNum>
-  <w:abstractNum w:abstractNumId="19" w15:restartNumberingAfterBreak="0">
+  <w:abstractNum w:abstractNumId="22" w15:restartNumberingAfterBreak="0">
     <w:nsid w:val="52F00AF7"/>
     <w:multiLevelType w:val="multilevel"/>
     <w:tmpl w:val="D30886D8"/>
@@ -12536,7 +15348,7 @@
       </w:rPr>
     </w:lvl>
   </w:abstractNum>
-  <w:abstractNum w:abstractNumId="20" w15:restartNumberingAfterBreak="0">
+  <w:abstractNum w:abstractNumId="23" w15:restartNumberingAfterBreak="0">
     <w:nsid w:val="54F573AB"/>
     <w:multiLevelType w:val="hybridMultilevel"/>
     <w:tmpl w:val="AC56D67E"/>
@@ -12648,7 +15460,7 @@
       </w:rPr>
     </w:lvl>
   </w:abstractNum>
-  <w:abstractNum w:abstractNumId="21" w15:restartNumberingAfterBreak="0">
+  <w:abstractNum w:abstractNumId="24" w15:restartNumberingAfterBreak="0">
     <w:nsid w:val="5B382BCC"/>
     <w:multiLevelType w:val="multilevel"/>
     <w:tmpl w:val="E92034E6"/>
@@ -12761,7 +15573,7 @@
       </w:pPr>
     </w:lvl>
   </w:abstractNum>
-  <w:abstractNum w:abstractNumId="22" w15:restartNumberingAfterBreak="0">
+  <w:abstractNum w:abstractNumId="25" w15:restartNumberingAfterBreak="0">
     <w:nsid w:val="60643375"/>
     <w:multiLevelType w:val="multilevel"/>
     <w:tmpl w:val="9E1E6100"/>
@@ -12910,7 +15722,97 @@
       </w:rPr>
     </w:lvl>
   </w:abstractNum>
-  <w:abstractNum w:abstractNumId="23" w15:restartNumberingAfterBreak="0">
+  <w:abstractNum w:abstractNumId="26" w15:restartNumberingAfterBreak="0">
+    <w:nsid w:val="610849FF"/>
+    <w:multiLevelType w:val="hybridMultilevel"/>
+    <w:tmpl w:val="55C02BF8"/>
+    <w:lvl w:ilvl="0" w:tplc="4009000F">
+      <w:start w:val="1"/>
+      <w:numFmt w:val="decimal"/>
+      <w:lvlText w:val="%1."/>
+      <w:lvlJc w:val="left"/>
+      <w:pPr>
+        <w:ind w:left="720" w:hanging="360"/>
+      </w:pPr>
+      <w:rPr>
+        <w:rFonts w:hint="default"/>
+        <w:b w:val="0"/>
+      </w:rPr>
+    </w:lvl>
+    <w:lvl w:ilvl="1" w:tplc="40090019">
+      <w:start w:val="1"/>
+      <w:numFmt w:val="lowerLetter"/>
+      <w:lvlText w:val="%2."/>
+      <w:lvlJc w:val="left"/>
+      <w:pPr>
+        <w:ind w:left="1440" w:hanging="360"/>
+      </w:pPr>
+    </w:lvl>
+    <w:lvl w:ilvl="2" w:tplc="4009001B" w:tentative="1">
+      <w:start w:val="1"/>
+      <w:numFmt w:val="lowerRoman"/>
+      <w:lvlText w:val="%3."/>
+      <w:lvlJc w:val="right"/>
+      <w:pPr>
+        <w:ind w:left="2160" w:hanging="180"/>
+      </w:pPr>
+    </w:lvl>
+    <w:lvl w:ilvl="3" w:tplc="4009000F" w:tentative="1">
+      <w:start w:val="1"/>
+      <w:numFmt w:val="decimal"/>
+      <w:lvlText w:val="%4."/>
+      <w:lvlJc w:val="left"/>
+      <w:pPr>
+        <w:ind w:left="2880" w:hanging="360"/>
+      </w:pPr>
+    </w:lvl>
+    <w:lvl w:ilvl="4" w:tplc="40090019" w:tentative="1">
+      <w:start w:val="1"/>
+      <w:numFmt w:val="lowerLetter"/>
+      <w:lvlText w:val="%5."/>
+      <w:lvlJc w:val="left"/>
+      <w:pPr>
+        <w:ind w:left="3600" w:hanging="360"/>
+      </w:pPr>
+    </w:lvl>
+    <w:lvl w:ilvl="5" w:tplc="4009001B" w:tentative="1">
+      <w:start w:val="1"/>
+      <w:numFmt w:val="lowerRoman"/>
+      <w:lvlText w:val="%6."/>
+      <w:lvlJc w:val="right"/>
+      <w:pPr>
+        <w:ind w:left="4320" w:hanging="180"/>
+      </w:pPr>
+    </w:lvl>
+    <w:lvl w:ilvl="6" w:tplc="4009000F" w:tentative="1">
+      <w:start w:val="1"/>
+      <w:numFmt w:val="decimal"/>
+      <w:lvlText w:val="%7."/>
+      <w:lvlJc w:val="left"/>
+      <w:pPr>
+        <w:ind w:left="5040" w:hanging="360"/>
+      </w:pPr>
+    </w:lvl>
+    <w:lvl w:ilvl="7" w:tplc="40090019" w:tentative="1">
+      <w:start w:val="1"/>
+      <w:numFmt w:val="lowerLetter"/>
+      <w:lvlText w:val="%8."/>
+      <w:lvlJc w:val="left"/>
+      <w:pPr>
+        <w:ind w:left="5760" w:hanging="360"/>
+      </w:pPr>
+    </w:lvl>
+    <w:lvl w:ilvl="8" w:tplc="4009001B" w:tentative="1">
+      <w:start w:val="1"/>
+      <w:numFmt w:val="lowerRoman"/>
+      <w:lvlText w:val="%9."/>
+      <w:lvlJc w:val="right"/>
+      <w:pPr>
+        <w:ind w:left="6480" w:hanging="180"/>
+      </w:pPr>
+    </w:lvl>
+  </w:abstractNum>
+  <w:abstractNum w:abstractNumId="27" w15:restartNumberingAfterBreak="0">
     <w:nsid w:val="62B46CBE"/>
     <w:multiLevelType w:val="hybridMultilevel"/>
     <w:tmpl w:val="E7B8FE0C"/>
@@ -13022,7 +15924,7 @@
       </w:rPr>
     </w:lvl>
   </w:abstractNum>
-  <w:abstractNum w:abstractNumId="24" w15:restartNumberingAfterBreak="0">
+  <w:abstractNum w:abstractNumId="28" w15:restartNumberingAfterBreak="0">
     <w:nsid w:val="64E87168"/>
     <w:multiLevelType w:val="hybridMultilevel"/>
     <w:tmpl w:val="6E6ED9EC"/>
@@ -13111,7 +16013,96 @@
       </w:pPr>
     </w:lvl>
   </w:abstractNum>
-  <w:abstractNum w:abstractNumId="25" w15:restartNumberingAfterBreak="0">
+  <w:abstractNum w:abstractNumId="29" w15:restartNumberingAfterBreak="0">
+    <w:nsid w:val="650943A7"/>
+    <w:multiLevelType w:val="hybridMultilevel"/>
+    <w:tmpl w:val="645A5F38"/>
+    <w:lvl w:ilvl="0" w:tplc="4009000F">
+      <w:start w:val="1"/>
+      <w:numFmt w:val="decimal"/>
+      <w:lvlText w:val="%1."/>
+      <w:lvlJc w:val="left"/>
+      <w:pPr>
+        <w:ind w:left="720" w:hanging="360"/>
+      </w:pPr>
+      <w:rPr>
+        <w:rFonts w:hint="default"/>
+      </w:rPr>
+    </w:lvl>
+    <w:lvl w:ilvl="1" w:tplc="40090019" w:tentative="1">
+      <w:start w:val="1"/>
+      <w:numFmt w:val="lowerLetter"/>
+      <w:lvlText w:val="%2."/>
+      <w:lvlJc w:val="left"/>
+      <w:pPr>
+        <w:ind w:left="1440" w:hanging="360"/>
+      </w:pPr>
+    </w:lvl>
+    <w:lvl w:ilvl="2" w:tplc="4009001B" w:tentative="1">
+      <w:start w:val="1"/>
+      <w:numFmt w:val="lowerRoman"/>
+      <w:lvlText w:val="%3."/>
+      <w:lvlJc w:val="right"/>
+      <w:pPr>
+        <w:ind w:left="2160" w:hanging="180"/>
+      </w:pPr>
+    </w:lvl>
+    <w:lvl w:ilvl="3" w:tplc="4009000F" w:tentative="1">
+      <w:start w:val="1"/>
+      <w:numFmt w:val="decimal"/>
+      <w:lvlText w:val="%4."/>
+      <w:lvlJc w:val="left"/>
+      <w:pPr>
+        <w:ind w:left="2880" w:hanging="360"/>
+      </w:pPr>
+    </w:lvl>
+    <w:lvl w:ilvl="4" w:tplc="40090019" w:tentative="1">
+      <w:start w:val="1"/>
+      <w:numFmt w:val="lowerLetter"/>
+      <w:lvlText w:val="%5."/>
+      <w:lvlJc w:val="left"/>
+      <w:pPr>
+        <w:ind w:left="3600" w:hanging="360"/>
+      </w:pPr>
+    </w:lvl>
+    <w:lvl w:ilvl="5" w:tplc="4009001B" w:tentative="1">
+      <w:start w:val="1"/>
+      <w:numFmt w:val="lowerRoman"/>
+      <w:lvlText w:val="%6."/>
+      <w:lvlJc w:val="right"/>
+      <w:pPr>
+        <w:ind w:left="4320" w:hanging="180"/>
+      </w:pPr>
+    </w:lvl>
+    <w:lvl w:ilvl="6" w:tplc="4009000F" w:tentative="1">
+      <w:start w:val="1"/>
+      <w:numFmt w:val="decimal"/>
+      <w:lvlText w:val="%7."/>
+      <w:lvlJc w:val="left"/>
+      <w:pPr>
+        <w:ind w:left="5040" w:hanging="360"/>
+      </w:pPr>
+    </w:lvl>
+    <w:lvl w:ilvl="7" w:tplc="40090019" w:tentative="1">
+      <w:start w:val="1"/>
+      <w:numFmt w:val="lowerLetter"/>
+      <w:lvlText w:val="%8."/>
+      <w:lvlJc w:val="left"/>
+      <w:pPr>
+        <w:ind w:left="5760" w:hanging="360"/>
+      </w:pPr>
+    </w:lvl>
+    <w:lvl w:ilvl="8" w:tplc="4009001B" w:tentative="1">
+      <w:start w:val="1"/>
+      <w:numFmt w:val="lowerRoman"/>
+      <w:lvlText w:val="%9."/>
+      <w:lvlJc w:val="right"/>
+      <w:pPr>
+        <w:ind w:left="6480" w:hanging="180"/>
+      </w:pPr>
+    </w:lvl>
+  </w:abstractNum>
+  <w:abstractNum w:abstractNumId="30" w15:restartNumberingAfterBreak="0">
     <w:nsid w:val="67B8422E"/>
     <w:multiLevelType w:val="multilevel"/>
     <w:tmpl w:val="63226B6C"/>
@@ -13260,7 +16251,7 @@
       </w:rPr>
     </w:lvl>
   </w:abstractNum>
-  <w:abstractNum w:abstractNumId="26" w15:restartNumberingAfterBreak="0">
+  <w:abstractNum w:abstractNumId="31" w15:restartNumberingAfterBreak="0">
     <w:nsid w:val="6DA059D8"/>
     <w:multiLevelType w:val="hybridMultilevel"/>
     <w:tmpl w:val="41361528"/>
@@ -13349,7 +16340,7 @@
       </w:pPr>
     </w:lvl>
   </w:abstractNum>
-  <w:abstractNum w:abstractNumId="27" w15:restartNumberingAfterBreak="0">
+  <w:abstractNum w:abstractNumId="32" w15:restartNumberingAfterBreak="0">
     <w:nsid w:val="6E8837C6"/>
     <w:multiLevelType w:val="multilevel"/>
     <w:tmpl w:val="A9D4A140"/>
@@ -13498,7 +16489,7 @@
       </w:rPr>
     </w:lvl>
   </w:abstractNum>
-  <w:abstractNum w:abstractNumId="28" w15:restartNumberingAfterBreak="0">
+  <w:abstractNum w:abstractNumId="33" w15:restartNumberingAfterBreak="0">
     <w:nsid w:val="70F25655"/>
     <w:multiLevelType w:val="multilevel"/>
     <w:tmpl w:val="8C94A98C"/>
@@ -13647,7 +16638,7 @@
       </w:rPr>
     </w:lvl>
   </w:abstractNum>
-  <w:abstractNum w:abstractNumId="29" w15:restartNumberingAfterBreak="0">
+  <w:abstractNum w:abstractNumId="34" w15:restartNumberingAfterBreak="0">
     <w:nsid w:val="71313F1D"/>
     <w:multiLevelType w:val="multilevel"/>
     <w:tmpl w:val="FA5E9B7A"/>
@@ -13796,7 +16787,7 @@
       </w:rPr>
     </w:lvl>
   </w:abstractNum>
-  <w:abstractNum w:abstractNumId="30" w15:restartNumberingAfterBreak="0">
+  <w:abstractNum w:abstractNumId="35" w15:restartNumberingAfterBreak="0">
     <w:nsid w:val="717F6C7F"/>
     <w:multiLevelType w:val="hybridMultilevel"/>
     <w:tmpl w:val="F8E07416"/>
@@ -13885,7 +16876,7 @@
       </w:pPr>
     </w:lvl>
   </w:abstractNum>
-  <w:abstractNum w:abstractNumId="31" w15:restartNumberingAfterBreak="0">
+  <w:abstractNum w:abstractNumId="36" w15:restartNumberingAfterBreak="0">
     <w:nsid w:val="732116E7"/>
     <w:multiLevelType w:val="multilevel"/>
     <w:tmpl w:val="C352BCF6"/>
@@ -14034,7 +17025,7 @@
       </w:rPr>
     </w:lvl>
   </w:abstractNum>
-  <w:abstractNum w:abstractNumId="32" w15:restartNumberingAfterBreak="0">
+  <w:abstractNum w:abstractNumId="37" w15:restartNumberingAfterBreak="0">
     <w:nsid w:val="76637F62"/>
     <w:multiLevelType w:val="hybridMultilevel"/>
     <w:tmpl w:val="9A9837A2"/>
@@ -14123,7 +17114,7 @@
       </w:pPr>
     </w:lvl>
   </w:abstractNum>
-  <w:abstractNum w:abstractNumId="33" w15:restartNumberingAfterBreak="0">
+  <w:abstractNum w:abstractNumId="38" w15:restartNumberingAfterBreak="0">
     <w:nsid w:val="769B769C"/>
     <w:multiLevelType w:val="multilevel"/>
     <w:tmpl w:val="32F4216E"/>
@@ -14272,7 +17263,7 @@
       </w:rPr>
     </w:lvl>
   </w:abstractNum>
-  <w:abstractNum w:abstractNumId="34" w15:restartNumberingAfterBreak="0">
+  <w:abstractNum w:abstractNumId="39" w15:restartNumberingAfterBreak="0">
     <w:nsid w:val="79601C6D"/>
     <w:multiLevelType w:val="multilevel"/>
     <w:tmpl w:val="78002C54"/>
@@ -14385,7 +17376,7 @@
       </w:pPr>
     </w:lvl>
   </w:abstractNum>
-  <w:abstractNum w:abstractNumId="35" w15:restartNumberingAfterBreak="0">
+  <w:abstractNum w:abstractNumId="40" w15:restartNumberingAfterBreak="0">
     <w:nsid w:val="7BF407E3"/>
     <w:multiLevelType w:val="multilevel"/>
     <w:tmpl w:val="9A74D01E"/>
@@ -14534,7 +17525,7 @@
       </w:rPr>
     </w:lvl>
   </w:abstractNum>
-  <w:abstractNum w:abstractNumId="36" w15:restartNumberingAfterBreak="0">
+  <w:abstractNum w:abstractNumId="41" w15:restartNumberingAfterBreak="0">
     <w:nsid w:val="7D823498"/>
     <w:multiLevelType w:val="multilevel"/>
     <w:tmpl w:val="E9446EE8"/>
@@ -14683,7 +17674,7 @@
       </w:rPr>
     </w:lvl>
   </w:abstractNum>
-  <w:abstractNum w:abstractNumId="37" w15:restartNumberingAfterBreak="0">
+  <w:abstractNum w:abstractNumId="42" w15:restartNumberingAfterBreak="0">
     <w:nsid w:val="7EDB69E2"/>
     <w:multiLevelType w:val="multilevel"/>
     <w:tmpl w:val="AD46CEC2"/>
@@ -14833,118 +17824,136 @@
     </w:lvl>
   </w:abstractNum>
   <w:num w:numId="1" w16cid:durableId="1490903148">
-    <w:abstractNumId w:val="8"/>
+    <w:abstractNumId w:val="10"/>
   </w:num>
   <w:num w:numId="2" w16cid:durableId="999424346">
-    <w:abstractNumId w:val="19"/>
+    <w:abstractNumId w:val="22"/>
   </w:num>
   <w:num w:numId="3" w16cid:durableId="1325819858">
-    <w:abstractNumId w:val="21"/>
+    <w:abstractNumId w:val="24"/>
   </w:num>
   <w:num w:numId="4" w16cid:durableId="133182302">
     <w:abstractNumId w:val="3"/>
   </w:num>
   <w:num w:numId="5" w16cid:durableId="1477799212">
+    <w:abstractNumId w:val="27"/>
+  </w:num>
+  <w:num w:numId="6" w16cid:durableId="1507357191">
     <w:abstractNumId w:val="23"/>
   </w:num>
-  <w:num w:numId="6" w16cid:durableId="1507357191">
+  <w:num w:numId="7" w16cid:durableId="1234849977">
+    <w:abstractNumId w:val="31"/>
+  </w:num>
+  <w:num w:numId="8" w16cid:durableId="2095319065">
     <w:abstractNumId w:val="20"/>
   </w:num>
-  <w:num w:numId="7" w16cid:durableId="1234849977">
-    <w:abstractNumId w:val="26"/>
-  </w:num>
-  <w:num w:numId="8" w16cid:durableId="2095319065">
-    <w:abstractNumId w:val="17"/>
-  </w:num>
   <w:num w:numId="9" w16cid:durableId="1276062488">
-    <w:abstractNumId w:val="30"/>
+    <w:abstractNumId w:val="35"/>
   </w:num>
   <w:num w:numId="10" w16cid:durableId="301732449">
-    <w:abstractNumId w:val="32"/>
+    <w:abstractNumId w:val="37"/>
   </w:num>
   <w:num w:numId="11" w16cid:durableId="565268006">
-    <w:abstractNumId w:val="24"/>
+    <w:abstractNumId w:val="28"/>
   </w:num>
   <w:num w:numId="12" w16cid:durableId="1765566125">
-    <w:abstractNumId w:val="6"/>
+    <w:abstractNumId w:val="7"/>
   </w:num>
   <w:num w:numId="13" w16cid:durableId="1685395611">
-    <w:abstractNumId w:val="16"/>
+    <w:abstractNumId w:val="19"/>
   </w:num>
   <w:num w:numId="14" w16cid:durableId="371853232">
-    <w:abstractNumId w:val="7"/>
+    <w:abstractNumId w:val="9"/>
   </w:num>
   <w:num w:numId="15" w16cid:durableId="1233125880">
-    <w:abstractNumId w:val="15"/>
+    <w:abstractNumId w:val="18"/>
   </w:num>
   <w:num w:numId="16" w16cid:durableId="1600603824">
-    <w:abstractNumId w:val="22"/>
+    <w:abstractNumId w:val="25"/>
   </w:num>
   <w:num w:numId="17" w16cid:durableId="1336306445">
-    <w:abstractNumId w:val="4"/>
+    <w:abstractNumId w:val="5"/>
   </w:num>
   <w:num w:numId="18" w16cid:durableId="1924684374">
-    <w:abstractNumId w:val="9"/>
+    <w:abstractNumId w:val="11"/>
   </w:num>
   <w:num w:numId="19" w16cid:durableId="210307738">
-    <w:abstractNumId w:val="29"/>
+    <w:abstractNumId w:val="34"/>
   </w:num>
   <w:num w:numId="20" w16cid:durableId="1427000618">
-    <w:abstractNumId w:val="27"/>
+    <w:abstractNumId w:val="32"/>
   </w:num>
   <w:num w:numId="21" w16cid:durableId="853761629">
     <w:abstractNumId w:val="0"/>
   </w:num>
   <w:num w:numId="22" w16cid:durableId="1388920533">
-    <w:abstractNumId w:val="31"/>
+    <w:abstractNumId w:val="36"/>
   </w:num>
   <w:num w:numId="23" w16cid:durableId="278532805">
-    <w:abstractNumId w:val="34"/>
+    <w:abstractNumId w:val="39"/>
   </w:num>
   <w:num w:numId="24" w16cid:durableId="76437811">
-    <w:abstractNumId w:val="18"/>
+    <w:abstractNumId w:val="21"/>
   </w:num>
   <w:num w:numId="25" w16cid:durableId="49349885">
-    <w:abstractNumId w:val="11"/>
+    <w:abstractNumId w:val="13"/>
   </w:num>
   <w:num w:numId="26" w16cid:durableId="1078861533">
     <w:abstractNumId w:val="1"/>
   </w:num>
   <w:num w:numId="27" w16cid:durableId="1645961168">
-    <w:abstractNumId w:val="14"/>
+    <w:abstractNumId w:val="17"/>
   </w:num>
   <w:num w:numId="28" w16cid:durableId="538661812">
     <w:abstractNumId w:val="2"/>
   </w:num>
   <w:num w:numId="29" w16cid:durableId="2143110771">
+    <w:abstractNumId w:val="38"/>
+  </w:num>
+  <w:num w:numId="30" w16cid:durableId="20129419">
     <w:abstractNumId w:val="33"/>
   </w:num>
-  <w:num w:numId="30" w16cid:durableId="20129419">
-    <w:abstractNumId w:val="28"/>
-  </w:num>
   <w:num w:numId="31" w16cid:durableId="1258295610">
-    <w:abstractNumId w:val="25"/>
+    <w:abstractNumId w:val="30"/>
   </w:num>
   <w:num w:numId="32" w16cid:durableId="1966346223">
-    <w:abstractNumId w:val="5"/>
+    <w:abstractNumId w:val="6"/>
   </w:num>
   <w:num w:numId="33" w16cid:durableId="219757389">
-    <w:abstractNumId w:val="36"/>
+    <w:abstractNumId w:val="41"/>
   </w:num>
   <w:num w:numId="34" w16cid:durableId="1441219298">
+    <w:abstractNumId w:val="14"/>
+  </w:num>
+  <w:num w:numId="35" w16cid:durableId="993533201">
     <w:abstractNumId w:val="12"/>
   </w:num>
-  <w:num w:numId="35" w16cid:durableId="993533201">
-    <w:abstractNumId w:val="10"/>
-  </w:num>
   <w:num w:numId="36" w16cid:durableId="2136486854">
-    <w:abstractNumId w:val="13"/>
+    <w:abstractNumId w:val="16"/>
   </w:num>
   <w:num w:numId="37" w16cid:durableId="1370228645">
-    <w:abstractNumId w:val="37"/>
+    <w:abstractNumId w:val="42"/>
   </w:num>
   <w:num w:numId="38" w16cid:durableId="1445344642">
-    <w:abstractNumId w:val="35"/>
+    <w:abstractNumId w:val="40"/>
+  </w:num>
+  <w:num w:numId="39" w16cid:durableId="1738094195">
+    <w:abstractNumId w:val="26"/>
+  </w:num>
+  <w:num w:numId="40" w16cid:durableId="1354649103">
+    <w:abstractNumId w:val="4"/>
+  </w:num>
+  <w:num w:numId="41" w16cid:durableId="1829319484">
+    <w:abstractNumId w:val="29"/>
+  </w:num>
+  <w:num w:numId="42" w16cid:durableId="1204514837">
+    <w:abstractNumId w:val="15"/>
+  </w:num>
+  <w:num w:numId="43" w16cid:durableId="1054308977">
+    <w:abstractNumId w:val="8"/>
+  </w:num>
+  <w:num w:numId="44" w16cid:durableId="1027213973">
+    <w:abstractNumId w:val="23"/>
   </w:num>
 </w:numbering>
 </file>

</xml_diff>

<commit_message>
SQL and python assignment
</commit_message>
<xml_diff>
--- a/QS SQL/SQL Class Notes.docx
+++ b/QS SQL/SQL Class Notes.docx
@@ -1887,14 +1887,12 @@
       <w:r>
         <w:t xml:space="preserve">Data stored in </w:t>
       </w:r>
-      <w:proofErr w:type="gramStart"/>
       <w:r>
         <w:rPr>
           <w:rStyle w:val="Strong"/>
         </w:rPr>
-        <w:t>tables</w:t>
-      </w:r>
-      <w:proofErr w:type="gramEnd"/>
+        <w:t>tables.</w:t>
+      </w:r>
     </w:p>
     <w:p>
       <w:pPr>
@@ -1906,33 +1904,6 @@
       </w:pPr>
       <w:r>
         <w:t>Relationships between tables</w:t>
-      </w:r>
-    </w:p>
-    <w:p>
-      <w:pPr>
-        <w:pStyle w:val="NormalWeb"/>
-        <w:numPr>
-          <w:ilvl w:val="0"/>
-          <w:numId w:val="22"/>
-        </w:numPr>
-      </w:pPr>
-      <w:r>
-        <w:rPr>
-          <w:rStyle w:val="Strong"/>
-        </w:rPr>
-        <w:t>Security &amp; Authorization</w:t>
-      </w:r>
-    </w:p>
-    <w:p>
-      <w:pPr>
-        <w:pStyle w:val="NormalWeb"/>
-        <w:numPr>
-          <w:ilvl w:val="0"/>
-          <w:numId w:val="22"/>
-        </w:numPr>
-      </w:pPr>
-      <w:r>
-        <w:t>Data integrity and consistency</w:t>
       </w:r>
     </w:p>
     <w:p>
@@ -1951,13 +1922,13 @@
         <mc:AlternateContent>
           <mc:Choice Requires="wps">
             <w:drawing>
-              <wp:anchor distT="0" distB="0" distL="114300" distR="114300" simplePos="0" relativeHeight="251670528" behindDoc="0" locked="0" layoutInCell="1" allowOverlap="1" wp14:anchorId="361AC846" wp14:editId="386AD6C1">
+              <wp:anchor distT="0" distB="0" distL="114300" distR="114300" simplePos="0" relativeHeight="251670528" behindDoc="0" locked="0" layoutInCell="1" allowOverlap="1" wp14:anchorId="361AC846" wp14:editId="0423BA0F">
                 <wp:simplePos x="0" y="0"/>
                 <wp:positionH relativeFrom="column">
-                  <wp:posOffset>2263140</wp:posOffset>
+                  <wp:posOffset>3802380</wp:posOffset>
                 </wp:positionH>
                 <wp:positionV relativeFrom="paragraph">
-                  <wp:posOffset>1543685</wp:posOffset>
+                  <wp:posOffset>73025</wp:posOffset>
                 </wp:positionV>
                 <wp:extent cx="1057275" cy="914400"/>
                 <wp:effectExtent l="0" t="0" r="28575" b="19050"/>
@@ -2010,15 +1981,42 @@
           </mc:Choice>
           <mc:Fallback>
             <w:pict>
-              <v:shapetype w14:anchorId="0E4B45E5" id="_x0000_t113" coordsize="21600,21600" o:spt="113" path="m,l,21600r21600,l21600,xem4236,nfl4236,21600em,4236nfl21600,4236e">
+              <v:shapetype w14:anchorId="092024EE" id="_x0000_t113" coordsize="21600,21600" o:spt="113" path="m,l,21600r21600,l21600,xem4236,nfl4236,21600em,4236nfl21600,4236e">
                 <v:stroke joinstyle="miter"/>
                 <v:path o:extrusionok="f" gradientshapeok="t" o:connecttype="rect" textboxrect="4236,4236,21600,21600"/>
               </v:shapetype>
-              <v:shape id="Flowchart: Internal Storage 8" o:spid="_x0000_s1026" type="#_x0000_t113" style="position:absolute;margin-left:178.2pt;margin-top:121.55pt;width:83.25pt;height:1in;z-index:251670528;visibility:visible;mso-wrap-style:square;mso-wrap-distance-left:9pt;mso-wrap-distance-top:0;mso-wrap-distance-right:9pt;mso-wrap-distance-bottom:0;mso-position-horizontal:absolute;mso-position-horizontal-relative:text;mso-position-vertical:absolute;mso-position-vertical-relative:text;v-text-anchor:middle" o:gfxdata="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" fillcolor="white [3201]" strokecolor="black [3213]" strokeweight="1pt"/>
+              <v:shape id="Flowchart: Internal Storage 8" o:spid="_x0000_s1026" type="#_x0000_t113" style="position:absolute;margin-left:299.4pt;margin-top:5.75pt;width:83.25pt;height:1in;z-index:251670528;visibility:visible;mso-wrap-style:square;mso-wrap-distance-left:9pt;mso-wrap-distance-top:0;mso-wrap-distance-right:9pt;mso-wrap-distance-bottom:0;mso-position-horizontal:absolute;mso-position-horizontal-relative:text;mso-position-vertical:absolute;mso-position-vertical-relative:text;v-text-anchor:middle" o:gfxdata="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" fillcolor="white [3201]" strokecolor="black [3213]" strokeweight="1pt"/>
             </w:pict>
           </mc:Fallback>
         </mc:AlternateContent>
       </w:r>
+      <w:r>
+        <w:rPr>
+          <w:rStyle w:val="Strong"/>
+        </w:rPr>
+        <w:t>Security &amp; Authorization</w:t>
+      </w:r>
+    </w:p>
+    <w:p>
+      <w:pPr>
+        <w:pStyle w:val="NormalWeb"/>
+        <w:numPr>
+          <w:ilvl w:val="0"/>
+          <w:numId w:val="22"/>
+        </w:numPr>
+      </w:pPr>
+      <w:r>
+        <w:t>Data integrity and consistency</w:t>
+      </w:r>
+    </w:p>
+    <w:p>
+      <w:pPr>
+        <w:pStyle w:val="NormalWeb"/>
+        <w:numPr>
+          <w:ilvl w:val="0"/>
+          <w:numId w:val="22"/>
+        </w:numPr>
+      </w:pPr>
       <w:r>
         <w:t>SQL-based data management</w:t>
       </w:r>
@@ -3352,25 +3350,7 @@
           <w:sz w:val="28"/>
           <w:szCs w:val="28"/>
         </w:rPr>
-        <w:t xml:space="preserve">The data </w:t>
-      </w:r>
-      <w:proofErr w:type="gramStart"/>
-      <w:r>
-        <w:rPr>
-          <w:rFonts w:cstheme="minorHAnsi"/>
-          <w:sz w:val="28"/>
-          <w:szCs w:val="28"/>
-        </w:rPr>
-        <w:t>enter into</w:t>
-      </w:r>
-      <w:proofErr w:type="gramEnd"/>
-      <w:r>
-        <w:rPr>
-          <w:rFonts w:cstheme="minorHAnsi"/>
-          <w:sz w:val="28"/>
-          <w:szCs w:val="28"/>
-        </w:rPr>
-        <w:t xml:space="preserve"> a table, can be validating two steps </w:t>
+        <w:t xml:space="preserve">The data enter into a table, can be validating two steps </w:t>
       </w:r>
       <w:r>
         <w:rPr>
@@ -3838,25 +3818,7 @@
           <w:sz w:val="28"/>
           <w:szCs w:val="28"/>
         </w:rPr>
-        <w:t xml:space="preserve">Whenever we </w:t>
-      </w:r>
-      <w:proofErr w:type="gramStart"/>
-      <w:r>
-        <w:rPr>
-          <w:rFonts w:cstheme="minorHAnsi"/>
-          <w:sz w:val="28"/>
-          <w:szCs w:val="28"/>
-        </w:rPr>
-        <w:t>have to</w:t>
-      </w:r>
-      <w:proofErr w:type="gramEnd"/>
-      <w:r>
-        <w:rPr>
-          <w:rFonts w:cstheme="minorHAnsi"/>
-          <w:sz w:val="28"/>
-          <w:szCs w:val="28"/>
-        </w:rPr>
-        <w:t xml:space="preserve"> use CHAR datatype, we must mention size, a syntax of CHAR datatype.</w:t>
+        <w:t>Whenever we have to use CHAR datatype, we must mention size, a syntax of CHAR datatype.</w:t>
       </w:r>
     </w:p>
     <w:p>
@@ -4113,25 +4075,7 @@
           <w:sz w:val="28"/>
           <w:szCs w:val="28"/>
         </w:rPr>
-        <w:t xml:space="preserve">Whenever we </w:t>
-      </w:r>
-      <w:proofErr w:type="gramStart"/>
-      <w:r>
-        <w:rPr>
-          <w:rFonts w:cstheme="minorHAnsi"/>
-          <w:sz w:val="28"/>
-          <w:szCs w:val="28"/>
-        </w:rPr>
-        <w:t>have to</w:t>
-      </w:r>
-      <w:proofErr w:type="gramEnd"/>
-      <w:r>
-        <w:rPr>
-          <w:rFonts w:cstheme="minorHAnsi"/>
-          <w:sz w:val="28"/>
-          <w:szCs w:val="28"/>
-        </w:rPr>
-        <w:t xml:space="preserve"> use varchar data type, we must mention size.</w:t>
+        <w:t>Whenever we have to use varchar data type, we must mention size.</w:t>
       </w:r>
       <w:r>
         <w:rPr>
@@ -4429,15 +4373,13 @@
         </w:rPr>
         <w:t xml:space="preserve">It is used to stores numeric </w:t>
       </w:r>
-      <w:proofErr w:type="gramStart"/>
-      <w:r>
-        <w:rPr>
-          <w:sz w:val="28"/>
-          <w:szCs w:val="28"/>
-        </w:rPr>
-        <w:t>values</w:t>
-      </w:r>
-      <w:proofErr w:type="gramEnd"/>
+      <w:r>
+        <w:rPr>
+          <w:sz w:val="28"/>
+          <w:szCs w:val="28"/>
+        </w:rPr>
+        <w:t>values.</w:t>
+      </w:r>
       <w:r>
         <w:rPr>
           <w:sz w:val="28"/>
@@ -5184,23 +5126,7 @@
           <w:sz w:val="28"/>
           <w:szCs w:val="28"/>
         </w:rPr>
-        <w:t xml:space="preserve">NOTE = </w:t>
-      </w:r>
-      <w:proofErr w:type="gramStart"/>
-      <w:r>
-        <w:rPr>
-          <w:sz w:val="28"/>
-          <w:szCs w:val="28"/>
-        </w:rPr>
-        <w:t>In order to</w:t>
-      </w:r>
-      <w:proofErr w:type="gramEnd"/>
-      <w:r>
-        <w:rPr>
-          <w:sz w:val="28"/>
-          <w:szCs w:val="28"/>
-        </w:rPr>
-        <w:t xml:space="preserve"> create a table, two things are required =&gt;</w:t>
+        <w:t>NOTE = In order to create a table, two things are required =&gt;</w:t>
       </w:r>
     </w:p>
     <w:p>
@@ -5546,23 +5472,7 @@
           <w:sz w:val="28"/>
           <w:szCs w:val="28"/>
         </w:rPr>
-        <w:t xml:space="preserve">It is </w:t>
-      </w:r>
-      <w:proofErr w:type="gramStart"/>
-      <w:r>
-        <w:rPr>
-          <w:sz w:val="28"/>
-          <w:szCs w:val="28"/>
-        </w:rPr>
-        <w:t>use</w:t>
-      </w:r>
-      <w:proofErr w:type="gramEnd"/>
-      <w:r>
-        <w:rPr>
-          <w:sz w:val="28"/>
-          <w:szCs w:val="28"/>
-        </w:rPr>
-        <w:t xml:space="preserve"> to avoid duplicate values into column.</w:t>
+        <w:t>It is use to avoid duplicate values into column.</w:t>
       </w:r>
     </w:p>
     <w:p>
@@ -5617,23 +5527,7 @@
           <w:sz w:val="28"/>
           <w:szCs w:val="28"/>
         </w:rPr>
-        <w:t xml:space="preserve">It is </w:t>
-      </w:r>
-      <w:proofErr w:type="gramStart"/>
-      <w:r>
-        <w:rPr>
-          <w:sz w:val="28"/>
-          <w:szCs w:val="28"/>
-        </w:rPr>
-        <w:t>use</w:t>
-      </w:r>
-      <w:proofErr w:type="gramEnd"/>
-      <w:r>
-        <w:rPr>
-          <w:sz w:val="28"/>
-          <w:szCs w:val="28"/>
-        </w:rPr>
-        <w:t xml:space="preserve"> to avoid NULL (empty).</w:t>
+        <w:t>It is use to avoid NULL (empty).</w:t>
       </w:r>
     </w:p>
     <w:p>
@@ -5688,21 +5582,7 @@
           <w:sz w:val="28"/>
           <w:szCs w:val="28"/>
         </w:rPr>
-        <w:t>It is an extr</w:t>
-      </w:r>
-      <w:r>
-        <w:rPr>
-          <w:sz w:val="28"/>
-          <w:szCs w:val="28"/>
-        </w:rPr>
-        <w:t>p0</w:t>
-      </w:r>
-      <w:r>
-        <w:rPr>
-          <w:sz w:val="28"/>
-          <w:szCs w:val="28"/>
-        </w:rPr>
-        <w:t xml:space="preserve">a validation with </w:t>
+        <w:t xml:space="preserve">It is an extra validation with </w:t>
       </w:r>
       <w:r>
         <w:rPr>
@@ -5822,23 +5702,7 @@
           <w:sz w:val="28"/>
           <w:szCs w:val="28"/>
         </w:rPr>
-        <w:t xml:space="preserve">It is </w:t>
-      </w:r>
-      <w:proofErr w:type="gramStart"/>
-      <w:r>
-        <w:rPr>
-          <w:sz w:val="28"/>
-          <w:szCs w:val="28"/>
-        </w:rPr>
-        <w:t>use</w:t>
-      </w:r>
-      <w:proofErr w:type="gramEnd"/>
-      <w:r>
-        <w:rPr>
-          <w:sz w:val="28"/>
-          <w:szCs w:val="28"/>
-        </w:rPr>
-        <w:t xml:space="preserve"> to identified the records uniquely from the table.</w:t>
+        <w:t>It is use to identified the records uniquely from the table.</w:t>
       </w:r>
     </w:p>
     <w:p>
@@ -5960,17 +5824,8 @@
           <w:sz w:val="28"/>
           <w:szCs w:val="28"/>
         </w:rPr>
-        <w:t xml:space="preserve">We can have only one Primary key given to one column only in a </w:t>
-      </w:r>
-      <w:proofErr w:type="gramStart"/>
-      <w:r>
-        <w:rPr>
-          <w:sz w:val="28"/>
-          <w:szCs w:val="28"/>
-        </w:rPr>
-        <w:t>table</w:t>
-      </w:r>
-      <w:proofErr w:type="gramEnd"/>
+        <w:t>We can have only one Primary key given to one column only in a table</w:t>
+      </w:r>
     </w:p>
     <w:p>
       <w:pPr>
@@ -6027,17 +5882,15 @@
           <w:sz w:val="28"/>
           <w:szCs w:val="28"/>
         </w:rPr>
-        <w:t xml:space="preserve">Foreign key is </w:t>
-      </w:r>
-      <w:proofErr w:type="gramStart"/>
-      <w:r>
-        <w:rPr>
-          <w:sz w:val="28"/>
-          <w:szCs w:val="28"/>
-        </w:rPr>
-        <w:t>use</w:t>
-      </w:r>
-      <w:proofErr w:type="gramEnd"/>
+        <w:t>Foreign key is use</w:t>
+      </w:r>
+      <w:r>
+        <w:rPr>
+          <w:sz w:val="28"/>
+          <w:szCs w:val="28"/>
+        </w:rPr>
+        <w:t>d</w:t>
+      </w:r>
       <w:r>
         <w:rPr>
           <w:sz w:val="28"/>
@@ -6797,23 +6650,7 @@
           <w:sz w:val="28"/>
           <w:szCs w:val="28"/>
         </w:rPr>
-        <w:t xml:space="preserve">It is used to </w:t>
-      </w:r>
-      <w:proofErr w:type="gramStart"/>
-      <w:r>
-        <w:rPr>
-          <w:sz w:val="28"/>
-          <w:szCs w:val="28"/>
-        </w:rPr>
-        <w:t>retrieved</w:t>
-      </w:r>
-      <w:proofErr w:type="gramEnd"/>
-      <w:r>
-        <w:rPr>
-          <w:sz w:val="28"/>
-          <w:szCs w:val="28"/>
-        </w:rPr>
-        <w:t xml:space="preserve"> the data from the database.</w:t>
+        <w:t>It is used to retrieved the data from the database.</w:t>
       </w:r>
     </w:p>
     <w:p>
@@ -6835,17 +6672,8 @@
           <w:sz w:val="28"/>
           <w:szCs w:val="28"/>
         </w:rPr>
-        <w:t xml:space="preserve">It has four </w:t>
-      </w:r>
-      <w:proofErr w:type="gramStart"/>
-      <w:r>
-        <w:rPr>
-          <w:sz w:val="28"/>
-          <w:szCs w:val="28"/>
-        </w:rPr>
-        <w:t>statements</w:t>
-      </w:r>
-      <w:proofErr w:type="gramEnd"/>
+        <w:t>It has four statements</w:t>
+      </w:r>
     </w:p>
     <w:p>
       <w:pPr>
@@ -6975,23 +6803,7 @@
           <w:sz w:val="28"/>
           <w:szCs w:val="28"/>
         </w:rPr>
-        <w:t xml:space="preserve">It is </w:t>
-      </w:r>
-      <w:proofErr w:type="gramStart"/>
-      <w:r>
-        <w:rPr>
-          <w:sz w:val="28"/>
-          <w:szCs w:val="28"/>
-        </w:rPr>
-        <w:t>use</w:t>
-      </w:r>
-      <w:proofErr w:type="gramEnd"/>
-      <w:r>
-        <w:rPr>
-          <w:sz w:val="28"/>
-          <w:szCs w:val="28"/>
-        </w:rPr>
-        <w:t xml:space="preserve"> to retrieve the data from the table and display it.</w:t>
+        <w:t>It is use to retrieve the data from the table and display it.</w:t>
       </w:r>
     </w:p>
     <w:p>
@@ -7038,17 +6850,8 @@
           <w:sz w:val="28"/>
           <w:szCs w:val="28"/>
         </w:rPr>
-        <w:t>FROM TABLE_</w:t>
-      </w:r>
-      <w:proofErr w:type="gramStart"/>
-      <w:r>
-        <w:rPr>
-          <w:sz w:val="28"/>
-          <w:szCs w:val="28"/>
-        </w:rPr>
-        <w:t>NAME;</w:t>
-      </w:r>
-      <w:proofErr w:type="gramEnd"/>
+        <w:t>FROM TABLE_NAME;</w:t>
+      </w:r>
     </w:p>
     <w:p>
       <w:pPr>
@@ -7085,17 +6888,8 @@
           <w:sz w:val="28"/>
           <w:szCs w:val="28"/>
         </w:rPr>
-        <w:t xml:space="preserve"> </w:t>
-      </w:r>
-      <w:proofErr w:type="gramStart"/>
-      <w:r>
-        <w:rPr>
-          <w:sz w:val="28"/>
-          <w:szCs w:val="28"/>
-        </w:rPr>
-        <w:t>SELECT</w:t>
-      </w:r>
-      <w:proofErr w:type="gramEnd"/>
+        <w:t xml:space="preserve"> SELECT</w:t>
+      </w:r>
     </w:p>
     <w:p>
       <w:pPr>
@@ -7126,23 +6920,7 @@
           <w:sz w:val="28"/>
           <w:szCs w:val="28"/>
         </w:rPr>
-        <w:t xml:space="preserve"> = it is </w:t>
-      </w:r>
-      <w:proofErr w:type="gramStart"/>
-      <w:r>
-        <w:rPr>
-          <w:sz w:val="28"/>
-          <w:szCs w:val="28"/>
-        </w:rPr>
-        <w:t>use</w:t>
-      </w:r>
-      <w:proofErr w:type="gramEnd"/>
-      <w:r>
-        <w:rPr>
-          <w:sz w:val="28"/>
-          <w:szCs w:val="28"/>
-        </w:rPr>
-        <w:t xml:space="preserve"> to select all the details from the table.</w:t>
+        <w:t xml:space="preserve"> = it is use to select all the details from the table.</w:t>
       </w:r>
     </w:p>
     <w:p>
@@ -7190,23 +6968,7 @@
           <w:sz w:val="28"/>
           <w:szCs w:val="28"/>
         </w:rPr>
-        <w:t xml:space="preserve">it is </w:t>
-      </w:r>
-      <w:proofErr w:type="gramStart"/>
-      <w:r>
-        <w:rPr>
-          <w:sz w:val="28"/>
-          <w:szCs w:val="28"/>
-        </w:rPr>
-        <w:t>use</w:t>
-      </w:r>
-      <w:proofErr w:type="gramEnd"/>
-      <w:r>
-        <w:rPr>
-          <w:sz w:val="28"/>
-          <w:szCs w:val="28"/>
-        </w:rPr>
-        <w:t xml:space="preserve"> to remove the duplicate or repeated value from the result table.</w:t>
+        <w:t>it is use to remove the duplicate or repeated value from the result table.</w:t>
       </w:r>
     </w:p>
     <w:p>
@@ -7226,23 +6988,7 @@
           <w:sz w:val="28"/>
           <w:szCs w:val="28"/>
         </w:rPr>
-        <w:t xml:space="preserve">Distinct clause </w:t>
-      </w:r>
-      <w:proofErr w:type="gramStart"/>
-      <w:r>
-        <w:rPr>
-          <w:sz w:val="28"/>
-          <w:szCs w:val="28"/>
-        </w:rPr>
-        <w:t>has to</w:t>
-      </w:r>
-      <w:proofErr w:type="gramEnd"/>
-      <w:r>
-        <w:rPr>
-          <w:sz w:val="28"/>
-          <w:szCs w:val="28"/>
-        </w:rPr>
-        <w:t xml:space="preserve"> be use as the first argument in the select clause.</w:t>
+        <w:t>Distinct clause has to be use as the first argument in the select clause.</w:t>
       </w:r>
     </w:p>
     <w:p>
@@ -7370,23 +7116,7 @@
           <w:sz w:val="28"/>
           <w:szCs w:val="28"/>
         </w:rPr>
-        <w:t xml:space="preserve">It is </w:t>
-      </w:r>
-      <w:proofErr w:type="gramStart"/>
-      <w:r>
-        <w:rPr>
-          <w:sz w:val="28"/>
-          <w:szCs w:val="28"/>
-        </w:rPr>
-        <w:t>use</w:t>
-      </w:r>
-      <w:proofErr w:type="gramEnd"/>
-      <w:r>
-        <w:rPr>
-          <w:sz w:val="28"/>
-          <w:szCs w:val="28"/>
-        </w:rPr>
-        <w:t xml:space="preserve"> to give alternative name to a column.</w:t>
+        <w:t>It is use to give alternative name to a column.</w:t>
       </w:r>
     </w:p>
     <w:p>
@@ -7406,17 +7136,8 @@
           <w:sz w:val="28"/>
           <w:szCs w:val="28"/>
         </w:rPr>
-        <w:t xml:space="preserve">We can give alias in two </w:t>
-      </w:r>
-      <w:proofErr w:type="gramStart"/>
-      <w:r>
-        <w:rPr>
-          <w:sz w:val="28"/>
-          <w:szCs w:val="28"/>
-        </w:rPr>
-        <w:t>ways</w:t>
-      </w:r>
-      <w:proofErr w:type="gramEnd"/>
+        <w:t>We can give alias in two ways</w:t>
+      </w:r>
     </w:p>
     <w:p>
       <w:pPr>
@@ -7556,21 +7277,7 @@
         <w:rPr>
           <w:sz w:val="22"/>
         </w:rPr>
-        <w:t xml:space="preserve">SELECT * [DISTINCT] </w:t>
-      </w:r>
-      <w:proofErr w:type="spellStart"/>
-      <w:r>
-        <w:rPr>
-          <w:sz w:val="22"/>
-        </w:rPr>
-        <w:t>column_name</w:t>
-      </w:r>
-      <w:proofErr w:type="spellEnd"/>
-      <w:r>
-        <w:rPr>
-          <w:sz w:val="22"/>
-        </w:rPr>
-        <w:t xml:space="preserve"> | expression [AS alias]</w:t>
+        <w:t>SELECT * [DISTINCT] column_name | expression [AS alias]</w:t>
       </w:r>
     </w:p>
     <w:p>
@@ -7583,37 +7290,21 @@
         <w:rPr>
           <w:rFonts w:ascii="Consolas" w:hAnsi="Consolas"/>
         </w:rPr>
-        <w:t xml:space="preserve">FROM </w:t>
-      </w:r>
-      <w:proofErr w:type="spellStart"/>
-      <w:r>
+        <w:t>FROM table_name</w:t>
+      </w:r>
+    </w:p>
+    <w:p>
+      <w:pPr>
         <w:rPr>
           <w:rFonts w:ascii="Consolas" w:hAnsi="Consolas"/>
         </w:rPr>
-        <w:t>table_name</w:t>
-      </w:r>
-      <w:proofErr w:type="spellEnd"/>
-    </w:p>
-    <w:p>
-      <w:pPr>
+      </w:pPr>
+      <w:r>
         <w:rPr>
           <w:rFonts w:ascii="Consolas" w:hAnsi="Consolas"/>
         </w:rPr>
-      </w:pPr>
-      <w:r>
-        <w:rPr>
-          <w:rFonts w:ascii="Consolas" w:hAnsi="Consolas"/>
-        </w:rPr>
-        <w:t>WHERE &lt;Filter Record Condition</w:t>
-      </w:r>
-      <w:proofErr w:type="gramStart"/>
-      <w:r>
-        <w:rPr>
-          <w:rFonts w:ascii="Consolas" w:hAnsi="Consolas"/>
-        </w:rPr>
-        <w:t>&gt;;</w:t>
-      </w:r>
-      <w:proofErr w:type="gramEnd"/>
+        <w:t>WHERE &lt;Filter Record Condition&gt;;</w:t>
+      </w:r>
     </w:p>
     <w:p>
       <w:pPr>
@@ -8066,7 +7757,6 @@
         </w:rPr>
         <w:t>=</w:t>
       </w:r>
-      <w:proofErr w:type="gramStart"/>
       <w:r>
         <w:rPr>
           <w:sz w:val="28"/>
@@ -8080,16 +7770,7 @@
           <w:sz w:val="28"/>
           <w:szCs w:val="28"/>
         </w:rPr>
-        <w:t>!</w:t>
-      </w:r>
-      <w:proofErr w:type="gramEnd"/>
-      <w:r>
-        <w:rPr>
-          <w:rStyle w:val="HTMLCode"/>
-          <w:sz w:val="28"/>
-          <w:szCs w:val="28"/>
-        </w:rPr>
-        <w:t>=</w:t>
+        <w:t>!=</w:t>
       </w:r>
       <w:r>
         <w:rPr>
@@ -8590,38 +8271,22 @@
         <w:rPr>
           <w:rStyle w:val="HTMLCode"/>
         </w:rPr>
-        <w:t xml:space="preserve">SELECT 'HELLO' || ' </w:t>
-      </w:r>
-      <w:proofErr w:type="gramStart"/>
-      <w:r>
+        <w:t>SELECT 'HELLO' || ' WORLD'</w:t>
+      </w:r>
+    </w:p>
+    <w:p>
+      <w:pPr>
+        <w:pStyle w:val="HTMLPreformatted"/>
         <w:rPr>
           <w:rStyle w:val="HTMLCode"/>
         </w:rPr>
-        <w:t>WORLD'</w:t>
-      </w:r>
-      <w:proofErr w:type="gramEnd"/>
-    </w:p>
-    <w:p>
-      <w:pPr>
-        <w:pStyle w:val="HTMLPreformatted"/>
+      </w:pPr>
+      <w:r>
         <w:rPr>
           <w:rStyle w:val="HTMLCode"/>
         </w:rPr>
-      </w:pPr>
-      <w:r>
-        <w:rPr>
-          <w:rStyle w:val="HTMLCode"/>
-        </w:rPr>
-        <w:t xml:space="preserve">FROM </w:t>
-      </w:r>
-      <w:proofErr w:type="gramStart"/>
-      <w:r>
-        <w:rPr>
-          <w:rStyle w:val="HTMLCode"/>
-        </w:rPr>
-        <w:t>DUAL;</w:t>
-      </w:r>
-      <w:proofErr w:type="gramEnd"/>
+        <w:t>FROM DUAL;</w:t>
+      </w:r>
     </w:p>
     <w:p/>
     <w:p>
@@ -8719,16 +8384,8 @@
         <w:rPr>
           <w:rStyle w:val="HTMLCode"/>
         </w:rPr>
-        <w:t>WHERE SAL &gt; 1000 AND JOB = 'CLERK</w:t>
-      </w:r>
-      <w:proofErr w:type="gramStart"/>
-      <w:r>
-        <w:rPr>
-          <w:rStyle w:val="HTMLCode"/>
-        </w:rPr>
-        <w:t>';</w:t>
-      </w:r>
-      <w:proofErr w:type="gramEnd"/>
+        <w:t>WHERE SAL &gt; 1000 AND JOB = 'CLERK';</w:t>
+      </w:r>
     </w:p>
     <w:p>
       <w:pPr>
@@ -8800,16 +8457,8 @@
         <w:rPr>
           <w:rStyle w:val="HTMLCode"/>
         </w:rPr>
-        <w:t xml:space="preserve">WHERE DEPTNO = 10 OR DEPTNO = </w:t>
-      </w:r>
-      <w:proofErr w:type="gramStart"/>
-      <w:r>
-        <w:rPr>
-          <w:rStyle w:val="HTMLCode"/>
-        </w:rPr>
-        <w:t>20;</w:t>
-      </w:r>
-      <w:proofErr w:type="gramEnd"/>
+        <w:t>WHERE DEPTNO = 10 OR DEPTNO = 20;</w:t>
+      </w:r>
     </w:p>
     <w:p>
       <w:pPr>
@@ -8873,16 +8522,8 @@
         <w:rPr>
           <w:rStyle w:val="HTMLCode"/>
         </w:rPr>
-        <w:t>WHERE NOT JOB = 'CLERK</w:t>
-      </w:r>
-      <w:proofErr w:type="gramStart"/>
-      <w:r>
-        <w:rPr>
-          <w:rStyle w:val="HTMLCode"/>
-        </w:rPr>
-        <w:t>';</w:t>
-      </w:r>
-      <w:proofErr w:type="gramEnd"/>
+        <w:t>WHERE NOT JOB = 'CLERK';</w:t>
+      </w:r>
     </w:p>
     <w:p/>
     <w:p>
@@ -8937,15 +8578,7 @@
         <w:t>any value</w:t>
       </w:r>
       <w:r>
-        <w:t xml:space="preserve"> </w:t>
-      </w:r>
-      <w:proofErr w:type="gramStart"/>
-      <w:r>
-        <w:t>in a given</w:t>
-      </w:r>
-      <w:proofErr w:type="gramEnd"/>
-      <w:r>
-        <w:t xml:space="preserve"> list.</w:t>
+        <w:t xml:space="preserve"> in a given list.</w:t>
       </w:r>
     </w:p>
     <w:p>
@@ -8966,61 +8599,37 @@
           <w:rStyle w:val="HTMLCode"/>
         </w:rPr>
       </w:pPr>
-      <w:proofErr w:type="spellStart"/>
       <w:r>
         <w:rPr>
           <w:rStyle w:val="HTMLCode"/>
         </w:rPr>
-        <w:t>Col_Name</w:t>
-      </w:r>
-      <w:proofErr w:type="spellEnd"/>
-      <w:r>
+        <w:t>Col_Name IN (val1, val2, val3);</w:t>
+      </w:r>
+    </w:p>
+    <w:p>
+      <w:pPr>
+        <w:pStyle w:val="NormalWeb"/>
+      </w:pPr>
+      <w:r>
+        <w:rPr>
+          <w:rStyle w:val="Strong"/>
+        </w:rPr>
+        <w:t>Example:</w:t>
+      </w:r>
+    </w:p>
+    <w:p>
+      <w:pPr>
+        <w:pStyle w:val="HTMLPreformatted"/>
         <w:rPr>
           <w:rStyle w:val="HTMLCode"/>
         </w:rPr>
-        <w:t xml:space="preserve"> IN (val1, val2, val3</w:t>
-      </w:r>
-      <w:proofErr w:type="gramStart"/>
+      </w:pPr>
       <w:r>
         <w:rPr>
           <w:rStyle w:val="HTMLCode"/>
         </w:rPr>
-        <w:t>);</w:t>
-      </w:r>
-      <w:proofErr w:type="gramEnd"/>
-    </w:p>
-    <w:p>
-      <w:pPr>
-        <w:pStyle w:val="NormalWeb"/>
-      </w:pPr>
-      <w:r>
-        <w:rPr>
-          <w:rStyle w:val="Strong"/>
-        </w:rPr>
-        <w:t>Example:</w:t>
-      </w:r>
-    </w:p>
-    <w:p>
-      <w:pPr>
-        <w:pStyle w:val="HTMLPreformatted"/>
-        <w:rPr>
-          <w:rStyle w:val="HTMLCode"/>
-        </w:rPr>
-      </w:pPr>
-      <w:r>
-        <w:rPr>
-          <w:rStyle w:val="HTMLCode"/>
-        </w:rPr>
-        <w:t>WHERE DEPTNO IN (10, 20, 30</w:t>
-      </w:r>
-      <w:proofErr w:type="gramStart"/>
-      <w:r>
-        <w:rPr>
-          <w:rStyle w:val="HTMLCode"/>
-        </w:rPr>
-        <w:t>);</w:t>
-      </w:r>
-      <w:proofErr w:type="gramEnd"/>
+        <w:t>WHERE DEPTNO IN (10, 20, 30);</w:t>
+      </w:r>
     </w:p>
     <w:p/>
     <w:p>
@@ -9091,28 +8700,12 @@
           <w:rStyle w:val="HTMLCode"/>
         </w:rPr>
       </w:pPr>
-      <w:proofErr w:type="spellStart"/>
       <w:r>
         <w:rPr>
           <w:rStyle w:val="HTMLCode"/>
         </w:rPr>
-        <w:t>Col_Name</w:t>
-      </w:r>
-      <w:proofErr w:type="spellEnd"/>
-      <w:r>
-        <w:rPr>
-          <w:rStyle w:val="HTMLCode"/>
-        </w:rPr>
-        <w:t xml:space="preserve"> NOT IN (val1, val2, val3</w:t>
-      </w:r>
-      <w:proofErr w:type="gramStart"/>
-      <w:r>
-        <w:rPr>
-          <w:rStyle w:val="HTMLCode"/>
-        </w:rPr>
-        <w:t>);</w:t>
-      </w:r>
-      <w:proofErr w:type="gramEnd"/>
+        <w:t>Col_Name NOT IN (val1, val2, val3);</w:t>
+      </w:r>
     </w:p>
     <w:p/>
     <w:p>
@@ -9189,89 +8782,37 @@
           <w:rStyle w:val="HTMLCode"/>
         </w:rPr>
       </w:pPr>
-      <w:proofErr w:type="spellStart"/>
       <w:r>
         <w:rPr>
           <w:rStyle w:val="HTMLCode"/>
         </w:rPr>
-        <w:t>Col_Name</w:t>
-      </w:r>
-      <w:proofErr w:type="spellEnd"/>
-      <w:r>
+        <w:t>Col_Name BETWEEN lower_value AND higher_value;</w:t>
+      </w:r>
+    </w:p>
+    <w:p>
+      <w:pPr>
+        <w:pStyle w:val="NormalWeb"/>
+      </w:pPr>
+      <w:r>
+        <w:rPr>
+          <w:rStyle w:val="Strong"/>
+        </w:rPr>
+        <w:t>Example:</w:t>
+      </w:r>
+    </w:p>
+    <w:p>
+      <w:pPr>
+        <w:pStyle w:val="HTMLPreformatted"/>
         <w:rPr>
           <w:rStyle w:val="HTMLCode"/>
         </w:rPr>
-        <w:t xml:space="preserve"> BETWEEN </w:t>
-      </w:r>
-      <w:proofErr w:type="spellStart"/>
+      </w:pPr>
       <w:r>
         <w:rPr>
           <w:rStyle w:val="HTMLCode"/>
         </w:rPr>
-        <w:t>lower_value</w:t>
-      </w:r>
-      <w:proofErr w:type="spellEnd"/>
-      <w:r>
-        <w:rPr>
-          <w:rStyle w:val="HTMLCode"/>
-        </w:rPr>
-        <w:t xml:space="preserve"> AND </w:t>
-      </w:r>
-      <w:proofErr w:type="spellStart"/>
-      <w:r>
-        <w:rPr>
-          <w:rStyle w:val="HTMLCode"/>
-        </w:rPr>
-        <w:t>higher_</w:t>
-      </w:r>
-      <w:proofErr w:type="gramStart"/>
-      <w:r>
-        <w:rPr>
-          <w:rStyle w:val="HTMLCode"/>
-        </w:rPr>
-        <w:t>value</w:t>
-      </w:r>
-      <w:proofErr w:type="spellEnd"/>
-      <w:r>
-        <w:rPr>
-          <w:rStyle w:val="HTMLCode"/>
-        </w:rPr>
-        <w:t>;</w:t>
-      </w:r>
-      <w:proofErr w:type="gramEnd"/>
-    </w:p>
-    <w:p>
-      <w:pPr>
-        <w:pStyle w:val="NormalWeb"/>
-      </w:pPr>
-      <w:r>
-        <w:rPr>
-          <w:rStyle w:val="Strong"/>
-        </w:rPr>
-        <w:t>Example:</w:t>
-      </w:r>
-    </w:p>
-    <w:p>
-      <w:pPr>
-        <w:pStyle w:val="HTMLPreformatted"/>
-        <w:rPr>
-          <w:rStyle w:val="HTMLCode"/>
-        </w:rPr>
-      </w:pPr>
-      <w:r>
-        <w:rPr>
-          <w:rStyle w:val="HTMLCode"/>
-        </w:rPr>
-        <w:t xml:space="preserve">WHERE SAL BETWEEN 1000 AND </w:t>
-      </w:r>
-      <w:proofErr w:type="gramStart"/>
-      <w:r>
-        <w:rPr>
-          <w:rStyle w:val="HTMLCode"/>
-        </w:rPr>
-        <w:t>2000;</w:t>
-      </w:r>
-      <w:proofErr w:type="gramEnd"/>
+        <w:t>WHERE SAL BETWEEN 1000 AND 2000;</w:t>
+      </w:r>
     </w:p>
     <w:p>
       <w:pPr>
@@ -9409,56 +8950,12 @@
       <w:pPr>
         <w:pStyle w:val="HTMLPreformatted"/>
       </w:pPr>
-      <w:proofErr w:type="spellStart"/>
       <w:r>
         <w:rPr>
           <w:rStyle w:val="HTMLCode"/>
         </w:rPr>
-        <w:t>Col_Name</w:t>
-      </w:r>
-      <w:proofErr w:type="spellEnd"/>
-      <w:r>
-        <w:rPr>
-          <w:rStyle w:val="HTMLCode"/>
-        </w:rPr>
-        <w:t xml:space="preserve"> NOT BETWEEN </w:t>
-      </w:r>
-      <w:proofErr w:type="spellStart"/>
-      <w:r>
-        <w:rPr>
-          <w:rStyle w:val="HTMLCode"/>
-        </w:rPr>
-        <w:t>lower_value</w:t>
-      </w:r>
-      <w:proofErr w:type="spellEnd"/>
-      <w:r>
-        <w:rPr>
-          <w:rStyle w:val="HTMLCode"/>
-        </w:rPr>
-        <w:t xml:space="preserve"> AND </w:t>
-      </w:r>
-      <w:proofErr w:type="spellStart"/>
-      <w:r>
-        <w:rPr>
-          <w:rStyle w:val="HTMLCode"/>
-        </w:rPr>
-        <w:t>higher_</w:t>
-      </w:r>
-      <w:proofErr w:type="gramStart"/>
-      <w:r>
-        <w:rPr>
-          <w:rStyle w:val="HTMLCode"/>
-        </w:rPr>
-        <w:t>value</w:t>
-      </w:r>
-      <w:proofErr w:type="spellEnd"/>
-      <w:r>
-        <w:rPr>
-          <w:rStyle w:val="HTMLCode"/>
-        </w:rPr>
-        <w:t>;</w:t>
-      </w:r>
-      <w:proofErr w:type="gramEnd"/>
+        <w:t>Col_Name NOT BETWEEN lower_value AND higher_value;</w:t>
+      </w:r>
     </w:p>
     <w:p>
       <w:pPr>
@@ -9554,28 +9051,12 @@
           <w:rStyle w:val="HTMLCode"/>
         </w:rPr>
       </w:pPr>
-      <w:proofErr w:type="spellStart"/>
       <w:r>
         <w:rPr>
           <w:rStyle w:val="HTMLCode"/>
         </w:rPr>
-        <w:t>Col_Name</w:t>
-      </w:r>
-      <w:proofErr w:type="spellEnd"/>
-      <w:r>
-        <w:rPr>
-          <w:rStyle w:val="HTMLCode"/>
-        </w:rPr>
-        <w:t xml:space="preserve"> IS </w:t>
-      </w:r>
-      <w:proofErr w:type="gramStart"/>
-      <w:r>
-        <w:rPr>
-          <w:rStyle w:val="HTMLCode"/>
-        </w:rPr>
-        <w:t>NULL;</w:t>
-      </w:r>
-      <w:proofErr w:type="gramEnd"/>
+        <w:t>Col_Name IS NULL;</w:t>
+      </w:r>
     </w:p>
     <w:p/>
     <w:p>
@@ -9625,28 +9106,12 @@
           <w:rStyle w:val="HTMLCode"/>
         </w:rPr>
       </w:pPr>
-      <w:proofErr w:type="spellStart"/>
       <w:r>
         <w:rPr>
           <w:rStyle w:val="HTMLCode"/>
         </w:rPr>
-        <w:t>Col_Name</w:t>
-      </w:r>
-      <w:proofErr w:type="spellEnd"/>
-      <w:r>
-        <w:rPr>
-          <w:rStyle w:val="HTMLCode"/>
-        </w:rPr>
-        <w:t xml:space="preserve"> IS NOT </w:t>
-      </w:r>
-      <w:proofErr w:type="gramStart"/>
-      <w:r>
-        <w:rPr>
-          <w:rStyle w:val="HTMLCode"/>
-        </w:rPr>
-        <w:t>NULL;</w:t>
-      </w:r>
-      <w:proofErr w:type="gramEnd"/>
+        <w:t>Col_Name IS NOT NULL;</w:t>
+      </w:r>
     </w:p>
     <w:p>
       <w:pPr>
@@ -9700,28 +9165,12 @@
           <w:rStyle w:val="HTMLCode"/>
         </w:rPr>
       </w:pPr>
-      <w:proofErr w:type="spellStart"/>
       <w:r>
         <w:rPr>
           <w:rStyle w:val="HTMLCode"/>
         </w:rPr>
-        <w:t>Col_Name</w:t>
-      </w:r>
-      <w:proofErr w:type="spellEnd"/>
-      <w:r>
-        <w:rPr>
-          <w:rStyle w:val="HTMLCode"/>
-        </w:rPr>
-        <w:t xml:space="preserve"> LIKE 'pattern</w:t>
-      </w:r>
-      <w:proofErr w:type="gramStart"/>
-      <w:r>
-        <w:rPr>
-          <w:rStyle w:val="HTMLCode"/>
-        </w:rPr>
-        <w:t>';</w:t>
-      </w:r>
-      <w:proofErr w:type="gramEnd"/>
+        <w:t>Col_Name LIKE 'pattern';</w:t>
+      </w:r>
     </w:p>
     <w:p>
       <w:pPr>
@@ -9821,55 +9270,39 @@
         <w:rPr>
           <w:rStyle w:val="HTMLCode"/>
         </w:rPr>
-        <w:t>WHERE ENAME LIKE 'A%</w:t>
-      </w:r>
-      <w:proofErr w:type="gramStart"/>
+        <w:t>WHERE ENAME LIKE 'A%';</w:t>
+      </w:r>
+    </w:p>
+    <w:p>
+      <w:pPr>
+        <w:pStyle w:val="NormalWeb"/>
+      </w:pPr>
+      <w:r>
+        <w:t xml:space="preserve">→ Names starting with </w:t>
+      </w:r>
       <w:r>
         <w:rPr>
           <w:rStyle w:val="HTMLCode"/>
         </w:rPr>
-        <w:t>';</w:t>
-      </w:r>
-      <w:proofErr w:type="gramEnd"/>
-    </w:p>
-    <w:p>
-      <w:pPr>
-        <w:pStyle w:val="NormalWeb"/>
-      </w:pPr>
-      <w:r>
-        <w:t xml:space="preserve">→ Names starting with </w:t>
-      </w:r>
-      <w:r>
+        <w:t>A</w:t>
+      </w:r>
+      <w:r>
+        <w:t>.</w:t>
+      </w:r>
+    </w:p>
+    <w:p>
+      <w:pPr>
+        <w:pStyle w:val="HTMLPreformatted"/>
         <w:rPr>
           <w:rStyle w:val="HTMLCode"/>
         </w:rPr>
-        <w:t>A</w:t>
-      </w:r>
-      <w:r>
-        <w:t>.</w:t>
-      </w:r>
-    </w:p>
-    <w:p>
-      <w:pPr>
-        <w:pStyle w:val="HTMLPreformatted"/>
+      </w:pPr>
+      <w:r>
         <w:rPr>
           <w:rStyle w:val="HTMLCode"/>
         </w:rPr>
-      </w:pPr>
-      <w:r>
-        <w:rPr>
-          <w:rStyle w:val="HTMLCode"/>
-        </w:rPr>
-        <w:t>WHERE ENAME LIKE '_A%</w:t>
-      </w:r>
-      <w:proofErr w:type="gramStart"/>
-      <w:r>
-        <w:rPr>
-          <w:rStyle w:val="HTMLCode"/>
-        </w:rPr>
-        <w:t>';</w:t>
-      </w:r>
-      <w:proofErr w:type="gramEnd"/>
+        <w:t>WHERE ENAME LIKE '_A%';</w:t>
+      </w:r>
     </w:p>
     <w:p>
       <w:pPr>
@@ -9956,28 +9389,12 @@
           <w:rStyle w:val="HTMLCode"/>
         </w:rPr>
       </w:pPr>
-      <w:proofErr w:type="spellStart"/>
       <w:r>
         <w:rPr>
           <w:rStyle w:val="HTMLCode"/>
         </w:rPr>
-        <w:t>Col_Name</w:t>
-      </w:r>
-      <w:proofErr w:type="spellEnd"/>
-      <w:r>
-        <w:rPr>
-          <w:rStyle w:val="HTMLCode"/>
-        </w:rPr>
-        <w:t xml:space="preserve"> NOT LIKE 'pattern</w:t>
-      </w:r>
-      <w:proofErr w:type="gramStart"/>
-      <w:r>
-        <w:rPr>
-          <w:rStyle w:val="HTMLCode"/>
-        </w:rPr>
-        <w:t>';</w:t>
-      </w:r>
-      <w:proofErr w:type="gramEnd"/>
+        <w:t>Col_Name NOT LIKE 'pattern';</w:t>
+      </w:r>
     </w:p>
     <w:p>
       <w:pPr>
@@ -10367,7 +9784,6 @@
           <w:u w:val="single"/>
         </w:rPr>
       </w:pPr>
-      <w:proofErr w:type="gramStart"/>
       <w:r>
         <w:rPr>
           <w:b/>
@@ -10385,17 +9801,7 @@
           <w:sz w:val="28"/>
           <w:szCs w:val="28"/>
         </w:rPr>
-        <w:t>(</w:t>
-      </w:r>
-      <w:proofErr w:type="gramEnd"/>
-      <w:r>
-        <w:rPr>
-          <w:b/>
-          <w:bCs/>
-          <w:sz w:val="28"/>
-          <w:szCs w:val="28"/>
-        </w:rPr>
-        <w:t>)</w:t>
+        <w:t>()</w:t>
       </w:r>
       <w:r>
         <w:rPr>
@@ -10429,7 +9835,6 @@
           <w:u w:val="single"/>
         </w:rPr>
       </w:pPr>
-      <w:proofErr w:type="gramStart"/>
       <w:r>
         <w:rPr>
           <w:b/>
@@ -10445,15 +9850,7 @@
           <w:sz w:val="28"/>
           <w:szCs w:val="28"/>
         </w:rPr>
-        <w:t>(</w:t>
-      </w:r>
-      <w:proofErr w:type="gramEnd"/>
-      <w:r>
-        <w:rPr>
-          <w:sz w:val="28"/>
-          <w:szCs w:val="28"/>
-        </w:rPr>
-        <w:t>): It is used to obtain the minimum value present in a column.</w:t>
+        <w:t>(): It is used to obtain the minimum value present in a column.</w:t>
       </w:r>
     </w:p>
     <w:p>
@@ -10471,7 +9868,6 @@
           <w:u w:val="single"/>
         </w:rPr>
       </w:pPr>
-      <w:proofErr w:type="gramStart"/>
       <w:r>
         <w:rPr>
           <w:b/>
@@ -10489,17 +9885,7 @@
           <w:sz w:val="28"/>
           <w:szCs w:val="28"/>
         </w:rPr>
-        <w:t>(</w:t>
-      </w:r>
-      <w:proofErr w:type="gramEnd"/>
-      <w:r>
-        <w:rPr>
-          <w:b/>
-          <w:bCs/>
-          <w:sz w:val="28"/>
-          <w:szCs w:val="28"/>
-        </w:rPr>
-        <w:t xml:space="preserve">): </w:t>
+        <w:t xml:space="preserve">(): </w:t>
       </w:r>
       <w:r>
         <w:rPr>
@@ -10523,7 +9909,6 @@
           <w:szCs w:val="28"/>
         </w:rPr>
       </w:pPr>
-      <w:proofErr w:type="gramStart"/>
       <w:r>
         <w:rPr>
           <w:b/>
@@ -10539,15 +9924,7 @@
           <w:sz w:val="28"/>
           <w:szCs w:val="28"/>
         </w:rPr>
-        <w:t>(</w:t>
-      </w:r>
-      <w:proofErr w:type="gramEnd"/>
-      <w:r>
-        <w:rPr>
-          <w:sz w:val="28"/>
-          <w:szCs w:val="28"/>
-        </w:rPr>
-        <w:t>): It is used to obtain the average of values present in a column.</w:t>
+        <w:t>(): It is used to obtain the average of values present in a column.</w:t>
       </w:r>
     </w:p>
     <w:p>
@@ -10565,7 +9942,6 @@
           <w:u w:val="single"/>
         </w:rPr>
       </w:pPr>
-      <w:proofErr w:type="gramStart"/>
       <w:r>
         <w:rPr>
           <w:b/>
@@ -10580,15 +9956,7 @@
           <w:sz w:val="28"/>
           <w:szCs w:val="28"/>
         </w:rPr>
-        <w:t>(</w:t>
-      </w:r>
-      <w:proofErr w:type="gramEnd"/>
-      <w:r>
-        <w:rPr>
-          <w:sz w:val="28"/>
-          <w:szCs w:val="28"/>
-        </w:rPr>
-        <w:t>): It is used to obtain the number of values present in a column.</w:t>
+        <w:t>(): It is used to obtain the number of values present in a column.</w:t>
       </w:r>
     </w:p>
     <w:p>
@@ -10635,39 +10003,7 @@
           <w:sz w:val="28"/>
           <w:szCs w:val="28"/>
         </w:rPr>
-        <w:t xml:space="preserve">can accept only one argument. </w:t>
-      </w:r>
-      <w:proofErr w:type="gramStart"/>
-      <w:r>
-        <w:rPr>
-          <w:sz w:val="28"/>
-          <w:szCs w:val="28"/>
-        </w:rPr>
-        <w:t>i.e.</w:t>
-      </w:r>
-      <w:proofErr w:type="gramEnd"/>
-      <w:r>
-        <w:rPr>
-          <w:sz w:val="28"/>
-          <w:szCs w:val="28"/>
-        </w:rPr>
-        <w:t xml:space="preserve"> MRF(</w:t>
-      </w:r>
-      <w:proofErr w:type="spellStart"/>
-      <w:r>
-        <w:rPr>
-          <w:sz w:val="28"/>
-          <w:szCs w:val="28"/>
-        </w:rPr>
-        <w:t>Col_Name</w:t>
-      </w:r>
-      <w:proofErr w:type="spellEnd"/>
-      <w:r>
-        <w:rPr>
-          <w:sz w:val="28"/>
-          <w:szCs w:val="28"/>
-        </w:rPr>
-        <w:t>/Expression)</w:t>
+        <w:t>can accept only one argument. i.e. MRF(Col_Name/Expression)</w:t>
       </w:r>
       <w:r>
         <w:rPr>
@@ -10793,25 +10129,14 @@
           <w:szCs w:val="28"/>
         </w:rPr>
       </w:pPr>
-      <w:proofErr w:type="gramStart"/>
-      <w:r>
-        <w:rPr>
-          <w:b/>
-          <w:bCs/>
-          <w:sz w:val="28"/>
-          <w:szCs w:val="28"/>
-        </w:rPr>
-        <w:t>COUNT(</w:t>
-      </w:r>
-      <w:proofErr w:type="gramEnd"/>
-      <w:r>
-        <w:rPr>
-          <w:b/>
-          <w:bCs/>
-          <w:sz w:val="28"/>
-          <w:szCs w:val="28"/>
-        </w:rPr>
-        <w:t>)</w:t>
+      <w:r>
+        <w:rPr>
+          <w:b/>
+          <w:bCs/>
+          <w:sz w:val="28"/>
+          <w:szCs w:val="28"/>
+        </w:rPr>
+        <w:t>COUNT()</w:t>
       </w:r>
       <w:r>
         <w:rPr>
@@ -11034,25 +10359,7 @@
           <w:sz w:val="28"/>
           <w:szCs w:val="28"/>
         </w:rPr>
-        <w:t xml:space="preserve">GROUP BY </w:t>
-      </w:r>
-      <w:proofErr w:type="spellStart"/>
-      <w:r>
-        <w:rPr>
-          <w:rFonts w:ascii="Consolas" w:hAnsi="Consolas"/>
-          <w:sz w:val="28"/>
-          <w:szCs w:val="28"/>
-        </w:rPr>
-        <w:t>ColName</w:t>
-      </w:r>
-      <w:proofErr w:type="spellEnd"/>
-      <w:r>
-        <w:rPr>
-          <w:rFonts w:ascii="Consolas" w:hAnsi="Consolas"/>
-          <w:sz w:val="28"/>
-          <w:szCs w:val="28"/>
-        </w:rPr>
-        <w:t>/</w:t>
+        <w:t>GROUP BY ColName/</w:t>
       </w:r>
       <w:r>
         <w:rPr>
@@ -11521,23 +10828,7 @@
           <w:sz w:val="28"/>
           <w:szCs w:val="28"/>
         </w:rPr>
-        <w:t xml:space="preserve">It is </w:t>
-      </w:r>
-      <w:proofErr w:type="gramStart"/>
-      <w:r>
-        <w:rPr>
-          <w:sz w:val="28"/>
-          <w:szCs w:val="28"/>
-        </w:rPr>
-        <w:t>use</w:t>
-      </w:r>
-      <w:proofErr w:type="gramEnd"/>
-      <w:r>
-        <w:rPr>
-          <w:sz w:val="28"/>
-          <w:szCs w:val="28"/>
-        </w:rPr>
-        <w:t xml:space="preserve"> to filter the group (not row).</w:t>
+        <w:t>It is use to filter the group (not row).</w:t>
       </w:r>
     </w:p>
     <w:p>
@@ -11992,25 +11283,7 @@
           <w:sz w:val="28"/>
           <w:szCs w:val="28"/>
         </w:rPr>
-        <w:t xml:space="preserve"> </w:t>
-      </w:r>
-      <w:proofErr w:type="spellStart"/>
-      <w:r>
-        <w:rPr>
-          <w:rFonts w:ascii="Consolas" w:hAnsi="Consolas"/>
-          <w:sz w:val="28"/>
-          <w:szCs w:val="28"/>
-        </w:rPr>
-        <w:t>Img</w:t>
-      </w:r>
-      <w:proofErr w:type="spellEnd"/>
-      <w:r>
-        <w:rPr>
-          <w:rFonts w:ascii="Consolas" w:hAnsi="Consolas"/>
-          <w:sz w:val="28"/>
-          <w:szCs w:val="28"/>
-        </w:rPr>
-        <w:t xml:space="preserve"> here </w:t>
+        <w:t xml:space="preserve"> Img here </w:t>
       </w:r>
     </w:p>
     <w:p>
@@ -12103,25 +11376,7 @@
           <w:sz w:val="28"/>
           <w:szCs w:val="28"/>
         </w:rPr>
-        <w:t xml:space="preserve"> as </w:t>
-      </w:r>
-      <w:proofErr w:type="spellStart"/>
-      <w:r>
-        <w:rPr>
-          <w:rFonts w:ascii="Consolas" w:hAnsi="Consolas"/>
-          <w:sz w:val="28"/>
-          <w:szCs w:val="28"/>
-        </w:rPr>
-        <w:t>i</w:t>
-      </w:r>
-      <w:proofErr w:type="spellEnd"/>
-      <w:r>
-        <w:rPr>
-          <w:rFonts w:ascii="Consolas" w:hAnsi="Consolas"/>
-          <w:sz w:val="28"/>
-          <w:szCs w:val="28"/>
-        </w:rPr>
-        <w:t>/p to outer</w:t>
+        <w:t xml:space="preserve"> as i/p to outer</w:t>
       </w:r>
       <w:r>
         <w:rPr>
@@ -12262,6 +11517,7 @@
           <w:bCs/>
           <w:sz w:val="28"/>
           <w:szCs w:val="28"/>
+          <w:u w:val="single"/>
         </w:rPr>
         <w:t>CASE 1:</w:t>
       </w:r>
@@ -12283,16 +11539,14 @@
         </w:rPr>
         <w:t xml:space="preserve">Whenever we have unknown present in the </w:t>
       </w:r>
-      <w:proofErr w:type="gramStart"/>
       <w:r>
         <w:rPr>
           <w:rFonts w:ascii="Consolas" w:hAnsi="Consolas"/>
           <w:sz w:val="28"/>
           <w:szCs w:val="28"/>
         </w:rPr>
-        <w:t>question</w:t>
-      </w:r>
-      <w:proofErr w:type="gramEnd"/>
+        <w:t>question,</w:t>
+      </w:r>
       <w:r>
         <w:rPr>
           <w:rFonts w:ascii="Consolas" w:hAnsi="Consolas"/>
@@ -12301,6 +11555,121 @@
         </w:rPr>
         <w:t xml:space="preserve"> we use sub query to find the unknown.</w:t>
       </w:r>
+    </w:p>
+    <w:p>
+      <w:pPr>
+        <w:spacing w:line="240" w:lineRule="auto"/>
+        <w:ind w:left="360"/>
+        <w:rPr>
+          <w:rFonts w:ascii="Consolas" w:hAnsi="Consolas"/>
+          <w:sz w:val="28"/>
+          <w:szCs w:val="28"/>
+        </w:rPr>
+      </w:pPr>
+    </w:p>
+    <w:p>
+      <w:pPr>
+        <w:spacing w:line="240" w:lineRule="auto"/>
+        <w:ind w:left="360"/>
+        <w:rPr>
+          <w:rFonts w:ascii="Consolas" w:hAnsi="Consolas"/>
+          <w:sz w:val="28"/>
+          <w:szCs w:val="28"/>
+        </w:rPr>
+      </w:pPr>
+      <w:r>
+        <w:rPr>
+          <w:rFonts w:ascii="Consolas" w:hAnsi="Consolas"/>
+          <w:b/>
+          <w:bCs/>
+          <w:sz w:val="28"/>
+          <w:szCs w:val="28"/>
+          <w:u w:val="single"/>
+        </w:rPr>
+        <w:t>CASE 2:</w:t>
+      </w:r>
+      <w:r>
+        <w:rPr>
+          <w:rFonts w:ascii="Consolas" w:hAnsi="Consolas"/>
+          <w:sz w:val="28"/>
+          <w:szCs w:val="28"/>
+        </w:rPr>
+        <w:t xml:space="preserve"> Whenever the data to be selected and the condition to be executed are present in different tables we use sub queries.</w:t>
+      </w:r>
+    </w:p>
+    <w:p>
+      <w:pPr>
+        <w:spacing w:line="240" w:lineRule="auto"/>
+        <w:ind w:left="360"/>
+        <w:jc w:val="center"/>
+        <w:rPr>
+          <w:rFonts w:ascii="Consolas" w:hAnsi="Consolas"/>
+          <w:b/>
+          <w:bCs/>
+          <w:sz w:val="28"/>
+          <w:szCs w:val="28"/>
+          <w:u w:val="single"/>
+        </w:rPr>
+      </w:pPr>
+    </w:p>
+    <w:p>
+      <w:pPr>
+        <w:spacing w:line="240" w:lineRule="auto"/>
+        <w:ind w:left="360"/>
+        <w:jc w:val="center"/>
+        <w:rPr>
+          <w:rFonts w:ascii="Consolas" w:hAnsi="Consolas"/>
+          <w:b/>
+          <w:bCs/>
+          <w:sz w:val="28"/>
+          <w:szCs w:val="28"/>
+          <w:u w:val="single"/>
+        </w:rPr>
+      </w:pPr>
+      <w:r>
+        <w:rPr>
+          <w:rFonts w:ascii="Consolas" w:hAnsi="Consolas"/>
+          <w:b/>
+          <w:bCs/>
+          <w:sz w:val="28"/>
+          <w:szCs w:val="28"/>
+          <w:u w:val="single"/>
+        </w:rPr>
+        <w:t>9</w:t>
+      </w:r>
+      <w:r>
+        <w:rPr>
+          <w:rFonts w:ascii="Consolas" w:hAnsi="Consolas"/>
+          <w:b/>
+          <w:bCs/>
+          <w:sz w:val="28"/>
+          <w:szCs w:val="28"/>
+          <w:u w:val="single"/>
+          <w:vertAlign w:val="superscript"/>
+        </w:rPr>
+        <w:t>th</w:t>
+      </w:r>
+      <w:r>
+        <w:rPr>
+          <w:rFonts w:ascii="Consolas" w:hAnsi="Consolas"/>
+          <w:b/>
+          <w:bCs/>
+          <w:sz w:val="28"/>
+          <w:szCs w:val="28"/>
+          <w:u w:val="single"/>
+        </w:rPr>
+        <w:t xml:space="preserve"> September Notes</w:t>
+      </w:r>
+    </w:p>
+    <w:p>
+      <w:pPr>
+        <w:spacing w:line="240" w:lineRule="auto"/>
+        <w:ind w:left="360"/>
+        <w:rPr>
+          <w:sz w:val="28"/>
+          <w:szCs w:val="28"/>
+        </w:rPr>
+      </w:pPr>
     </w:p>
     <w:sectPr>
       <w:footerReference w:type="default" r:id="rId8"/>

</xml_diff>